<commit_message>
docs(manuals): describe the follow-up job, the to-close endpoints and the 707 tests in the English technical manual (4.6)
</commit_message>
<xml_diff>
--- a/09_MANUALES/EN/WORD/09_Technical_Manual.docx
+++ b/09_MANUALES/EN/WORD/09_Technical_Manual.docx
@@ -64,7 +64,7 @@
         <w:pStyle w:val="BodyText"/>
       </w:pPr>
       <w:r>
-        <w:t xml:space="preserve">October 20, 2026</w:t>
+        <w:t xml:space="preserve">October 21, 2026</w:t>
       </w:r>
     </w:p>
     <w:p>
@@ -72,7 +72,7 @@
         <w:pStyle w:val="BodyText"/>
       </w:pPr>
       <w:r>
-        <w:t xml:space="preserve">Manual Type: Technical Manual (Developers and Software Architects) · Version 4.4</w:t>
+        <w:t xml:space="preserve">Manual Type: Technical Manual (Developers and Software Architects) · Version 4.6</w:t>
       </w:r>
     </w:p>
     <w:bookmarkStart w:id="20" w:name="version-control"/>
@@ -649,6 +649,179 @@
           </w:p>
         </w:tc>
       </w:tr>
+      <w:tr>
+        <w:tc>
+          <w:tcPr/>
+          <w:p>
+            <w:pPr>
+              <w:pStyle w:val="Compact"/>
+            </w:pPr>
+            <w:r>
+              <w:t xml:space="preserve">4.5</w:t>
+            </w:r>
+          </w:p>
+        </w:tc>
+        <w:tc>
+          <w:tcPr/>
+          <w:p>
+            <w:pPr>
+              <w:pStyle w:val="Compact"/>
+            </w:pPr>
+            <w:r>
+              <w:t xml:space="preserve">2026-10-21</w:t>
+            </w:r>
+          </w:p>
+        </w:tc>
+        <w:tc>
+          <w:tcPr/>
+          <w:p>
+            <w:pPr>
+              <w:pStyle w:val="Compact"/>
+            </w:pPr>
+            <w:r>
+              <w:t xml:space="preserve">Review against the code of October 21, 2026: the token of a closed session stops working (security-service and gateway, sections 9.2, 13.2, and 14.1), automatic close of expired bookings (12.3 and Figure 3), operator assignment lock and single count of bookings without an operator (12.4), receipt of at most 2 MB and cash only with its account active (12.5), web and app changes (10.4, 10.5, and 12.7), tests of October 21 (689 automated and 19 end-to-end), and troubleshooting. The gateway routes missing from Table 5 and the changelog numbering (039 and seeds up to 112) were also corrected.</w:t>
+            </w:r>
+          </w:p>
+        </w:tc>
+        <w:tc>
+          <w:tcPr/>
+          <w:p>
+            <w:pPr>
+              <w:pStyle w:val="Compact"/>
+            </w:pPr>
+            <w:r>
+              <w:t xml:space="preserve">Development team</w:t>
+            </w:r>
+          </w:p>
+        </w:tc>
+      </w:tr>
+      <w:tr>
+        <w:tc>
+          <w:tcPr/>
+          <w:p>
+            <w:pPr>
+              <w:pStyle w:val="Compact"/>
+            </w:pPr>
+            <w:r>
+              <w:t xml:space="preserve">4.6</w:t>
+            </w:r>
+          </w:p>
+        </w:tc>
+        <w:tc>
+          <w:tcPr/>
+          <w:p>
+            <w:pPr>
+              <w:pStyle w:val="Compact"/>
+            </w:pPr>
+            <w:r>
+              <w:t xml:space="preserve">2026-10-21</w:t>
+            </w:r>
+          </w:p>
+        </w:tc>
+        <w:tc>
+          <w:tcPr/>
+          <w:p>
+            <w:pPr>
+              <w:pStyle w:val="Compact"/>
+            </w:pPr>
+            <w:r>
+              <w:t xml:space="preserve">Change of the rule for bookings that end without being closed, reviewed by the team on the night of October 21:</w:t>
+            </w:r>
+            <w:r>
+              <w:t xml:space="preserve"> </w:t>
+            </w:r>
+            <w:r>
+              <w:rPr>
+                <w:i/>
+                <w:iCs/>
+              </w:rPr>
+              <w:t xml:space="preserve">ExpiredBookingsJob</w:t>
+            </w:r>
+            <w:r>
+              <w:t xml:space="preserve"> </w:t>
+            </w:r>
+            <w:r>
+              <w:t xml:space="preserve">only cancels the scheduled ones; operations-service (</w:t>
+            </w:r>
+            <w:r>
+              <w:rPr>
+                <w:i/>
+                <w:iCs/>
+              </w:rPr>
+              <w:t xml:space="preserve">FollowUpJob</w:t>
+            </w:r>
+            <w:r>
+              <w:t xml:space="preserve">,</w:t>
+            </w:r>
+            <w:r>
+              <w:t xml:space="preserve"> </w:t>
+            </w:r>
+            <w:r>
+              <w:rPr>
+                <w:i/>
+                <w:iCs/>
+              </w:rPr>
+              <w:t xml:space="preserve">FollowUpPolicy</w:t>
+            </w:r>
+            <w:r>
+              <w:t xml:space="preserve">, and</w:t>
+            </w:r>
+            <w:r>
+              <w:t xml:space="preserve"> </w:t>
+            </w:r>
+            <w:r>
+              <w:rPr>
+                <w:i/>
+                <w:iCs/>
+              </w:rPr>
+              <w:t xml:space="preserve">FollowUpService</w:t>
+            </w:r>
+            <w:r>
+              <w:t xml:space="preserve">) moves to NO_SHOW only a confirmed booking without an operator, through the internal route</w:t>
+            </w:r>
+            <w:r>
+              <w:t xml:space="preserve"> </w:t>
+            </w:r>
+            <w:r>
+              <w:rPr>
+                <w:i/>
+                <w:iCs/>
+              </w:rPr>
+              <w:t xml:space="preserve">/internal/v1/bookings/{id}/no-show</w:t>
+            </w:r>
+            <w:r>
+              <w:t xml:space="preserve">, and leaves the others in the administrator's "To close" list (12.3, 12.4, 12.8, and Figure 3); new endpoints, ServiceNotStarted and ServiceNotFinished events, notification types, and changelogs 040 and 041 (11.5, 12.6, 13.3, and 13.4); single count of bookings without an operator in the mobile app too and other app changes (12.7); tests of the night of October 21 (707 automated and 19 end-to-end, 16.5);</w:t>
+            </w:r>
+            <w:r>
+              <w:t xml:space="preserve"> </w:t>
+            </w:r>
+            <w:r>
+              <w:rPr>
+                <w:i/>
+                <w:iCs/>
+              </w:rPr>
+              <w:t xml:space="preserve">FOLLOW_UP_*</w:t>
+            </w:r>
+            <w:r>
+              <w:t xml:space="preserve"> </w:t>
+            </w:r>
+            <w:r>
+              <w:t xml:space="preserve">variables (16.2); troubleshooting and discrepancies (Tables 26 and 29).</w:t>
+            </w:r>
+          </w:p>
+        </w:tc>
+        <w:tc>
+          <w:tcPr/>
+          <w:p>
+            <w:pPr>
+              <w:pStyle w:val="Compact"/>
+            </w:pPr>
+            <w:r>
+              <w:t xml:space="preserve">Development team</w:t>
+            </w:r>
+          </w:p>
+        </w:tc>
+      </w:tr>
     </w:tbl>
     <w:p>
       <w:pPr>
@@ -2036,7 +2209,7 @@
         <w:t xml:space="preserve"> </w:t>
       </w:r>
       <w:r>
-        <w:t xml:space="preserve">branch, October 16, 2026): the figures for tables, changelogs, and tests come from queries to the database and from running the tests, not from previous documents. Annex B lists the discrepancies found between the code, the documentation, and the previous versions of the manuals, as the guide for writing manuals requires (Servicio Nacional de Aprendizaje [SENA], 2026). Identifiers (schemas, tables, columns, endpoints, events, and classes) are written exactly as in the code.</w:t>
+        <w:t xml:space="preserve">branch, October 16, 2026): the figures for tables, changelogs, and tests come from queries to the database and from running the tests, not from previous documents. Version 4.5 was reviewed against the code of October 21, 2026. Annex B lists the discrepancies found between the code, the documentation, and the previous versions of the manuals, as the guide for writing manuals requires (Servicio Nacional de Aprendizaje [SENA], 2026). Identifiers (schemas, tables, columns, endpoints, events, and classes) are written exactly as in the code.</w:t>
       </w:r>
     </w:p>
     <w:bookmarkEnd w:id="22"/>
@@ -2688,7 +2861,7 @@
               <w:t xml:space="preserve"> </w:t>
             </w:r>
             <w:r>
-              <w:t xml:space="preserve">by path; CORS.</w:t>
+              <w:t xml:space="preserve">by path; CORS; cuts the tokens of closed sessions (since October 21, 2026).</w:t>
             </w:r>
           </w:p>
         </w:tc>
@@ -4664,10 +4837,126 @@
           <w:b/>
           <w:bCs/>
         </w:rPr>
-        <w:t xml:space="preserve">It does not validate tokens</w:t>
-      </w:r>
-      <w:r>
-        <w:t xml:space="preserve">: each service verifies the JWT itself (ADR-006). It has no database, cache, or request rate limit. Table 5 shows the routes.</w:t>
+        <w:t xml:space="preserve">It does not check the token signature</w:t>
+      </w:r>
+      <w:r>
+        <w:t xml:space="preserve">: each service verifies the JWT itself (ADR-006). Since October 21, 2026 it does confirm that the session of the token is still open:</w:t>
+      </w:r>
+      <w:r>
+        <w:t xml:space="preserve"> </w:t>
+      </w:r>
+      <w:r>
+        <w:rPr>
+          <w:i/>
+          <w:iCs/>
+        </w:rPr>
+        <w:t xml:space="preserve">SessionCheckFilter</w:t>
+      </w:r>
+      <w:r>
+        <w:t xml:space="preserve">, which runs right after CORS, asks security-service with</w:t>
+      </w:r>
+      <w:r>
+        <w:t xml:space="preserve"> </w:t>
+      </w:r>
+      <w:r>
+        <w:rPr>
+          <w:i/>
+          <w:iCs/>
+        </w:rPr>
+        <w:t xml:space="preserve">GET /api/v1/auth/session</w:t>
+      </w:r>
+      <w:r>
+        <w:t xml:space="preserve"> </w:t>
+      </w:r>
+      <w:r>
+        <w:t xml:space="preserve">and the same</w:t>
+      </w:r>
+      <w:r>
+        <w:t xml:space="preserve"> </w:t>
+      </w:r>
+      <w:r>
+        <w:rPr>
+          <w:i/>
+          <w:iCs/>
+        </w:rPr>
+        <w:t xml:space="preserve">Authorization</w:t>
+      </w:r>
+      <w:r>
+        <w:t xml:space="preserve"> </w:t>
+      </w:r>
+      <w:r>
+        <w:t xml:space="preserve">header; if the answer is 401, it returns that 401 without passing the request on. It keeps each answer for 30 seconds per SHA-256 fingerprint of the token (never the token itself), forgets the answer of a token when it goes through</w:t>
+      </w:r>
+      <w:r>
+        <w:t xml:space="preserve"> </w:t>
+      </w:r>
+      <w:r>
+        <w:rPr>
+          <w:i/>
+          <w:iCs/>
+        </w:rPr>
+        <w:t xml:space="preserve">POST /api/v1/auth/logout</w:t>
+      </w:r>
+      <w:r>
+        <w:t xml:space="preserve"> </w:t>
+      </w:r>
+      <w:r>
+        <w:t xml:space="preserve">and, if security-service does not answer within 3 seconds or answers 5xx, lets the request through so that a security-service outage does not bring down the rest of the API. It does not check public routes, the</w:t>
+      </w:r>
+      <w:r>
+        <w:t xml:space="preserve"> </w:t>
+      </w:r>
+      <w:r>
+        <w:rPr>
+          <w:i/>
+          <w:iCs/>
+        </w:rPr>
+        <w:t xml:space="preserve">/api/v1/auth/</w:t>
+      </w:r>
+      <w:r>
+        <w:t xml:space="preserve"> </w:t>
+      </w:r>
+      <w:r>
+        <w:t xml:space="preserve">routes (except logout), or requests without a token. It is configured with</w:t>
+      </w:r>
+      <w:r>
+        <w:t xml:space="preserve"> </w:t>
+      </w:r>
+      <w:r>
+        <w:rPr>
+          <w:i/>
+          <w:iCs/>
+        </w:rPr>
+        <w:t xml:space="preserve">SESSION_CHECK_ENABLED</w:t>
+      </w:r>
+      <w:r>
+        <w:t xml:space="preserve">,</w:t>
+      </w:r>
+      <w:r>
+        <w:t xml:space="preserve"> </w:t>
+      </w:r>
+      <w:r>
+        <w:rPr>
+          <w:i/>
+          <w:iCs/>
+        </w:rPr>
+        <w:t xml:space="preserve">SESSION_CHECK_CACHE_TTL</w:t>
+      </w:r>
+      <w:r>
+        <w:t xml:space="preserve">, and</w:t>
+      </w:r>
+      <w:r>
+        <w:t xml:space="preserve"> </w:t>
+      </w:r>
+      <w:r>
+        <w:rPr>
+          <w:i/>
+          <w:iCs/>
+        </w:rPr>
+        <w:t xml:space="preserve">SESSION_CHECK_TIMEOUT</w:t>
+      </w:r>
+      <w:r>
+        <w:t xml:space="preserve">. It has no database or request rate limit. Table 5 shows the routes.</w:t>
       </w:r>
     </w:p>
     <w:p>
@@ -4841,7 +5130,7 @@
                 <w:i/>
                 <w:iCs/>
               </w:rPr>
-              <w:t xml:space="preserve">, /api/v1/operator/bookings/*</w:t>
+              <w:t xml:space="preserve">, /api/v1/admin/establishment, /api/v1/operator/bookings/*</w:t>
             </w:r>
           </w:p>
         </w:tc>
@@ -4872,17 +5161,30 @@
                 <w:i/>
                 <w:iCs/>
               </w:rPr>
-              <w:t xml:space="preserve">, /api/v1/admin/assignments/*</w:t>
-            </w:r>
-            <w:r>
-              <w:t xml:space="preserve">, /api/v1/operator/services/*</w:t>
+              <w:t xml:space="preserve">, /api/v1/operators/*</w:t>
+            </w:r>
+            <w:r>
+              <w:t xml:space="preserve">, /api/v1/admin/inspections/*</w:t>
             </w:r>
             <w:r>
               <w:rPr>
                 <w:i/>
                 <w:iCs/>
               </w:rPr>
-              <w:t xml:space="preserve">, /api/v1/operator/ratings, /api/v1/ratings/*</w:t>
+              <w:t xml:space="preserve">, /api/v1/public/inspections/*</w:t>
+            </w:r>
+            <w:r>
+              <w:t xml:space="preserve">, /api/v1/admin/assignments/*</w:t>
+            </w:r>
+            <w:r>
+              <w:rPr>
+                <w:i/>
+                <w:iCs/>
+              </w:rPr>
+              <w:t xml:space="preserve">, /api/v1/operator/services/*</w:t>
+            </w:r>
+            <w:r>
+              <w:t xml:space="preserve">, /api/v1/operator/ratings, /api/v1/ratings/**</w:t>
             </w:r>
           </w:p>
         </w:tc>
@@ -6818,18 +7120,28 @@
               <w:pStyle w:val="Compact"/>
             </w:pPr>
             <w:r>
-              <w:t xml:space="preserve">booking-service /admin/bookings, /operator/bookings, PATCH /operator/bookings/{id}/status, /bookings/me; /internal/v1/bookings and /internal/v1/bookings/{id} (internal key)</w:t>
-            </w:r>
-          </w:p>
-        </w:tc>
-        <w:tc>
-          <w:tcPr/>
-          <w:p>
-            <w:pPr>
-              <w:pStyle w:val="Compact"/>
-            </w:pPr>
-            <w:r>
-              <w:t xml:space="preserve">Bookings to assign, with their bay; move them to IN_PROGRESS or COMPLETED; validate the booking being rated; read the booking when BookingConfirmed arrives for the automatic assignment, without a user token (ADR-014).</w:t>
+              <w:t xml:space="preserve">booking-service /admin/bookings, /operator/bookings, PATCH /operator/bookings/{id}/status, /bookings/me; /internal/v1/bookings, /internal/v1/bookings/{id}, and POST /internal/v1/bookings/{id}/no-show (internal key)</w:t>
+            </w:r>
+          </w:p>
+        </w:tc>
+        <w:tc>
+          <w:tcPr/>
+          <w:p>
+            <w:pPr>
+              <w:pStyle w:val="Compact"/>
+            </w:pPr>
+            <w:r>
+              <w:t xml:space="preserve">Bookings to assign, with their bay; move them to IN_PROGRESS or COMPLETED; validate the booking being rated; read the booking when BookingConfirmed arrives for the automatic assignment, without a user token (ADR-014); close as NO_SHOW a confirmed booking that ended without an operator (</w:t>
+            </w:r>
+            <w:r>
+              <w:rPr>
+                <w:i/>
+                <w:iCs/>
+              </w:rPr>
+              <w:t xml:space="preserve">FollowUpJob</w:t>
+            </w:r>
+            <w:r>
+              <w:t xml:space="preserve">).</w:t>
             </w:r>
           </w:p>
         </w:tc>
@@ -6970,6 +7282,41 @@
             </w:pPr>
             <w:r>
               <w:t xml:space="preserve">Active administrators who receive the staff notices (ADR-011 section 10).</w:t>
+            </w:r>
+          </w:p>
+        </w:tc>
+      </w:tr>
+      <w:tr>
+        <w:tc>
+          <w:tcPr/>
+          <w:p>
+            <w:pPr>
+              <w:pStyle w:val="Compact"/>
+            </w:pPr>
+            <w:r>
+              <w:t xml:space="preserve">api-gateway</w:t>
+            </w:r>
+          </w:p>
+        </w:tc>
+        <w:tc>
+          <w:tcPr/>
+          <w:p>
+            <w:pPr>
+              <w:pStyle w:val="Compact"/>
+            </w:pPr>
+            <w:r>
+              <w:t xml:space="preserve">security-service GET /api/v1/auth/session (the same token)</w:t>
+            </w:r>
+          </w:p>
+        </w:tc>
+        <w:tc>
+          <w:tcPr/>
+          <w:p>
+            <w:pPr>
+              <w:pStyle w:val="Compact"/>
+            </w:pPr>
+            <w:r>
+              <w:t xml:space="preserve">Confirm that the session of the token is still open before passing the request on (since October 21, 2026; section 9.2).</w:t>
             </w:r>
           </w:p>
         </w:tc>
@@ -7326,7 +7673,62 @@
         <w:t xml:space="preserve"> </w:t>
       </w:r>
       <w:r>
-        <w:t xml:space="preserve">prevents overlapping absences. Each use case opens a local transaction that only writes the schemas of its own service; there are no distributed transactions.</w:t>
+        <w:t xml:space="preserve">prevents overlapping absences. Where two operations at the same time could clash, the Java services take a SQL Server application lock (</w:t>
+      </w:r>
+      <w:r>
+        <w:rPr>
+          <w:i/>
+          <w:iCs/>
+        </w:rPr>
+        <w:t xml:space="preserve">sp_getapplock</w:t>
+      </w:r>
+      <w:r>
+        <w:t xml:space="preserve">, owner</w:t>
+      </w:r>
+      <w:r>
+        <w:t xml:space="preserve"> </w:t>
+      </w:r>
+      <w:r>
+        <w:rPr>
+          <w:i/>
+          <w:iCs/>
+        </w:rPr>
+        <w:t xml:space="preserve">Transaction</w:t>
+      </w:r>
+      <w:r>
+        <w:t xml:space="preserve">) that is released when the transaction ends: booking-service uses</w:t>
+      </w:r>
+      <w:r>
+        <w:t xml:space="preserve"> </w:t>
+      </w:r>
+      <w:r>
+        <w:rPr>
+          <w:i/>
+          <w:iCs/>
+        </w:rPr>
+        <w:t xml:space="preserve">booking-schedule</w:t>
+      </w:r>
+      <w:r>
+        <w:t xml:space="preserve"> </w:t>
+      </w:r>
+      <w:r>
+        <w:t xml:space="preserve">when it creates or reschedules a booking and when it closes the expired ones, and operations-service uses</w:t>
+      </w:r>
+      <w:r>
+        <w:t xml:space="preserve"> </w:t>
+      </w:r>
+      <w:r>
+        <w:rPr>
+          <w:i/>
+          <w:iCs/>
+        </w:rPr>
+        <w:t xml:space="preserve">operations-assignment</w:t>
+      </w:r>
+      <w:r>
+        <w:t xml:space="preserve"> </w:t>
+      </w:r>
+      <w:r>
+        <w:t xml:space="preserve">in manual and automatic assignment (since October 21, 2026), waiting at most 10 seconds. Each use case opens a local transaction that only writes the schemas of its own service; there are no distributed transactions.</w:t>
       </w:r>
     </w:p>
     <w:bookmarkEnd w:id="45"/>
@@ -7583,7 +7985,7 @@
               <w:pStyle w:val="Compact"/>
             </w:pPr>
             <w:r>
-              <w:t xml:space="preserve">VALIDATION_ERROR, INVALID_PLATE, UNKNOWN_PERMISSION, NOTIFICATION_TYPE_NOT_ALLOWED</w:t>
+              <w:t xml:space="preserve">VALIDATION_ERROR, INVALID_PLATE, UNKNOWN_PERMISSION, NOTIFICATION_TYPE_NOT_ALLOWED, RECEIPT_TOO_LARGE</w:t>
             </w:r>
           </w:p>
         </w:tc>
@@ -7607,7 +8009,7 @@
               <w:pStyle w:val="Compact"/>
             </w:pPr>
             <w:r>
-              <w:t xml:space="preserve">Authentication absent, invalid, or expired.</w:t>
+              <w:t xml:space="preserve">Authentication absent, invalid, or expired, or session closed.</w:t>
             </w:r>
           </w:p>
         </w:tc>
@@ -8703,7 +9105,7 @@
         <w:rPr>
           <w:rStyle w:val="VerbatimChar"/>
         </w:rPr>
-        <w:t xml:space="preserve">|   |   |-- models/, utils/ (api-error.ts translates the error codes)</w:t>
+        <w:t xml:space="preserve">|   |   |-- models/, utils/ (api-error.ts translates the error codes; image-compress.ts keeps the receipt at 2 MB at most)</w:t>
       </w:r>
       <w:r>
         <w:br/>
@@ -8712,7 +9114,7 @@
         <w:rPr>
           <w:rStyle w:val="VerbatimChar"/>
         </w:rPr>
-        <w:t xml:space="preserve">|   |   `-- services/   auth, booking-api, operations-api, payments-api, promotions-api,</w:t>
+        <w:t xml:space="preserve">|   |   `-- services/   auth (session in step across tabs), booking-api, operations-api,</w:t>
       </w:r>
       <w:r>
         <w:br/>
@@ -8721,7 +9123,7 @@
         <w:rPr>
           <w:rStyle w:val="VerbatimChar"/>
         </w:rPr>
-        <w:t xml:space="preserve">|   |                   loyalty-api, role-permissions-api, notifications, vehicles,</w:t>
+        <w:t xml:space="preserve">|   |                   payments-api, promotions-api, loyalty-api, role-permissions-api,</w:t>
       </w:r>
       <w:r>
         <w:br/>
@@ -8730,7 +9132,16 @@
         <w:rPr>
           <w:rStyle w:val="VerbatimChar"/>
         </w:rPr>
-        <w:t xml:space="preserve">|   |                   user-admin, preferences, inspection-store, photo-storage...</w:t>
+        <w:t xml:space="preserve">|   |                   notifications, vehicles, user-admin, preferences, inspection-api,</w:t>
+      </w:r>
+      <w:r>
+        <w:br/>
+      </w:r>
+      <w:r>
+        <w:rPr>
+          <w:rStyle w:val="VerbatimChar"/>
+        </w:rPr>
+        <w:t xml:space="preserve">|   |                   inspection-photos...</w:t>
       </w:r>
       <w:r>
         <w:br/>
@@ -9164,6 +9575,101 @@
       </w:r>
       <w:r>
         <w:t xml:space="preserve">, in the four languages.</w:t>
+      </w:r>
+    </w:p>
+    <w:p>
+      <w:pPr>
+        <w:pStyle w:val="BodyText"/>
+      </w:pPr>
+      <w:r>
+        <w:t xml:space="preserve">Since October 21, 2026,</w:t>
+      </w:r>
+      <w:r>
+        <w:t xml:space="preserve"> </w:t>
+      </w:r>
+      <w:r>
+        <w:rPr>
+          <w:i/>
+          <w:iCs/>
+        </w:rPr>
+        <w:t xml:space="preserve">core/services/payments/receiptImage.ts</w:t>
+      </w:r>
+      <w:r>
+        <w:t xml:space="preserve"> </w:t>
+      </w:r>
+      <w:r>
+        <w:t xml:space="preserve">compresses the payment receipt to at most 2 MB before uploading it,</w:t>
+      </w:r>
+      <w:r>
+        <w:t xml:space="preserve"> </w:t>
+      </w:r>
+      <w:r>
+        <w:rPr>
+          <w:i/>
+          <w:iCs/>
+        </w:rPr>
+        <w:t xml:space="preserve">shared/components/feedback/ImageZoomModal.tsx</w:t>
+      </w:r>
+      <w:r>
+        <w:t xml:space="preserve"> </w:t>
+      </w:r>
+      <w:r>
+        <w:t xml:space="preserve">enlarges the QR of the payment account, and</w:t>
+      </w:r>
+      <w:r>
+        <w:t xml:space="preserve"> </w:t>
+      </w:r>
+      <w:r>
+        <w:rPr>
+          <w:i/>
+          <w:iCs/>
+        </w:rPr>
+        <w:t xml:space="preserve">app/providers/AppUpdatesCheck.tsx</w:t>
+      </w:r>
+      <w:r>
+        <w:t xml:space="preserve"> </w:t>
+      </w:r>
+      <w:r>
+        <w:t xml:space="preserve">reads</w:t>
+      </w:r>
+      <w:r>
+        <w:t xml:space="preserve"> </w:t>
+      </w:r>
+      <w:r>
+        <w:rPr>
+          <w:i/>
+          <w:iCs/>
+        </w:rPr>
+        <w:t xml:space="preserve">/app/version.json</w:t>
+      </w:r>
+      <w:r>
+        <w:t xml:space="preserve"> </w:t>
+      </w:r>
+      <w:r>
+        <w:t xml:space="preserve">when the installed APK opens: if there is a higher</w:t>
+      </w:r>
+      <w:r>
+        <w:t xml:space="preserve"> </w:t>
+      </w:r>
+      <w:r>
+        <w:rPr>
+          <w:i/>
+          <w:iCs/>
+        </w:rPr>
+        <w:t xml:space="preserve">versionCode</w:t>
+      </w:r>
+      <w:r>
+        <w:t xml:space="preserve">, it shows a screen on top of everything that cannot be closed and only lets the user download the new APK; if the server does not answer, the app goes on (</w:t>
+      </w:r>
+      <w:r>
+        <w:rPr>
+          <w:i/>
+          <w:iCs/>
+        </w:rPr>
+        <w:t xml:space="preserve">core/services/appUpdates/publishedApk.ts</w:t>
+      </w:r>
+      <w:r>
+        <w:t xml:space="preserve">).</w:t>
       </w:r>
     </w:p>
     <w:bookmarkEnd w:id="55"/>
@@ -15381,6 +15887,60 @@
               <w:pStyle w:val="Compact"/>
             </w:pPr>
             <w:r>
+              <w:t xml:space="preserve">follow_up_notice_at</w:t>
+            </w:r>
+          </w:p>
+        </w:tc>
+        <w:tc>
+          <w:tcPr/>
+          <w:p>
+            <w:pPr>
+              <w:pStyle w:val="Compact"/>
+            </w:pPr>
+            <w:r>
+              <w:t xml:space="preserve">DATETIME2(3)</w:t>
+            </w:r>
+          </w:p>
+        </w:tc>
+        <w:tc>
+          <w:tcPr/>
+          <w:p>
+            <w:pPr>
+              <w:pStyle w:val="Compact"/>
+            </w:pPr>
+            <w:r>
+              <w:t xml:space="preserve">Yes</w:t>
+            </w:r>
+          </w:p>
+        </w:tc>
+        <w:tc>
+          <w:tcPr/>
+          <w:p>
+            <w:pPr>
+              <w:pStyle w:val="Compact"/>
+            </w:pPr>
+            <w:r>
+              <w:t xml:space="preserve">When the notice that the service ended without being recorded was sent; cleared when it is started (changelog 040)</w:t>
+            </w:r>
+          </w:p>
+        </w:tc>
+      </w:tr>
+      <w:tr>
+        <w:tc>
+          <w:tcPr/>
+          <w:p>
+            <w:pPr>
+              <w:pStyle w:val="Compact"/>
+            </w:pPr>
+          </w:p>
+        </w:tc>
+        <w:tc>
+          <w:tcPr/>
+          <w:p>
+            <w:pPr>
+              <w:pStyle w:val="Compact"/>
+            </w:pPr>
+            <w:r>
               <w:t xml:space="preserve">quality_rating, quality_comment, rated_at</w:t>
             </w:r>
           </w:p>
@@ -15831,7 +16391,7 @@
         <w:t xml:space="preserve"> </w:t>
       </w:r>
       <w:r>
-        <w:t xml:space="preserve">Source: changelogs 007, 033, and 037 and seed 105 of operations-service.</w:t>
+        <w:t xml:space="preserve">Source: changelogs 007, 033, 037, and 040 and seed 105 of operations-service.</w:t>
       </w:r>
     </w:p>
     <w:p>
@@ -17317,7 +17877,7 @@
               <w:pStyle w:val="Compact"/>
             </w:pPr>
             <w:r>
-              <w:t xml:space="preserve">24 types (customer, staff, payment, loyalty, inspection, unassigned booking, new app version, and system types)</w:t>
+              <w:t xml:space="preserve">26 types (customer, staff, payment, loyalty, inspection, unassigned booking, new app version, service not recorded from changelog 041, and system types)</w:t>
             </w:r>
           </w:p>
         </w:tc>
@@ -17849,6 +18409,50 @@
               <w:pStyle w:val="Compact"/>
             </w:pPr>
             <w:r>
+              <w:t xml:space="preserve">A manual and an automatic assignment at the same time do not give the same operator two services at the same time.</w:t>
+            </w:r>
+          </w:p>
+        </w:tc>
+        <w:tc>
+          <w:tcPr/>
+          <w:p>
+            <w:pPr>
+              <w:pStyle w:val="Compact"/>
+            </w:pPr>
+            <w:r>
+              <w:rPr>
+                <w:i/>
+                <w:iCs/>
+              </w:rPr>
+              <w:t xml:space="preserve">operations-assignment</w:t>
+            </w:r>
+            <w:r>
+              <w:t xml:space="preserve"> </w:t>
+            </w:r>
+            <w:r>
+              <w:t xml:space="preserve">lock (</w:t>
+            </w:r>
+            <w:r>
+              <w:rPr>
+                <w:i/>
+                <w:iCs/>
+              </w:rPr>
+              <w:t xml:space="preserve">sp_getapplock</w:t>
+            </w:r>
+            <w:r>
+              <w:t xml:space="preserve">) in operations-service.</w:t>
+            </w:r>
+          </w:p>
+        </w:tc>
+      </w:tr>
+      <w:tr>
+        <w:tc>
+          <w:tcPr/>
+          <w:p>
+            <w:pPr>
+              <w:pStyle w:val="Compact"/>
+            </w:pPr>
+            <w:r>
               <w:t xml:space="preserve">Only the assigned operator starts or finishes; only on the day of the booking; one service at a time.</w:t>
             </w:r>
           </w:p>
@@ -17933,6 +18537,40 @@
             </w:pPr>
             <w:r>
               <w:t xml:space="preserve">payment-service (409 TRANSACTION_REFERENCE_REUSED).</w:t>
+            </w:r>
+          </w:p>
+        </w:tc>
+      </w:tr>
+      <w:tr>
+        <w:tc>
+          <w:tcPr/>
+          <w:p>
+            <w:pPr>
+              <w:pStyle w:val="Compact"/>
+            </w:pPr>
+            <w:r>
+              <w:t xml:space="preserve">The customer receipt weighs 2 MB at most.</w:t>
+            </w:r>
+          </w:p>
+        </w:tc>
+        <w:tc>
+          <w:tcPr/>
+          <w:p>
+            <w:pPr>
+              <w:pStyle w:val="Compact"/>
+            </w:pPr>
+            <w:r>
+              <w:t xml:space="preserve">payment-service domain (</w:t>
+            </w:r>
+            <w:r>
+              <w:rPr>
+                <w:i/>
+                <w:iCs/>
+              </w:rPr>
+              <w:t xml:space="preserve">Payment.MaxReceiptBytes</w:t>
+            </w:r>
+            <w:r>
+              <w:t xml:space="preserve">, 400 RECEIPT_TOO_LARGE).</w:t>
             </w:r>
           </w:p>
         </w:tc>
@@ -18123,7 +18761,20 @@
         <w:t xml:space="preserve"> </w:t>
       </w:r>
       <w:r>
-        <w:t xml:space="preserve">converges with one created by the services. The numbering is shared (001 to 013 initial schemas, 014 onward later changes, 101 to 109 seeds), except in payment-service, which uses its own numbering 001 to 020 (TD-019). The global high-water mark is 030; the next shared changeset is 031. The list of changelogs of each service is in the Installation Manual, section 11.2.</w:t>
+        <w:t xml:space="preserve">converges with one created by the services. The numbering is shared (001 to 013 initial schemas, 014 onward later changes, 101 to 112 seeds), except in payment-service, which uses its own numbering 001 to 020 (TD-019). The global high-water mark is 041 (040 of operations-service and 041 of notification-service, from October 21, 2026); the next shared changeset is 042. The latest seed is booking-service 112 (</w:t>
+      </w:r>
+      <w:r>
+        <w:rPr>
+          <w:i/>
+          <w:iCs/>
+        </w:rPr>
+        <w:t xml:space="preserve">EXPIRED</w:t>
+      </w:r>
+      <w:r>
+        <w:t xml:space="preserve"> </w:t>
+      </w:r>
+      <w:r>
+        <w:t xml:space="preserve">cancellation reason, October 21, 2026). The list of changelogs of each service is in the Installation Manual, section 11.2.</w:t>
       </w:r>
     </w:p>
     <w:bookmarkEnd w:id="67"/>
@@ -18179,7 +18830,20 @@
         <w:t xml:space="preserve"> </w:t>
       </w:r>
       <w:r>
-        <w:t xml:space="preserve">AuthController, UserProfileController, UserAdministrationController, InternalUserController; AuthenticationService, AccountRegistrationService, PasswordRecoveryService, EmailChangeService, AccountDeactivationService, UserAdministrationService, UserPreferenceService; PasswordPolicy; JwtTokenIssuer; LoginLockout and LoginLockoutPersistenceAdapter; UserAddressController; EmailResetCodeNotifier; RabbitDomainEventPublisher; DevDataSeeder.</w:t>
+        <w:t xml:space="preserve">AuthController (includes</w:t>
+      </w:r>
+      <w:r>
+        <w:t xml:space="preserve"> </w:t>
+      </w:r>
+      <w:r>
+        <w:rPr>
+          <w:i/>
+          <w:iCs/>
+        </w:rPr>
+        <w:t xml:space="preserve">GET /api/v1/auth/session</w:t>
+      </w:r>
+      <w:r>
+        <w:t xml:space="preserve">), ActiveSessionValidator, UserProfileController, UserAdministrationController, InternalUserController; AuthenticationService, AccountRegistrationService, PasswordRecoveryService, EmailChangeService, AccountDeactivationService, UserAdministrationService, UserPreferenceService; PasswordPolicy; JwtTokenIssuer; LoginLockout and LoginLockoutPersistenceAdapter; UserAddressController; EmailResetCodeNotifier; RabbitDomainEventPublisher; DevDataSeeder.</w:t>
       </w:r>
     </w:p>
     <w:p>
@@ -18257,7 +18921,55 @@
         <w:t xml:space="preserve"> </w:t>
       </w:r>
       <w:r>
-        <w:t xml:space="preserve">arrive.</w:t>
+        <w:t xml:space="preserve">arrive; every token carries its session in the</w:t>
+      </w:r>
+      <w:r>
+        <w:t xml:space="preserve"> </w:t>
+      </w:r>
+      <w:r>
+        <w:rPr>
+          <w:i/>
+          <w:iCs/>
+        </w:rPr>
+        <w:t xml:space="preserve">sid</w:t>
+      </w:r>
+      <w:r>
+        <w:t xml:space="preserve"> </w:t>
+      </w:r>
+      <w:r>
+        <w:t xml:space="preserve">claim, and since October 21, 2026</w:t>
+      </w:r>
+      <w:r>
+        <w:t xml:space="preserve"> </w:t>
+      </w:r>
+      <w:r>
+        <w:rPr>
+          <w:i/>
+          <w:iCs/>
+        </w:rPr>
+        <w:t xml:space="preserve">ActiveSessionValidator</w:t>
+      </w:r>
+      <w:r>
+        <w:t xml:space="preserve"> </w:t>
+      </w:r>
+      <w:r>
+        <w:t xml:space="preserve">rejects the token of a closed session (logout, account disabled by the administrator or deactivated by its owner) on every security-service route;</w:t>
+      </w:r>
+      <w:r>
+        <w:t xml:space="preserve"> </w:t>
+      </w:r>
+      <w:r>
+        <w:rPr>
+          <w:i/>
+          <w:iCs/>
+        </w:rPr>
+        <w:t xml:space="preserve">GET /api/v1/auth/session</w:t>
+      </w:r>
+      <w:r>
+        <w:t xml:space="preserve"> </w:t>
+      </w:r>
+      <w:r>
+        <w:t xml:space="preserve">answers 204 if the session is still open and 401 if not, for the gateway.</w:t>
       </w:r>
     </w:p>
     <w:p>
@@ -18632,7 +19344,33 @@
         <w:t xml:space="preserve"> </w:t>
       </w:r>
       <w:r>
-        <w:t xml:space="preserve">routes serve operations-service with the internal key.</w:t>
+        <w:t xml:space="preserve">routes serve operations-service with the internal key; creating, rescheduling, closing expired bookings, and marking a booking without an operator as NO_SHOW take the schedule lock (</w:t>
+      </w:r>
+      <w:r>
+        <w:rPr>
+          <w:i/>
+          <w:iCs/>
+        </w:rPr>
+        <w:t xml:space="preserve">sp_getapplock</w:t>
+      </w:r>
+      <w:r>
+        <w:t xml:space="preserve"> </w:t>
+      </w:r>
+      <w:r>
+        <w:t xml:space="preserve">on</w:t>
+      </w:r>
+      <w:r>
+        <w:t xml:space="preserve"> </w:t>
+      </w:r>
+      <w:r>
+        <w:rPr>
+          <w:i/>
+          <w:iCs/>
+        </w:rPr>
+        <w:t xml:space="preserve">booking-schedule</w:t>
+      </w:r>
+      <w:r>
+        <w:t xml:space="preserve">).</w:t>
       </w:r>
       <w:r>
         <w:t xml:space="preserve"> </w:t>
@@ -18642,13 +19380,139 @@
           <w:b/>
           <w:bCs/>
         </w:rPr>
+        <w:t xml:space="preserve">Expired bookings (since October 21, 2026):</w:t>
+      </w:r>
+      <w:r>
+        <w:t xml:space="preserve"> </w:t>
+      </w:r>
+      <w:r>
+        <w:t xml:space="preserve">every 5 minutes</w:t>
+      </w:r>
+      <w:r>
+        <w:t xml:space="preserve"> </w:t>
+      </w:r>
+      <w:r>
+        <w:rPr>
+          <w:i/>
+          <w:iCs/>
+        </w:rPr>
+        <w:t xml:space="preserve">ExpiredBookingsJob</w:t>
+      </w:r>
+      <w:r>
+        <w:t xml:space="preserve"> </w:t>
+      </w:r>
+      <w:r>
+        <w:t xml:space="preserve">calls</w:t>
+      </w:r>
+      <w:r>
+        <w:t xml:space="preserve"> </w:t>
+      </w:r>
+      <w:r>
+        <w:rPr>
+          <w:i/>
+          <w:iCs/>
+        </w:rPr>
+        <w:t xml:space="preserve">BookingService.closeExpired</w:t>
+      </w:r>
+      <w:r>
+        <w:t xml:space="preserve">, which cancels only the bookings still SCHEDULED one hour after their end time (</w:t>
+      </w:r>
+      <w:r>
+        <w:rPr>
+          <w:i/>
+          <w:iCs/>
+        </w:rPr>
+        <w:t xml:space="preserve">BOOKING_EXPIRY_GRACE_MINUTES</w:t>
+      </w:r>
+      <w:r>
+        <w:t xml:space="preserve">), with the system reason</w:t>
+      </w:r>
+      <w:r>
+        <w:t xml:space="preserve"> </w:t>
+      </w:r>
+      <w:r>
+        <w:rPr>
+          <w:i/>
+          <w:iCs/>
+        </w:rPr>
+        <w:t xml:space="preserve">EXPIRED</w:t>
+      </w:r>
+      <w:r>
+        <w:t xml:space="preserve"> </w:t>
+      </w:r>
+      <w:r>
+        <w:t xml:space="preserve">(seed 112), which does not appear in the list of reasons. A CONFIRMED booking is never closed from booking-service, because it may have been served without being recorded: operations-service decides (section 12.4). For one that never had an operator, operations-service calls the internal route</w:t>
+      </w:r>
+      <w:r>
+        <w:t xml:space="preserve"> </w:t>
+      </w:r>
+      <w:r>
+        <w:rPr>
+          <w:i/>
+          <w:iCs/>
+        </w:rPr>
+        <w:t xml:space="preserve">POST /internal/v1/bookings/{id}/no-show</w:t>
+      </w:r>
+      <w:r>
+        <w:t xml:space="preserve"> </w:t>
+      </w:r>
+      <w:r>
+        <w:t xml:space="preserve">(</w:t>
+      </w:r>
+      <w:r>
+        <w:rPr>
+          <w:i/>
+          <w:iCs/>
+        </w:rPr>
+        <w:t xml:space="preserve">BookingService.markUnattended</w:t>
+      </w:r>
+      <w:r>
+        <w:t xml:space="preserve">), which checks again that the booking is CONFIRMED and already expired (409 BOOKING_NOT_EXPIRED otherwise) and moves it to NO_SHOW. Nothing is refunded automatically. The job is turned off with</w:t>
+      </w:r>
+      <w:r>
+        <w:t xml:space="preserve"> </w:t>
+      </w:r>
+      <w:r>
+        <w:rPr>
+          <w:i/>
+          <w:iCs/>
+        </w:rPr>
+        <w:t xml:space="preserve">BOOKING_EXPIRY_CHECK_ENABLED=false</w:t>
+      </w:r>
+      <w:r>
+        <w:t xml:space="preserve"> </w:t>
+      </w:r>
+      <w:r>
+        <w:t xml:space="preserve">and its interval is</w:t>
+      </w:r>
+      <w:r>
+        <w:t xml:space="preserve"> </w:t>
+      </w:r>
+      <w:r>
+        <w:rPr>
+          <w:i/>
+          <w:iCs/>
+        </w:rPr>
+        <w:t xml:space="preserve">BOOKING_EXPIRY_CHECK_INTERVAL</w:t>
+      </w:r>
+      <w:r>
+        <w:t xml:space="preserve">.</w:t>
+      </w:r>
+      <w:r>
+        <w:t xml:space="preserve"> </w:t>
+      </w:r>
+      <w:r>
+        <w:rPr>
+          <w:b/>
+          <w:bCs/>
+        </w:rPr>
         <w:t xml:space="preserve">Events:</w:t>
       </w:r>
       <w:r>
         <w:t xml:space="preserve"> </w:t>
       </w:r>
       <w:r>
-        <w:t xml:space="preserve">publishes BookingConfirmed (created or rescheduled) and BookingCancelled.</w:t>
+        <w:t xml:space="preserve">publishes BookingConfirmed (created or rescheduled) and BookingCancelled (also when an expired booking is cancelled; the move to NO_SHOW publishes no event).</w:t>
       </w:r>
     </w:p>
     <w:bookmarkEnd w:id="71"/>
@@ -18800,7 +19664,75 @@
         <w:t xml:space="preserve"> </w:t>
       </w:r>
       <w:r>
-        <w:t xml:space="preserve">include the bay of the booking (ADR-015).</w:t>
+        <w:t xml:space="preserve">include the bay of the booking (ADR-015). Since October 21, 2026 manual and automatic assignment take the same lock (</w:t>
+      </w:r>
+      <w:r>
+        <w:rPr>
+          <w:i/>
+          <w:iCs/>
+        </w:rPr>
+        <w:t xml:space="preserve">ExecutionRepository.lockAssignments</w:t>
+      </w:r>
+      <w:r>
+        <w:t xml:space="preserve">,</w:t>
+      </w:r>
+      <w:r>
+        <w:t xml:space="preserve"> </w:t>
+      </w:r>
+      <w:r>
+        <w:rPr>
+          <w:i/>
+          <w:iCs/>
+        </w:rPr>
+        <w:t xml:space="preserve">sp_getapplock</w:t>
+      </w:r>
+      <w:r>
+        <w:t xml:space="preserve"> </w:t>
+      </w:r>
+      <w:r>
+        <w:t xml:space="preserve">on</w:t>
+      </w:r>
+      <w:r>
+        <w:t xml:space="preserve"> </w:t>
+      </w:r>
+      <w:r>
+        <w:rPr>
+          <w:i/>
+          <w:iCs/>
+        </w:rPr>
+        <w:t xml:space="preserve">operations-assignment</w:t>
+      </w:r>
+      <w:r>
+        <w:t xml:space="preserve">) before reading the operator bookings and saving, and</w:t>
+      </w:r>
+      <w:r>
+        <w:t xml:space="preserve"> </w:t>
+      </w:r>
+      <w:r>
+        <w:rPr>
+          <w:i/>
+          <w:iCs/>
+        </w:rPr>
+        <w:t xml:space="preserve">GET /api/v1/admin/assignments/unassigned</w:t>
+      </w:r>
+      <w:r>
+        <w:t xml:space="preserve"> </w:t>
+      </w:r>
+      <w:r>
+        <w:t xml:space="preserve">returns</w:t>
+      </w:r>
+      <w:r>
+        <w:t xml:space="preserve"> </w:t>
+      </w:r>
+      <w:r>
+        <w:rPr>
+          <w:i/>
+          <w:iCs/>
+        </w:rPr>
+        <w:t xml:space="preserve">{count, bookingIds}</w:t>
+      </w:r>
+      <w:r>
+        <w:t xml:space="preserve">, the single count of bookings without an operator (SCHEDULED or CONFIRMED, with no operator on any line, and whose time has not ended) used by the dashboard and the bookings screen of the web and the mobile app.</w:t>
       </w:r>
       <w:r>
         <w:t xml:space="preserve"> </w:t>
@@ -18810,26 +19742,175 @@
           <w:b/>
           <w:bCs/>
         </w:rPr>
-        <w:t xml:space="preserve">Inspection (RF-036):</w:t>
-      </w:r>
-      <w:r>
-        <w:t xml:space="preserve"> </w:t>
-      </w:r>
-      <w:r>
-        <w:t xml:space="preserve">only for services of 180 minutes or more; phases Reception, Exterior, Interior, Engine, and Delivery; up to five photos of 2 MB per finding, stored in</w:t>
-      </w:r>
-      <w:r>
-        <w:t xml:space="preserve"> </w:t>
-      </w:r>
-      <w:r>
-        <w:rPr>
-          <w:i/>
-          <w:iCs/>
-        </w:rPr>
-        <w:t xml:space="preserve">execution.inspection_photo</w:t>
-      </w:r>
-      <w:r>
-        <w:t xml:space="preserve">; the public link uses a random token and only works after publishing.</w:t>
+        <w:t xml:space="preserve">Bookings that ended without being closed (since October 21, 2026):</w:t>
+      </w:r>
+      <w:r>
+        <w:t xml:space="preserve"> </w:t>
+      </w:r>
+      <w:r>
+        <w:t xml:space="preserve">every 5 minutes</w:t>
+      </w:r>
+      <w:r>
+        <w:t xml:space="preserve"> </w:t>
+      </w:r>
+      <w:r>
+        <w:rPr>
+          <w:i/>
+          <w:iCs/>
+        </w:rPr>
+        <w:t xml:space="preserve">FollowUpJob</w:t>
+      </w:r>
+      <w:r>
+        <w:t xml:space="preserve"> </w:t>
+      </w:r>
+      <w:r>
+        <w:t xml:space="preserve">calls</w:t>
+      </w:r>
+      <w:r>
+        <w:t xml:space="preserve"> </w:t>
+      </w:r>
+      <w:r>
+        <w:rPr>
+          <w:i/>
+          <w:iCs/>
+        </w:rPr>
+        <w:t xml:space="preserve">FollowUpService.followUp</w:t>
+      </w:r>
+      <w:r>
+        <w:t xml:space="preserve">, which reviews the bookings of the last 7 days with</w:t>
+      </w:r>
+      <w:r>
+        <w:t xml:space="preserve"> </w:t>
+      </w:r>
+      <w:r>
+        <w:rPr>
+          <w:i/>
+          <w:iCs/>
+        </w:rPr>
+        <w:t xml:space="preserve">FollowUpPolicy</w:t>
+      </w:r>
+      <w:r>
+        <w:t xml:space="preserve">. The policy only decides on its own when it is sure: NO_OPERATOR (CONFIRMED without an operator, one hour after its end) is closed as NO_SHOW through the internal route of booking-service; NOT_STARTED (CONFIRMED with an operator, not started when its time ended) and NOT_FINISHED (IN_PROGRESS not finished one hour after its end) are never marked on their own and stay "to close". For these two, operations-service publishes ServiceNotStarted or ServiceNotFinished only once and stores the time of the notice in</w:t>
+      </w:r>
+      <w:r>
+        <w:t xml:space="preserve"> </w:t>
+      </w:r>
+      <w:r>
+        <w:rPr>
+          <w:i/>
+          <w:iCs/>
+        </w:rPr>
+        <w:t xml:space="preserve">execution.service_execution.follow_up_notice_at</w:t>
+      </w:r>
+      <w:r>
+        <w:t xml:space="preserve"> </w:t>
+      </w:r>
+      <w:r>
+        <w:t xml:space="preserve">(changelog 040), which is cleared when the service is started.</w:t>
+      </w:r>
+      <w:r>
+        <w:t xml:space="preserve"> </w:t>
+      </w:r>
+      <w:r>
+        <w:rPr>
+          <w:i/>
+          <w:iCs/>
+        </w:rPr>
+        <w:t xml:space="preserve">GET /api/v1/admin/assignments/to-close</w:t>
+      </w:r>
+      <w:r>
+        <w:t xml:space="preserve"> </w:t>
+      </w:r>
+      <w:r>
+        <w:t xml:space="preserve">lists the bookings to close (by default, the last week) and</w:t>
+      </w:r>
+      <w:r>
+        <w:t xml:space="preserve"> </w:t>
+      </w:r>
+      <w:r>
+        <w:rPr>
+          <w:i/>
+          <w:iCs/>
+        </w:rPr>
+        <w:t xml:space="preserve">POST /api/v1/admin/assignments/{bookingId}/attended</w:t>
+      </w:r>
+      <w:r>
+        <w:t xml:space="preserve"> </w:t>
+      </w:r>
+      <w:r>
+        <w:t xml:space="preserve">(</w:t>
+      </w:r>
+      <w:r>
+        <w:rPr>
+          <w:i/>
+          <w:iCs/>
+        </w:rPr>
+        <w:t xml:space="preserve">FollowUpService.closeAsAttended</w:t>
+      </w:r>
+      <w:r>
+        <w:t xml:space="preserve">) closes one as attended: the open lines become COMPLETED without made-up hours (without a start time it does not count toward punctuality and without an end time it adds no worked hours, but it does count as a service done and as income), the booking moves to IN_PROGRESS if needed and then to COMPLETED, and ServiceCompleted is not published, so the customer does not get "ready for pickup" hours later; the customer can still rate it. If the booking is not to close, the answer is 409 BOOKING_NOT_TO_CLOSE. The administrator's "No-show" is still the status change of booking-service (</w:t>
+      </w:r>
+      <w:r>
+        <w:rPr>
+          <w:i/>
+          <w:iCs/>
+        </w:rPr>
+        <w:t xml:space="preserve">PATCH /api/v1/admin/bookings/{id}/status</w:t>
+      </w:r>
+      <w:r>
+        <w:t xml:space="preserve">) and only applies to a booking that was never started. The operator's lists no longer show NO_SHOW or CANCELLED bookings. The job uses</w:t>
+      </w:r>
+      <w:r>
+        <w:t xml:space="preserve"> </w:t>
+      </w:r>
+      <w:r>
+        <w:rPr>
+          <w:i/>
+          <w:iCs/>
+        </w:rPr>
+        <w:t xml:space="preserve">FOLLOW_UP_ENABLED</w:t>
+      </w:r>
+      <w:r>
+        <w:t xml:space="preserve">,</w:t>
+      </w:r>
+      <w:r>
+        <w:t xml:space="preserve"> </w:t>
+      </w:r>
+      <w:r>
+        <w:rPr>
+          <w:i/>
+          <w:iCs/>
+        </w:rPr>
+        <w:t xml:space="preserve">FOLLOW_UP_INTERVAL</w:t>
+      </w:r>
+      <w:r>
+        <w:t xml:space="preserve">, and</w:t>
+      </w:r>
+      <w:r>
+        <w:t xml:space="preserve"> </w:t>
+      </w:r>
+      <w:r>
+        <w:rPr>
+          <w:i/>
+          <w:iCs/>
+        </w:rPr>
+        <w:t xml:space="preserve">BOOKING_EXPIRY_GRACE_MINUTES</w:t>
+      </w:r>
+      <w:r>
+        <w:t xml:space="preserve">, and needs</w:t>
+      </w:r>
+      <w:r>
+        <w:t xml:space="preserve"> </w:t>
+      </w:r>
+      <w:r>
+        <w:rPr>
+          <w:i/>
+          <w:iCs/>
+        </w:rPr>
+        <w:t xml:space="preserve">INTERNAL_API_KEY</w:t>
+      </w:r>
+      <w:r>
+        <w:t xml:space="preserve">.</w:t>
       </w:r>
       <w:r>
         <w:t xml:space="preserve"> </w:t>
@@ -18839,6 +19920,35 @@
           <w:b/>
           <w:bCs/>
         </w:rPr>
+        <w:t xml:space="preserve">Inspection (RF-036):</w:t>
+      </w:r>
+      <w:r>
+        <w:t xml:space="preserve"> </w:t>
+      </w:r>
+      <w:r>
+        <w:t xml:space="preserve">only for services of 180 minutes or more; phases Reception, Exterior, Interior, Engine, and Delivery; up to five photos of 2 MB per finding, stored in</w:t>
+      </w:r>
+      <w:r>
+        <w:t xml:space="preserve"> </w:t>
+      </w:r>
+      <w:r>
+        <w:rPr>
+          <w:i/>
+          <w:iCs/>
+        </w:rPr>
+        <w:t xml:space="preserve">execution.inspection_photo</w:t>
+      </w:r>
+      <w:r>
+        <w:t xml:space="preserve">; the public link uses a random token and only works after publishing.</w:t>
+      </w:r>
+      <w:r>
+        <w:t xml:space="preserve"> </w:t>
+      </w:r>
+      <w:r>
+        <w:rPr>
+          <w:b/>
+          <w:bCs/>
+        </w:rPr>
         <w:t xml:space="preserve">Events:</w:t>
       </w:r>
       <w:r>
@@ -18861,7 +19971,7 @@
         <w:t xml:space="preserve"> </w:t>
       </w:r>
       <w:r>
-        <w:t xml:space="preserve">and publishes OperatorAssigned, ServiceStarted, ServiceCompleted, and InspectionShared.</w:t>
+        <w:t xml:space="preserve">and publishes OperatorAssigned, ServiceStarted, ServiceCompleted, InspectionShared, ServiceNotStarted, and ServiceNotFinished.</w:t>
       </w:r>
     </w:p>
     <w:bookmarkEnd w:id="72"/>
@@ -18962,7 +20072,23 @@
         <w:t xml:space="preserve">AmountDueCalculator</w:t>
       </w:r>
       <w:r>
-        <w:t xml:space="preserve">); the payment reported by the customer goes directly to IN_REVIEW with the declared amount; a reused transaction reference is rejected; rejection requires a reason of up to 200 characters; a manual payment is approved immediately; the state machine is PENDING → IN_REVIEW → APPROVED or REJECTED, and APPROVED → REFUNDED.</w:t>
+        <w:t xml:space="preserve">); the payment reported by the customer goes directly to IN_REVIEW with the declared amount; a reused transaction reference is rejected; the receipt weighs 2 MB at most (400 RECEIPT_TOO_LARGE; the web and the app compress it before sending it);</w:t>
+      </w:r>
+      <w:r>
+        <w:t xml:space="preserve"> </w:t>
+      </w:r>
+      <w:r>
+        <w:rPr>
+          <w:i/>
+          <w:iCs/>
+        </w:rPr>
+        <w:t xml:space="preserve">GET /api/v1/payment-accounts</w:t>
+      </w:r>
+      <w:r>
+        <w:t xml:space="preserve"> </w:t>
+      </w:r>
+      <w:r>
+        <w:t xml:space="preserve">returns the active accounts, including the cash account while it is active; rejection requires a reason of up to 200 characters; a manual payment is approved immediately; the state machine is PENDING → IN_REVIEW → APPROVED or REJECTED, and APPROVED → REFUNDED.</w:t>
       </w:r>
       <w:r>
         <w:t xml:space="preserve"> </w:t>
@@ -19279,7 +20405,81 @@
         <w:t xml:space="preserve">deploy/publish-apk.sh</w:t>
       </w:r>
       <w:r>
-        <w:t xml:space="preserve">, announces by push that a new version of the application is available.</w:t>
+        <w:t xml:space="preserve">, announces by push that a new version of the application is available; since October 21, 2026, ServiceNotStarted and ServiceNotFinished (</w:t>
+      </w:r>
+      <w:r>
+        <w:rPr>
+          <w:i/>
+          <w:iCs/>
+        </w:rPr>
+        <w:t xml:space="preserve">execution.service_not_started</w:t>
+      </w:r>
+      <w:r>
+        <w:t xml:space="preserve"> </w:t>
+      </w:r>
+      <w:r>
+        <w:t xml:space="preserve">and</w:t>
+      </w:r>
+      <w:r>
+        <w:t xml:space="preserve"> </w:t>
+      </w:r>
+      <w:r>
+        <w:rPr>
+          <w:i/>
+          <w:iCs/>
+        </w:rPr>
+        <w:t xml:space="preserve">execution.service_not_finished</w:t>
+      </w:r>
+      <w:r>
+        <w:t xml:space="preserve">) create</w:t>
+      </w:r>
+      <w:r>
+        <w:t xml:space="preserve"> </w:t>
+      </w:r>
+      <w:r>
+        <w:rPr>
+          <w:i/>
+          <w:iCs/>
+        </w:rPr>
+        <w:t xml:space="preserve">OPERATOR_SERVICE_NOT_REGISTERED</w:t>
+      </w:r>
+      <w:r>
+        <w:t xml:space="preserve"> </w:t>
+      </w:r>
+      <w:r>
+        <w:t xml:space="preserve">for the operator ("¿Atendiste este servicio?", did you serve this booking?) and</w:t>
+      </w:r>
+      <w:r>
+        <w:t xml:space="preserve"> </w:t>
+      </w:r>
+      <w:r>
+        <w:rPr>
+          <w:i/>
+          <w:iCs/>
+        </w:rPr>
+        <w:t xml:space="preserve">ADMIN_SERVICE_NOT_REGISTERED</w:t>
+      </w:r>
+      <w:r>
+        <w:t xml:space="preserve"> </w:t>
+      </w:r>
+      <w:r>
+        <w:t xml:space="preserve">for every active administrator ("Servicio sin registrar", service not recorded), only in the inbox and by push, with the types seeded in changelog 041, and a</w:t>
+      </w:r>
+      <w:r>
+        <w:t xml:space="preserve"> </w:t>
+      </w:r>
+      <w:r>
+        <w:rPr>
+          <w:i/>
+          <w:iCs/>
+        </w:rPr>
+        <w:t xml:space="preserve">null</w:t>
+      </w:r>
+      <w:r>
+        <w:t xml:space="preserve"> </w:t>
+      </w:r>
+      <w:r>
+        <w:t xml:space="preserve">field in an event payload is ignored instead of sending the whole message to the DLQ.</w:t>
       </w:r>
       <w:r>
         <w:t xml:space="preserve"> </w:t>
@@ -19374,7 +20574,39 @@
         <w:t xml:space="preserve"> </w:t>
       </w:r>
       <w:r>
-        <w:t xml:space="preserve">translates the error codes. Every screen reads and saves through the API: the business data use</w:t>
+        <w:t xml:space="preserve">translates the error codes. Since October 21, 2026 the</w:t>
+      </w:r>
+      <w:r>
+        <w:t xml:space="preserve"> </w:t>
+      </w:r>
+      <w:r>
+        <w:rPr>
+          <w:i/>
+          <w:iCs/>
+        </w:rPr>
+        <w:t xml:space="preserve">auth</w:t>
+      </w:r>
+      <w:r>
+        <w:t xml:space="preserve"> </w:t>
+      </w:r>
+      <w:r>
+        <w:t xml:space="preserve">service listens to the</w:t>
+      </w:r>
+      <w:r>
+        <w:t xml:space="preserve"> </w:t>
+      </w:r>
+      <w:r>
+        <w:rPr>
+          <w:i/>
+          <w:iCs/>
+        </w:rPr>
+        <w:t xml:space="preserve">storage</w:t>
+      </w:r>
+      <w:r>
+        <w:t xml:space="preserve"> </w:t>
+      </w:r>
+      <w:r>
+        <w:t xml:space="preserve">event: if another tab of the same browser signs out, this one goes back to sign-in, and if another account signs in, it reloads so it does not show the previous account's data; the payment screen compresses the receipt to at most 2 MB and enlarges the QR with a magnifier. Every screen reads and saves through the API: the business data use</w:t>
       </w:r>
       <w:r>
         <w:t xml:space="preserve"> </w:t>
@@ -19406,7 +20638,7 @@
         <w:t xml:space="preserve"> </w:t>
       </w:r>
       <w:r>
-        <w:t xml:space="preserve">over operations-service (the photos are compressed in the browser before being sent). Only the reports are calculated in the browser from the bookings and payments. Roles and permissions, promotions, loyalty, preferences, and notification switches are read and saved through the API (</w:t>
+        <w:t xml:space="preserve">over operations-service (the photos are compressed in the browser before being sent). Only the reports are calculated in the browser from the bookings and payments; since October 21, 2026 only completed bookings count as services done. Roles and permissions, promotions, loyalty, preferences, and notification switches are read and saved through the API (</w:t>
       </w:r>
       <w:r>
         <w:rPr>
@@ -19539,7 +20771,33 @@
         <w:t xml:space="preserve"> </w:t>
       </w:r>
       <w:r>
-        <w:t xml:space="preserve">or, when it is not set, from the same host as the gateway with port 4200.</w:t>
+        <w:t xml:space="preserve">or, when it is not set, from the same host as the gateway with port 4200. Since the night of October 21, 2026 the administrator's home, on the web (</w:t>
+      </w:r>
+      <w:r>
+        <w:rPr>
+          <w:i/>
+          <w:iCs/>
+        </w:rPr>
+        <w:t xml:space="preserve">reservations-store</w:t>
+      </w:r>
+      <w:r>
+        <w:t xml:space="preserve">) and in the app, shows the "To close" card with the "Attended" and "No-show" buttons only when there are bookings to close, and both use</w:t>
+      </w:r>
+      <w:r>
+        <w:t xml:space="preserve"> </w:t>
+      </w:r>
+      <w:r>
+        <w:rPr>
+          <w:i/>
+          <w:iCs/>
+        </w:rPr>
+        <w:t xml:space="preserve">GET /api/v1/admin/assignments/unassigned</w:t>
+      </w:r>
+      <w:r>
+        <w:t xml:space="preserve"> </w:t>
+      </w:r>
+      <w:r>
+        <w:t xml:space="preserve">for the count of bookings without an operator (if operations-service does not answer, they apply the same rule with the data they have). In the app, also, the administrator's booking form saves the chosen operator and status, the customer's points bar is full when nothing is left to unlock and does not show "0% OFF", the operator sees "—" as the rating when there are no ratings and the operator's home no longer repeats the "In progress" counter, the roles tab says that the three roles are fixed and the permissions are for reference, and the new notices open the operator's services screen or the administrator's home.</w:t>
       </w:r>
     </w:p>
     <w:bookmarkEnd w:id="75"/>
@@ -19655,7 +20913,7 @@
               <w:pStyle w:val="Compact"/>
             </w:pPr>
             <w:r>
-              <w:t xml:space="preserve">Creation → CONFIRMED; SCHEDULED → CONFIRMED; CONFIRMED → IN_PROGRESS → COMPLETED; SCHEDULED or CONFIRMED → CANCELLED or NO_SHOW.</w:t>
+              <w:t xml:space="preserve">Creation → CONFIRMED; SCHEDULED → CONFIRMED; CONFIRMED → IN_PROGRESS → COMPLETED; SCHEDULED or CONFIRMED → CANCELLED or NO_SHOW. The system only closes a booking when it is sure, one hour after its end: SCHEDULED → CANCELLED with the EXPIRED reason and CONFIRMED without an operator → NO_SHOW. A CONFIRMED booking with an operator that nobody recorded does not change on its own: the administrator resolves it (Attended → IN_PROGRESS → COMPLETED, or No-show).</w:t>
             </w:r>
           </w:p>
         </w:tc>
@@ -19815,7 +21073,7 @@
       <w:r>
         <w:drawing>
           <wp:inline>
-            <wp:extent cx="5334000" cy="996233"/>
+            <wp:extent cx="5334000" cy="1012837"/>
             <wp:effectExtent b="0" l="0" r="0" t="0"/>
             <wp:docPr descr="" title="" id="77" name="Picture"/>
             <a:graphic>
@@ -19836,7 +21094,7 @@
                   <pic:spPr bwMode="auto">
                     <a:xfrm>
                       <a:off x="0" y="0"/>
-                      <a:ext cx="5334000" cy="996233"/>
+                      <a:ext cx="5334000" cy="1012837"/>
                     </a:xfrm>
                     <a:prstGeom prst="rect">
                       <a:avLst/>
@@ -19882,6 +21140,70 @@
       <w:r>
         <w:t xml:space="preserve">).</w:t>
       </w:r>
+      <w:r>
+        <w:t xml:space="preserve"> </w:t>
+      </w:r>
+      <w:r>
+        <w:rPr>
+          <w:i/>
+          <w:iCs/>
+        </w:rPr>
+        <w:t xml:space="preserve">Expired</w:t>
+      </w:r>
+      <w:r>
+        <w:t xml:space="preserve"> </w:t>
+      </w:r>
+      <w:r>
+        <w:t xml:space="preserve">is the automatic close of</w:t>
+      </w:r>
+      <w:r>
+        <w:t xml:space="preserve"> </w:t>
+      </w:r>
+      <w:r>
+        <w:rPr>
+          <w:i/>
+          <w:iCs/>
+        </w:rPr>
+        <w:t xml:space="preserve">ExpiredBookingsJob</w:t>
+      </w:r>
+      <w:r>
+        <w:t xml:space="preserve"> </w:t>
+      </w:r>
+      <w:r>
+        <w:t xml:space="preserve">(section 12.3) and</w:t>
+      </w:r>
+      <w:r>
+        <w:t xml:space="preserve"> </w:t>
+      </w:r>
+      <w:r>
+        <w:rPr>
+          <w:i/>
+          <w:iCs/>
+        </w:rPr>
+        <w:t xml:space="preserve">ended without operator</w:t>
+      </w:r>
+      <w:r>
+        <w:t xml:space="preserve"> </w:t>
+      </w:r>
+      <w:r>
+        <w:t xml:space="preserve">is requested by</w:t>
+      </w:r>
+      <w:r>
+        <w:t xml:space="preserve"> </w:t>
+      </w:r>
+      <w:r>
+        <w:rPr>
+          <w:i/>
+          <w:iCs/>
+        </w:rPr>
+        <w:t xml:space="preserve">FollowUpJob</w:t>
+      </w:r>
+      <w:r>
+        <w:t xml:space="preserve"> </w:t>
+      </w:r>
+      <w:r>
+        <w:t xml:space="preserve">of operations-service (section 12.4). A confirmed booking with an operator that nobody recorded does not change status on its own: the administrator resolves it from "To close" (Attended → IN_PROGRESS → COMPLETED, or No-show).</w:t>
+      </w:r>
     </w:p>
     <w:bookmarkEnd w:id="79"/>
     <w:bookmarkEnd w:id="80"/>
@@ -20404,7 +21726,33 @@
         <w:t xml:space="preserve">jti</w:t>
       </w:r>
       <w:r>
-        <w:t xml:space="preserve">. There is no refresh token: when the token expires, the person logs in again. A JWT cannot be revoked before its expiration (Jones et al., 2015); logout only closes the session record. Every service validates the signature, the issuer, and the audience with the same secret.</w:t>
+        <w:t xml:space="preserve">. There is no refresh token: when the token expires, the person logs in again. A JWT cannot be revoked by itself before its expiration (Jones et al., 2015). Since October 21, 2026 the system makes up for it with the</w:t>
+      </w:r>
+      <w:r>
+        <w:t xml:space="preserve"> </w:t>
+      </w:r>
+      <w:r>
+        <w:rPr>
+          <w:i/>
+          <w:iCs/>
+        </w:rPr>
+        <w:t xml:space="preserve">sid</w:t>
+      </w:r>
+      <w:r>
+        <w:t xml:space="preserve"> </w:t>
+      </w:r>
+      <w:r>
+        <w:t xml:space="preserve">claim: logging out, or the administrator disabling the account or the owner deactivating it, closes the session record; security-service rejects the tokens of that session and the gateway asks it (</w:t>
+      </w:r>
+      <w:r>
+        <w:rPr>
+          <w:i/>
+          <w:iCs/>
+        </w:rPr>
+        <w:t xml:space="preserve">GET /api/v1/auth/session</w:t>
+      </w:r>
+      <w:r>
+        <w:t xml:space="preserve">) before passing any request on to the other services, keeping the answer 30 seconds per token (section 9.2). Every service validates the signature, the issuer, and the audience with the same secret.</w:t>
       </w:r>
     </w:p>
     <w:bookmarkEnd w:id="82"/>
@@ -20635,7 +21983,53 @@
               <w:pStyle w:val="Compact"/>
             </w:pPr>
             <w:r>
-              <w:t xml:space="preserve">Closes the session.</w:t>
+              <w:t xml:space="preserve">Closes the session; the token stops working.</w:t>
+            </w:r>
+          </w:p>
+        </w:tc>
+      </w:tr>
+      <w:tr>
+        <w:tc>
+          <w:tcPr/>
+          <w:p>
+            <w:pPr>
+              <w:pStyle w:val="Compact"/>
+            </w:pPr>
+            <w:r>
+              <w:t xml:space="preserve">GET</w:t>
+            </w:r>
+          </w:p>
+        </w:tc>
+        <w:tc>
+          <w:tcPr/>
+          <w:p>
+            <w:pPr>
+              <w:pStyle w:val="Compact"/>
+            </w:pPr>
+            <w:r>
+              <w:t xml:space="preserve">/api/v1/auth/session</w:t>
+            </w:r>
+          </w:p>
+        </w:tc>
+        <w:tc>
+          <w:tcPr/>
+          <w:p>
+            <w:pPr>
+              <w:pStyle w:val="Compact"/>
+            </w:pPr>
+            <w:r>
+              <w:t xml:space="preserve">Token</w:t>
+            </w:r>
+          </w:p>
+        </w:tc>
+        <w:tc>
+          <w:tcPr/>
+          <w:p>
+            <w:pPr>
+              <w:pStyle w:val="Compact"/>
+            </w:pPr>
+            <w:r>
+              <w:t xml:space="preserve">204 if the session of the token is still open; 401 if it was closed. Used by the gateway.</w:t>
             </w:r>
           </w:p>
         </w:tc>
@@ -21509,7 +22903,7 @@
               <w:pStyle w:val="Compact"/>
             </w:pPr>
             <w:r>
-              <w:t xml:space="preserve">Own bookings and catalog of reasons.</w:t>
+              <w:t xml:space="preserve">Own bookings and catalog of reasons (without the EXPIRED system reason).</w:t>
             </w:r>
           </w:p>
         </w:tc>
@@ -22350,6 +23744,154 @@
               <w:pStyle w:val="Compact"/>
             </w:pPr>
             <w:r>
+              <w:t xml:space="preserve">GET</w:t>
+            </w:r>
+          </w:p>
+        </w:tc>
+        <w:tc>
+          <w:tcPr/>
+          <w:p>
+            <w:pPr>
+              <w:pStyle w:val="Compact"/>
+            </w:pPr>
+            <w:r>
+              <w:t xml:space="preserve">/api/v1/admin/assignments/unassigned (?from=&amp;to=)</w:t>
+            </w:r>
+          </w:p>
+        </w:tc>
+        <w:tc>
+          <w:tcPr/>
+          <w:p>
+            <w:pPr>
+              <w:pStyle w:val="Compact"/>
+            </w:pPr>
+            <w:r>
+              <w:t xml:space="preserve">ADMIN</w:t>
+            </w:r>
+          </w:p>
+        </w:tc>
+        <w:tc>
+          <w:tcPr/>
+          <w:p>
+            <w:pPr>
+              <w:pStyle w:val="Compact"/>
+            </w:pPr>
+            <w:r>
+              <w:rPr>
+                <w:i/>
+                <w:iCs/>
+              </w:rPr>
+              <w:t xml:space="preserve">{count, bookingIds}</w:t>
+            </w:r>
+            <w:r>
+              <w:t xml:space="preserve"> </w:t>
+            </w:r>
+            <w:r>
+              <w:t xml:space="preserve">of the scheduled or confirmed bookings without an operator that have not ended yet; the dashboard and the bookings screen of the web and the app use this count.</w:t>
+            </w:r>
+          </w:p>
+        </w:tc>
+      </w:tr>
+      <w:tr>
+        <w:tc>
+          <w:tcPr/>
+          <w:p>
+            <w:pPr>
+              <w:pStyle w:val="Compact"/>
+            </w:pPr>
+            <w:r>
+              <w:t xml:space="preserve">GET</w:t>
+            </w:r>
+          </w:p>
+        </w:tc>
+        <w:tc>
+          <w:tcPr/>
+          <w:p>
+            <w:pPr>
+              <w:pStyle w:val="Compact"/>
+            </w:pPr>
+            <w:r>
+              <w:t xml:space="preserve">/api/v1/admin/assignments/to-close (?from=&amp;to=)</w:t>
+            </w:r>
+          </w:p>
+        </w:tc>
+        <w:tc>
+          <w:tcPr/>
+          <w:p>
+            <w:pPr>
+              <w:pStyle w:val="Compact"/>
+            </w:pPr>
+            <w:r>
+              <w:t xml:space="preserve">ADMIN</w:t>
+            </w:r>
+          </w:p>
+        </w:tc>
+        <w:tc>
+          <w:tcPr/>
+          <w:p>
+            <w:pPr>
+              <w:pStyle w:val="Compact"/>
+            </w:pPr>
+            <w:r>
+              <w:t xml:space="preserve">Bookings with an operator that ended without being recorded (NOT_STARTED or NOT_FINISHED); by default, the last week.</w:t>
+            </w:r>
+          </w:p>
+        </w:tc>
+      </w:tr>
+      <w:tr>
+        <w:tc>
+          <w:tcPr/>
+          <w:p>
+            <w:pPr>
+              <w:pStyle w:val="Compact"/>
+            </w:pPr>
+            <w:r>
+              <w:t xml:space="preserve">POST</w:t>
+            </w:r>
+          </w:p>
+        </w:tc>
+        <w:tc>
+          <w:tcPr/>
+          <w:p>
+            <w:pPr>
+              <w:pStyle w:val="Compact"/>
+            </w:pPr>
+            <w:r>
+              <w:t xml:space="preserve">/api/v1/admin/assignments/{bookingId}/attended</w:t>
+            </w:r>
+          </w:p>
+        </w:tc>
+        <w:tc>
+          <w:tcPr/>
+          <w:p>
+            <w:pPr>
+              <w:pStyle w:val="Compact"/>
+            </w:pPr>
+            <w:r>
+              <w:t xml:space="preserve">ADMIN</w:t>
+            </w:r>
+          </w:p>
+        </w:tc>
+        <w:tc>
+          <w:tcPr/>
+          <w:p>
+            <w:pPr>
+              <w:pStyle w:val="Compact"/>
+            </w:pPr>
+            <w:r>
+              <w:t xml:space="preserve">Closes a booking to close as attended, without made-up hours (409 BOOKING_NOT_TO_CLOSE if it is not).</w:t>
+            </w:r>
+          </w:p>
+        </w:tc>
+      </w:tr>
+      <w:tr>
+        <w:tc>
+          <w:tcPr/>
+          <w:p>
+            <w:pPr>
+              <w:pStyle w:val="Compact"/>
+            </w:pPr>
+            <w:r>
               <w:t xml:space="preserve">PUT</w:t>
             </w:r>
           </w:p>
@@ -22751,7 +24293,7 @@
               <w:pStyle w:val="Compact"/>
             </w:pPr>
             <w:r>
-              <w:t xml:space="preserve">Active accounts with QR.</w:t>
+              <w:t xml:space="preserve">Active accounts with QR; the cash account only appears while it is active.</w:t>
             </w:r>
           </w:p>
         </w:tc>
@@ -22797,7 +24339,7 @@
               <w:pStyle w:val="Compact"/>
             </w:pPr>
             <w:r>
-              <w:t xml:space="preserve">Reports a payment with receipt; own payments.</w:t>
+              <w:t xml:space="preserve">Reports a payment with a receipt of at most 2 MB (400 RECEIPT_TOO_LARGE); own payments.</w:t>
             </w:r>
           </w:p>
         </w:tc>
@@ -23520,6 +25062,52 @@
             </w:pPr>
             <w:r>
               <w:t xml:space="preserve">Bookings for the automatic assignment of operations-service.</w:t>
+            </w:r>
+          </w:p>
+        </w:tc>
+      </w:tr>
+      <w:tr>
+        <w:tc>
+          <w:tcPr/>
+          <w:p>
+            <w:pPr>
+              <w:pStyle w:val="Compact"/>
+            </w:pPr>
+            <w:r>
+              <w:t xml:space="preserve">POST</w:t>
+            </w:r>
+          </w:p>
+        </w:tc>
+        <w:tc>
+          <w:tcPr/>
+          <w:p>
+            <w:pPr>
+              <w:pStyle w:val="Compact"/>
+            </w:pPr>
+            <w:r>
+              <w:t xml:space="preserve">/internal/v1/bookings/{id}/no-show</w:t>
+            </w:r>
+          </w:p>
+        </w:tc>
+        <w:tc>
+          <w:tcPr/>
+          <w:p>
+            <w:pPr>
+              <w:pStyle w:val="Compact"/>
+            </w:pPr>
+            <w:r>
+              <w:t xml:space="preserve">Internal key</w:t>
+            </w:r>
+          </w:p>
+        </w:tc>
+        <w:tc>
+          <w:tcPr/>
+          <w:p>
+            <w:pPr>
+              <w:pStyle w:val="Compact"/>
+            </w:pPr>
+            <w:r>
+              <w:t xml:space="preserve">Moves to NO_SHOW a confirmed booking that ended without an operator; only operations-service calls it (409 BOOKING_NOT_EXPIRED if it has not expired yet).</w:t>
             </w:r>
           </w:p>
         </w:tc>
@@ -24701,6 +26289,63 @@
               <w:pStyle w:val="Compact"/>
             </w:pPr>
             <w:r>
+              <w:t xml:space="preserve">Published (also when the system cancels an expired booking)</w:t>
+            </w:r>
+          </w:p>
+        </w:tc>
+      </w:tr>
+      <w:tr>
+        <w:tc>
+          <w:tcPr/>
+          <w:p>
+            <w:pPr>
+              <w:pStyle w:val="Compact"/>
+            </w:pPr>
+            <w:r>
+              <w:t xml:space="preserve">OperatorAssigned</w:t>
+            </w:r>
+          </w:p>
+        </w:tc>
+        <w:tc>
+          <w:tcPr/>
+          <w:p>
+            <w:pPr>
+              <w:pStyle w:val="Compact"/>
+            </w:pPr>
+            <w:r>
+              <w:t xml:space="preserve">execution.operator_assigned</w:t>
+            </w:r>
+          </w:p>
+        </w:tc>
+        <w:tc>
+          <w:tcPr/>
+          <w:p>
+            <w:pPr>
+              <w:pStyle w:val="Compact"/>
+            </w:pPr>
+            <w:r>
+              <w:t xml:space="preserve">operations-service</w:t>
+            </w:r>
+          </w:p>
+        </w:tc>
+        <w:tc>
+          <w:tcPr/>
+          <w:p>
+            <w:pPr>
+              <w:pStyle w:val="Compact"/>
+            </w:pPr>
+            <w:r>
+              <w:t xml:space="preserve">notification-service</w:t>
+            </w:r>
+          </w:p>
+        </w:tc>
+        <w:tc>
+          <w:tcPr/>
+          <w:p>
+            <w:pPr>
+              <w:pStyle w:val="Compact"/>
+            </w:pPr>
+            <w:r>
               <w:t xml:space="preserve">Published</w:t>
             </w:r>
           </w:p>
@@ -24714,18 +26359,18 @@
               <w:pStyle w:val="Compact"/>
             </w:pPr>
             <w:r>
-              <w:t xml:space="preserve">OperatorAssigned</w:t>
-            </w:r>
-          </w:p>
-        </w:tc>
-        <w:tc>
-          <w:tcPr/>
-          <w:p>
-            <w:pPr>
-              <w:pStyle w:val="Compact"/>
-            </w:pPr>
-            <w:r>
-              <w:t xml:space="preserve">execution.operator_assigned</w:t>
+              <w:t xml:space="preserve">ServiceStarted</w:t>
+            </w:r>
+          </w:p>
+        </w:tc>
+        <w:tc>
+          <w:tcPr/>
+          <w:p>
+            <w:pPr>
+              <w:pStyle w:val="Compact"/>
+            </w:pPr>
+            <w:r>
+              <w:t xml:space="preserve">execution.service_started</w:t>
             </w:r>
           </w:p>
         </w:tc>
@@ -24771,18 +26416,18 @@
               <w:pStyle w:val="Compact"/>
             </w:pPr>
             <w:r>
-              <w:t xml:space="preserve">ServiceStarted</w:t>
-            </w:r>
-          </w:p>
-        </w:tc>
-        <w:tc>
-          <w:tcPr/>
-          <w:p>
-            <w:pPr>
-              <w:pStyle w:val="Compact"/>
-            </w:pPr>
-            <w:r>
-              <w:t xml:space="preserve">execution.service_started</w:t>
+              <w:t xml:space="preserve">ServiceCompleted</w:t>
+            </w:r>
+          </w:p>
+        </w:tc>
+        <w:tc>
+          <w:tcPr/>
+          <w:p>
+            <w:pPr>
+              <w:pStyle w:val="Compact"/>
+            </w:pPr>
+            <w:r>
+              <w:t xml:space="preserve">execution.service_completed</w:t>
             </w:r>
           </w:p>
         </w:tc>
@@ -24828,18 +26473,18 @@
               <w:pStyle w:val="Compact"/>
             </w:pPr>
             <w:r>
-              <w:t xml:space="preserve">ServiceCompleted</w:t>
-            </w:r>
-          </w:p>
-        </w:tc>
-        <w:tc>
-          <w:tcPr/>
-          <w:p>
-            <w:pPr>
-              <w:pStyle w:val="Compact"/>
-            </w:pPr>
-            <w:r>
-              <w:t xml:space="preserve">execution.service_completed</w:t>
+              <w:t xml:space="preserve">InspectionShared</w:t>
+            </w:r>
+          </w:p>
+        </w:tc>
+        <w:tc>
+          <w:tcPr/>
+          <w:p>
+            <w:pPr>
+              <w:pStyle w:val="Compact"/>
+            </w:pPr>
+            <w:r>
+              <w:t xml:space="preserve">execution.inspection_shared</w:t>
             </w:r>
           </w:p>
         </w:tc>
@@ -24872,31 +26517,31 @@
               <w:pStyle w:val="Compact"/>
             </w:pPr>
             <w:r>
-              <w:t xml:space="preserve">Published</w:t>
-            </w:r>
-          </w:p>
-        </w:tc>
-      </w:tr>
-      <w:tr>
-        <w:tc>
-          <w:tcPr/>
-          <w:p>
-            <w:pPr>
-              <w:pStyle w:val="Compact"/>
-            </w:pPr>
-            <w:r>
-              <w:t xml:space="preserve">InspectionShared</w:t>
-            </w:r>
-          </w:p>
-        </w:tc>
-        <w:tc>
-          <w:tcPr/>
-          <w:p>
-            <w:pPr>
-              <w:pStyle w:val="Compact"/>
-            </w:pPr>
-            <w:r>
-              <w:t xml:space="preserve">execution.inspection_shared</w:t>
+              <w:t xml:space="preserve">Published (with the token of the public link)</w:t>
+            </w:r>
+          </w:p>
+        </w:tc>
+      </w:tr>
+      <w:tr>
+        <w:tc>
+          <w:tcPr/>
+          <w:p>
+            <w:pPr>
+              <w:pStyle w:val="Compact"/>
+            </w:pPr>
+            <w:r>
+              <w:t xml:space="preserve">ServiceNotStarted, ServiceNotFinished</w:t>
+            </w:r>
+          </w:p>
+        </w:tc>
+        <w:tc>
+          <w:tcPr/>
+          <w:p>
+            <w:pPr>
+              <w:pStyle w:val="Compact"/>
+            </w:pPr>
+            <w:r>
+              <w:t xml:space="preserve">execution.service_not_started, execution.service_not_finished</w:t>
             </w:r>
           </w:p>
         </w:tc>
@@ -24929,7 +26574,7 @@
               <w:pStyle w:val="Compact"/>
             </w:pPr>
             <w:r>
-              <w:t xml:space="preserve">Published (with the token of the public link)</w:t>
+              <w:t xml:space="preserve">Published once per booking (since October 21, 2026)</w:t>
             </w:r>
           </w:p>
         </w:tc>
@@ -25261,7 +26906,65 @@
         <w:t xml:space="preserve">/health</w:t>
       </w:r>
       <w:r>
-        <w:t xml:space="preserve">). All of them check the database: payment-service waits at most 3 seconds for SQL Server and, if it does not answer, replies DOWN with code 503. The recommended integration checks are described in the Installation Manual, section 16, and the end-to-end tests in</w:t>
+        <w:t xml:space="preserve">). All of them check the database: payment-service waits at most 3 seconds for SQL Server and, if it does not answer, replies DOWN with code 503. On the public server,</w:t>
+      </w:r>
+      <w:r>
+        <w:t xml:space="preserve"> </w:t>
+      </w:r>
+      <w:r>
+        <w:rPr>
+          <w:i/>
+          <w:iCs/>
+        </w:rPr>
+        <w:t xml:space="preserve">docker-compose.prod.yml</w:t>
+      </w:r>
+      <w:r>
+        <w:t xml:space="preserve"> </w:t>
+      </w:r>
+      <w:r>
+        <w:t xml:space="preserve">also checks the health of every container every 30 seconds (</w:t>
+      </w:r>
+      <w:r>
+        <w:rPr>
+          <w:i/>
+          <w:iCs/>
+        </w:rPr>
+        <w:t xml:space="preserve">docker compose ps</w:t>
+      </w:r>
+      <w:r>
+        <w:t xml:space="preserve"> </w:t>
+      </w:r>
+      <w:r>
+        <w:t xml:space="preserve">shows them</w:t>
+      </w:r>
+      <w:r>
+        <w:t xml:space="preserve"> </w:t>
+      </w:r>
+      <w:r>
+        <w:rPr>
+          <w:i/>
+          <w:iCs/>
+        </w:rPr>
+        <w:t xml:space="preserve">healthy</w:t>
+      </w:r>
+      <w:r>
+        <w:t xml:space="preserve"> </w:t>
+      </w:r>
+      <w:r>
+        <w:t xml:space="preserve">or</w:t>
+      </w:r>
+      <w:r>
+        <w:t xml:space="preserve"> </w:t>
+      </w:r>
+      <w:r>
+        <w:rPr>
+          <w:i/>
+          <w:iCs/>
+        </w:rPr>
+        <w:t xml:space="preserve">unhealthy</w:t>
+      </w:r>
+      <w:r>
+        <w:t xml:space="preserve">). The recommended integration checks are described in the Installation Manual, section 16, and the end-to-end tests in</w:t>
       </w:r>
       <w:r>
         <w:t xml:space="preserve"> </w:t>
@@ -25545,7 +27248,7 @@
               <w:pStyle w:val="Compact"/>
             </w:pPr>
             <w:r>
-              <w:t xml:space="preserve">security.user_session records each login; logout sets revoked_at.</w:t>
+              <w:t xml:space="preserve">security.user_session records each login; logout sets revoked_at, and deactivating or disabling the account closes all its sessions.</w:t>
             </w:r>
           </w:p>
         </w:tc>
@@ -25569,7 +27272,43 @@
               <w:pStyle w:val="Compact"/>
             </w:pPr>
             <w:r>
-              <w:t xml:space="preserve">A token remains valid until it expires (accepted risk of ADR-006).</w:t>
+              <w:t xml:space="preserve">Since October 21, 2026 the token of a closed session stops working: security-service rejects it by its</w:t>
+            </w:r>
+            <w:r>
+              <w:t xml:space="preserve"> </w:t>
+            </w:r>
+            <w:r>
+              <w:rPr>
+                <w:i/>
+                <w:iCs/>
+              </w:rPr>
+              <w:t xml:space="preserve">sid</w:t>
+            </w:r>
+            <w:r>
+              <w:t xml:space="preserve"> </w:t>
+            </w:r>
+            <w:r>
+              <w:t xml:space="preserve">claim (</w:t>
+            </w:r>
+            <w:r>
+              <w:rPr>
+                <w:i/>
+                <w:iCs/>
+              </w:rPr>
+              <w:t xml:space="preserve">ActiveSessionValidator</w:t>
+            </w:r>
+            <w:r>
+              <w:t xml:space="preserve">) and the gateway cuts it before the other services (</w:t>
+            </w:r>
+            <w:r>
+              <w:rPr>
+                <w:i/>
+                <w:iCs/>
+              </w:rPr>
+              <w:t xml:space="preserve">SessionCheckFilter</w:t>
+            </w:r>
+            <w:r>
+              <w:t xml:space="preserve">, answer kept 30 seconds per token; if security-service does not answer, the request goes on).</w:t>
             </w:r>
           </w:p>
         </w:tc>
@@ -25883,7 +27622,78 @@
         </w:numPr>
       </w:pPr>
       <w:r>
-        <w:t xml:space="preserve">HTTPS with TLS 1.2 or later is mandatory outside the local environment; only the gateway must be exposed.</w:t>
+        <w:t xml:space="preserve">HTTPS with TLS 1.2 or later is mandatory outside the local environment; only the gateway must be exposed. On the public server, since October 20, 2026 Caddy adds the HSTS,</w:t>
+      </w:r>
+      <w:r>
+        <w:t xml:space="preserve"> </w:t>
+      </w:r>
+      <w:r>
+        <w:rPr>
+          <w:i/>
+          <w:iCs/>
+        </w:rPr>
+        <w:t xml:space="preserve">X-Content-Type-Options: nosniff</w:t>
+      </w:r>
+      <w:r>
+        <w:t xml:space="preserve">,</w:t>
+      </w:r>
+      <w:r>
+        <w:t xml:space="preserve"> </w:t>
+      </w:r>
+      <w:r>
+        <w:rPr>
+          <w:i/>
+          <w:iCs/>
+        </w:rPr>
+        <w:t xml:space="preserve">X-Frame-Options</w:t>
+      </w:r>
+      <w:r>
+        <w:t xml:space="preserve">,</w:t>
+      </w:r>
+      <w:r>
+        <w:t xml:space="preserve"> </w:t>
+      </w:r>
+      <w:r>
+        <w:rPr>
+          <w:i/>
+          <w:iCs/>
+        </w:rPr>
+        <w:t xml:space="preserve">Referrer-Policy</w:t>
+      </w:r>
+      <w:r>
+        <w:t xml:space="preserve">, and</w:t>
+      </w:r>
+      <w:r>
+        <w:t xml:space="preserve"> </w:t>
+      </w:r>
+      <w:r>
+        <w:rPr>
+          <w:i/>
+          <w:iCs/>
+        </w:rPr>
+        <w:t xml:space="preserve">Permissions-Policy</w:t>
+      </w:r>
+      <w:r>
+        <w:t xml:space="preserve"> </w:t>
+      </w:r>
+      <w:r>
+        <w:t xml:space="preserve">headers, removes the</w:t>
+      </w:r>
+      <w:r>
+        <w:t xml:space="preserve"> </w:t>
+      </w:r>
+      <w:r>
+        <w:rPr>
+          <w:i/>
+          <w:iCs/>
+        </w:rPr>
+        <w:t xml:space="preserve">Server</w:t>
+      </w:r>
+      <w:r>
+        <w:t xml:space="preserve"> </w:t>
+      </w:r>
+      <w:r>
+        <w:t xml:space="preserve">header, and sends with the web a content security policy (CSP) that only allows the project's own code, Google Fonts, and jsDelivr.</w:t>
       </w:r>
     </w:p>
     <w:p>
@@ -26078,7 +27888,7 @@
               <w:pStyle w:val="Compact"/>
             </w:pPr>
             <w:r>
-              <w:t xml:space="preserve">Applied (TLS pending in deployment)</w:t>
+              <w:t xml:space="preserve">Applied (TLS with Let's Encrypt on the public server)</w:t>
             </w:r>
           </w:p>
         </w:tc>
@@ -26172,7 +27982,7 @@
               <w:pStyle w:val="Compact"/>
             </w:pPr>
             <w:r>
-              <w:t xml:space="preserve">No stack traces in responses; Swagger only in dev.</w:t>
+              <w:t xml:space="preserve">No stack traces in responses; Swagger only in dev; security headers and CSP on the public server.</w:t>
             </w:r>
           </w:p>
         </w:tc>
@@ -26242,7 +28052,7 @@
               <w:pStyle w:val="Compact"/>
             </w:pPr>
             <w:r>
-              <w:t xml:space="preserve">One-hour token; temporary lockout after failed attempts; no rate limit in the gateway.</w:t>
+              <w:t xml:space="preserve">One-hour token; the token of a closed session stops working; temporary lockout after failed attempts; no rate limit in the gateway.</w:t>
             </w:r>
           </w:p>
         </w:tc>
@@ -26525,7 +28335,7 @@
         </w:numPr>
       </w:pPr>
       <w:r>
-        <w:t xml:space="preserve">Impossibility of revoking a JWT before its expiration.</w:t>
+        <w:t xml:space="preserve">The token of a closed session still works for up to 30 seconds (the answer the gateway keeps) or, if security-service does not answer, until it expires.</w:t>
       </w:r>
     </w:p>
     <w:p>
@@ -27515,7 +29325,84 @@
         <w:t xml:space="preserve">docker-compose.yml</w:t>
       </w:r>
       <w:r>
-        <w:t xml:space="preserve">.</w:t>
+        <w:t xml:space="preserve">. Those of October 21, 2026 (</w:t>
+      </w:r>
+      <w:r>
+        <w:rPr>
+          <w:i/>
+          <w:iCs/>
+        </w:rPr>
+        <w:t xml:space="preserve">SESSION_CHECK_*</w:t>
+      </w:r>
+      <w:r>
+        <w:t xml:space="preserve"> </w:t>
+      </w:r>
+      <w:r>
+        <w:t xml:space="preserve">in the gateway,</w:t>
+      </w:r>
+      <w:r>
+        <w:t xml:space="preserve"> </w:t>
+      </w:r>
+      <w:r>
+        <w:rPr>
+          <w:i/>
+          <w:iCs/>
+        </w:rPr>
+        <w:t xml:space="preserve">BOOKING_EXPIRY_*</w:t>
+      </w:r>
+      <w:r>
+        <w:t xml:space="preserve"> </w:t>
+      </w:r>
+      <w:r>
+        <w:t xml:space="preserve">in booking-service, with</w:t>
+      </w:r>
+      <w:r>
+        <w:t xml:space="preserve"> </w:t>
+      </w:r>
+      <w:r>
+        <w:rPr>
+          <w:i/>
+          <w:iCs/>
+        </w:rPr>
+        <w:t xml:space="preserve">BOOKING_EXPIRY_GRACE_MINUTES</w:t>
+      </w:r>
+      <w:r>
+        <w:t xml:space="preserve"> </w:t>
+      </w:r>
+      <w:r>
+        <w:t xml:space="preserve">shared with operations-service, and</w:t>
+      </w:r>
+      <w:r>
+        <w:t xml:space="preserve"> </w:t>
+      </w:r>
+      <w:r>
+        <w:rPr>
+          <w:i/>
+          <w:iCs/>
+        </w:rPr>
+        <w:t xml:space="preserve">FOLLOW_UP_ENABLED</w:t>
+      </w:r>
+      <w:r>
+        <w:t xml:space="preserve"> </w:t>
+      </w:r>
+      <w:r>
+        <w:t xml:space="preserve">and</w:t>
+      </w:r>
+      <w:r>
+        <w:t xml:space="preserve"> </w:t>
+      </w:r>
+      <w:r>
+        <w:rPr>
+          <w:i/>
+          <w:iCs/>
+        </w:rPr>
+        <w:t xml:space="preserve">FOLLOW_UP_INTERVAL</w:t>
+      </w:r>
+      <w:r>
+        <w:t xml:space="preserve"> </w:t>
+      </w:r>
+      <w:r>
+        <w:t xml:space="preserve">in operations-service) are not in those files yet, so in Docker they keep their defaults (action ACO-14).</w:t>
       </w:r>
     </w:p>
     <w:bookmarkEnd w:id="101"/>
@@ -27729,7 +29616,7 @@
         </w:numPr>
       </w:pPr>
       <w:r>
-        <w:t xml:space="preserve">The next changeset of the global numbering is 040.</w:t>
+        <w:t xml:space="preserve">The next changeset of the global numbering is 042.</w:t>
       </w:r>
     </w:p>
     <w:p>
@@ -27759,7 +29646,123 @@
         <w:pStyle w:val="FirstParagraph"/>
       </w:pPr>
       <w:r>
-        <w:t xml:space="preserve">The testing strategy proposes a pyramid of unit, integration, contract, and end-to-end tests, with at least 80% line coverage and 90% in the domain. On October 19, 2026, all the tests were run with these results: 655 unit and integration tests passed (web 43, gateway 34, security-service 151, customer-service 69, booking-service 43, operations-service 55, notification-service 112, and payment-service 148, including the 7 persistence tests against an isolated database), 19 of 19 end-to-end tests, and 42 of 42 functional cases passed against the complete system (</w:t>
+        <w:t xml:space="preserve">The testing strategy proposes a pyramid of unit, integration, contract, and end-to-end tests, with at least 80% line coverage and 90% in the domain. On the night of October 21, 2026, all the automated tests were run with these results: 707 unit and integration tests passed, none skipped (web 62 in 41 files, gateway 40, security-service 155, customer-service 69, booking-service 50, operations-service 67, notification-service 114, and payment-service 150: 115 domain, 28 application, and 7 persistence tests against the isolated</w:t>
+      </w:r>
+      <w:r>
+        <w:t xml:space="preserve"> </w:t>
+      </w:r>
+      <w:r>
+        <w:rPr>
+          <w:i/>
+          <w:iCs/>
+        </w:rPr>
+        <w:t xml:space="preserve">LavaRapidoPaymentIT</w:t>
+      </w:r>
+      <w:r>
+        <w:t xml:space="preserve"> </w:t>
+      </w:r>
+      <w:r>
+        <w:t xml:space="preserve">database), 18 more than in the earlier run of the same day because of the new classes</w:t>
+      </w:r>
+      <w:r>
+        <w:t xml:space="preserve"> </w:t>
+      </w:r>
+      <w:r>
+        <w:rPr>
+          <w:i/>
+          <w:iCs/>
+        </w:rPr>
+        <w:t xml:space="preserve">FollowUpPolicyTest</w:t>
+      </w:r>
+      <w:r>
+        <w:t xml:space="preserve"> </w:t>
+      </w:r>
+      <w:r>
+        <w:t xml:space="preserve">and</w:t>
+      </w:r>
+      <w:r>
+        <w:t xml:space="preserve"> </w:t>
+      </w:r>
+      <w:r>
+        <w:rPr>
+          <w:i/>
+          <w:iCs/>
+        </w:rPr>
+        <w:t xml:space="preserve">FollowUpServiceTest</w:t>
+      </w:r>
+      <w:r>
+        <w:t xml:space="preserve"> </w:t>
+      </w:r>
+      <w:r>
+        <w:t xml:space="preserve">(operations) and</w:t>
+      </w:r>
+      <w:r>
+        <w:t xml:space="preserve"> </w:t>
+      </w:r>
+      <w:r>
+        <w:rPr>
+          <w:i/>
+          <w:iCs/>
+        </w:rPr>
+        <w:t xml:space="preserve">DomainEventEnvelopeTest</w:t>
+      </w:r>
+      <w:r>
+        <w:t xml:space="preserve"> </w:t>
+      </w:r>
+      <w:r>
+        <w:t xml:space="preserve">(notification), the internal no-show route in</w:t>
+      </w:r>
+      <w:r>
+        <w:t xml:space="preserve"> </w:t>
+      </w:r>
+      <w:r>
+        <w:rPr>
+          <w:i/>
+          <w:iCs/>
+        </w:rPr>
+        <w:t xml:space="preserve">BookingServiceTest</w:t>
+      </w:r>
+      <w:r>
+        <w:t xml:space="preserve"> </w:t>
+      </w:r>
+      <w:r>
+        <w:t xml:space="preserve">and</w:t>
+      </w:r>
+      <w:r>
+        <w:t xml:space="preserve"> </w:t>
+      </w:r>
+      <w:r>
+        <w:rPr>
+          <w:i/>
+          <w:iCs/>
+        </w:rPr>
+        <w:t xml:space="preserve">BookingApiWebTest</w:t>
+      </w:r>
+      <w:r>
+        <w:t xml:space="preserve">, and "To close" in</w:t>
+      </w:r>
+      <w:r>
+        <w:t xml:space="preserve"> </w:t>
+      </w:r>
+      <w:r>
+        <w:rPr>
+          <w:i/>
+          <w:iCs/>
+        </w:rPr>
+        <w:t xml:space="preserve">reservations-store.spec.ts</w:t>
+      </w:r>
+      <w:r>
+        <w:t xml:space="preserve">; also, 19 of 19 end-to-end tests, with the gateway session check on. The mobile app has no automated tests: its continuous integration checks the types (</w:t>
+      </w:r>
+      <w:r>
+        <w:rPr>
+          <w:i/>
+          <w:iCs/>
+        </w:rPr>
+        <w:t xml:space="preserve">npx tsc --noEmit</w:t>
+      </w:r>
+      <w:r>
+        <w:t xml:space="preserve">); the 42 functional cases were last run on October 19, 2026 and all passed against the complete system (</w:t>
       </w:r>
       <w:r>
         <w:rPr>
@@ -27897,18 +29900,215 @@
               <w:pStyle w:val="Compact"/>
             </w:pPr>
             <w:r>
-              <w:t xml:space="preserve">Expired token or different JWT_SECRET, issuer, or audience.</w:t>
-            </w:r>
-          </w:p>
-        </w:tc>
-        <w:tc>
-          <w:tcPr/>
-          <w:p>
-            <w:pPr>
-              <w:pStyle w:val="Compact"/>
-            </w:pPr>
-            <w:r>
-              <w:t xml:space="preserve">Log in again; verify the .env file.</w:t>
+              <w:t xml:space="preserve">Expired token, different JWT_SECRET, issuer, or audience, or closed session (logout on another device or disabled account).</w:t>
+            </w:r>
+          </w:p>
+        </w:tc>
+        <w:tc>
+          <w:tcPr/>
+          <w:p>
+            <w:pPr>
+              <w:pStyle w:val="Compact"/>
+            </w:pPr>
+            <w:r>
+              <w:t xml:space="preserve">Log in again; verify the .env file;</w:t>
+            </w:r>
+            <w:r>
+              <w:t xml:space="preserve"> </w:t>
+            </w:r>
+            <w:r>
+              <w:rPr>
+                <w:i/>
+                <w:iCs/>
+              </w:rPr>
+              <w:t xml:space="preserve">GET /api/v1/auth/session</w:t>
+            </w:r>
+            <w:r>
+              <w:t xml:space="preserve"> </w:t>
+            </w:r>
+            <w:r>
+              <w:t xml:space="preserve">with the token tells whether the session is still open.</w:t>
+            </w:r>
+          </w:p>
+        </w:tc>
+      </w:tr>
+      <w:tr>
+        <w:tc>
+          <w:tcPr/>
+          <w:p>
+            <w:pPr>
+              <w:pStyle w:val="Compact"/>
+            </w:pPr>
+            <w:r>
+              <w:t xml:space="preserve">400 RECEIPT_TOO_LARGE when reporting a payment</w:t>
+            </w:r>
+          </w:p>
+        </w:tc>
+        <w:tc>
+          <w:tcPr/>
+          <w:p>
+            <w:pPr>
+              <w:pStyle w:val="Compact"/>
+            </w:pPr>
+            <w:r>
+              <w:t xml:space="preserve">The receipt weighs more than 2 MB (a client without the compression of the web or of the updated app).</w:t>
+            </w:r>
+          </w:p>
+        </w:tc>
+        <w:tc>
+          <w:tcPr/>
+          <w:p>
+            <w:pPr>
+              <w:pStyle w:val="Compact"/>
+            </w:pPr>
+            <w:r>
+              <w:t xml:space="preserve">Upload it from the web or from the updated app, which compress the image.</w:t>
+            </w:r>
+          </w:p>
+        </w:tc>
+      </w:tr>
+      <w:tr>
+        <w:tc>
+          <w:tcPr/>
+          <w:p>
+            <w:pPr>
+              <w:pStyle w:val="Compact"/>
+            </w:pPr>
+            <w:r>
+              <w:t xml:space="preserve">A booking moved by itself to No-show or Cancelled</w:t>
+            </w:r>
+          </w:p>
+        </w:tc>
+        <w:tc>
+          <w:tcPr/>
+          <w:p>
+            <w:pPr>
+              <w:pStyle w:val="Compact"/>
+            </w:pPr>
+            <w:r>
+              <w:t xml:space="preserve">One hour passed after its end and it was scheduled without confirmation (</w:t>
+            </w:r>
+            <w:r>
+              <w:rPr>
+                <w:i/>
+                <w:iCs/>
+              </w:rPr>
+              <w:t xml:space="preserve">ExpiredBookingsJob</w:t>
+            </w:r>
+            <w:r>
+              <w:t xml:space="preserve">) or confirmed without an operator (</w:t>
+            </w:r>
+            <w:r>
+              <w:rPr>
+                <w:i/>
+                <w:iCs/>
+              </w:rPr>
+              <w:t xml:space="preserve">FollowUpJob</w:t>
+            </w:r>
+            <w:r>
+              <w:t xml:space="preserve">).</w:t>
+            </w:r>
+          </w:p>
+        </w:tc>
+        <w:tc>
+          <w:tcPr/>
+          <w:p>
+            <w:pPr>
+              <w:pStyle w:val="Compact"/>
+            </w:pPr>
+            <w:r>
+              <w:t xml:space="preserve">Status and reason of the booking (EXPIRED on the cancelled ones); booking-service log (</w:t>
+            </w:r>
+            <w:r>
+              <w:rPr>
+                <w:i/>
+                <w:iCs/>
+              </w:rPr>
+              <w:t xml:space="preserve">Closed N expired bookings</w:t>
+            </w:r>
+            <w:r>
+              <w:t xml:space="preserve">) and operations-service log (</w:t>
+            </w:r>
+            <w:r>
+              <w:rPr>
+                <w:i/>
+                <w:iCs/>
+              </w:rPr>
+              <w:t xml:space="preserve">Follow-up: N booking(s) closed as not attended</w:t>
+            </w:r>
+            <w:r>
+              <w:t xml:space="preserve">).</w:t>
+            </w:r>
+          </w:p>
+        </w:tc>
+      </w:tr>
+      <w:tr>
+        <w:tc>
+          <w:tcPr/>
+          <w:p>
+            <w:pPr>
+              <w:pStyle w:val="Compact"/>
+            </w:pPr>
+            <w:r>
+              <w:t xml:space="preserve">A booking appears in "To close"</w:t>
+            </w:r>
+          </w:p>
+        </w:tc>
+        <w:tc>
+          <w:tcPr/>
+          <w:p>
+            <w:pPr>
+              <w:pStyle w:val="Compact"/>
+            </w:pPr>
+            <w:r>
+              <w:t xml:space="preserve">It had an operator and nobody started it, or it was started and nobody finished it.</w:t>
+            </w:r>
+          </w:p>
+        </w:tc>
+        <w:tc>
+          <w:tcPr/>
+          <w:p>
+            <w:pPr>
+              <w:pStyle w:val="Compact"/>
+            </w:pPr>
+            <w:r>
+              <w:rPr>
+                <w:i/>
+                <w:iCs/>
+              </w:rPr>
+              <w:t xml:space="preserve">GET /api/v1/admin/assignments/to-close</w:t>
+            </w:r>
+            <w:r>
+              <w:t xml:space="preserve">; status of its</w:t>
+            </w:r>
+            <w:r>
+              <w:t xml:space="preserve"> </w:t>
+            </w:r>
+            <w:r>
+              <w:rPr>
+                <w:i/>
+                <w:iCs/>
+              </w:rPr>
+              <w:t xml:space="preserve">service_execution</w:t>
+            </w:r>
+            <w:r>
+              <w:t xml:space="preserve"> </w:t>
+            </w:r>
+            <w:r>
+              <w:t xml:space="preserve">rows and</w:t>
+            </w:r>
+            <w:r>
+              <w:t xml:space="preserve"> </w:t>
+            </w:r>
+            <w:r>
+              <w:rPr>
+                <w:i/>
+                <w:iCs/>
+              </w:rPr>
+              <w:t xml:space="preserve">follow_up_notice_at</w:t>
+            </w:r>
+            <w:r>
+              <w:t xml:space="preserve">.</w:t>
             </w:r>
           </w:p>
         </w:tc>
@@ -28502,7 +30702,7 @@
         <w:t xml:space="preserve"> </w:t>
       </w:r>
       <w:r>
-        <w:t xml:space="preserve">of the documentation (Vehicle Washing Development Team, 2026a), reviewed against the code on October 16, 2026. Between October 8 and 16, 2026, TD-001, TD-002, TD-003, TD-009, TD-013, TD-014, TD-015, TD-016, TD-017, TD-018, TD-020, and TD-021 were resolved; their closure is recorded in the corrective, preventive, and improvement actions document. TD-006 was also closed on October 19, 2026, with continuous integration in GitHub Actions.</w:t>
+        <w:t xml:space="preserve">of the documentation (Vehicle Washing Development Team, 2026a), reviewed against the code on October 16, 2026. Between October 8 and 16, 2026, TD-001, TD-002, TD-003, TD-009, TD-013, TD-014, TD-015, TD-016, TD-017, TD-018, TD-020, and TD-021 were resolved; their closure is recorded in the corrective, preventive, and improvement actions document. TD-006 was also closed on October 19, 2026, with continuous integration in GitHub Actions. On October 21, 2026, TD-024 (tokens of closed sessions), TD-025 (bookings nobody closed and the count of bookings without an operator), and TD-026 (an operator assigned twice) were closed; on the night of the same day the rule of TD-025 was adjusted so that a booking with an operator does not end as No-show unless the administrator decides it; and TD-027 (tests of the administrator screens) was resolved for bookings, management, and reports.</w:t>
       </w:r>
     </w:p>
     <w:bookmarkEnd w:id="106"/>
@@ -28662,7 +30862,7 @@
               <w:pStyle w:val="Compact"/>
             </w:pPr>
             <w:r>
-              <w:t xml:space="preserve">Single external entry point that routes the requests; it does not validate tokens in this system.</w:t>
+              <w:t xml:space="preserve">Single external entry point that routes the requests; in this system it does not check the token signature, but since October 21, 2026 it cuts the tokens of closed sessions.</w:t>
             </w:r>
           </w:p>
         </w:tc>
@@ -29794,7 +31994,7 @@
               <w:pStyle w:val="Compact"/>
             </w:pPr>
             <w:r>
-              <w:t xml:space="preserve">Gateway documentation and ADR-006: it does not validate tokens; each service does.</w:t>
+              <w:t xml:space="preserve">Gateway documentation and ADR-006: it does not check the token signature; each service does. Since 2026-10-21 it does cut the tokens of closed sessions, asking security-service.</w:t>
             </w:r>
           </w:p>
         </w:tc>
@@ -29877,6 +32077,86 @@
               <w:pStyle w:val="Compact"/>
             </w:pPr>
             <w:r>
+              <w:t xml:space="preserve">Close of bookings nobody recorded</w:t>
+            </w:r>
+          </w:p>
+        </w:tc>
+        <w:tc>
+          <w:tcPr/>
+          <w:p>
+            <w:pPr>
+              <w:pStyle w:val="Compact"/>
+            </w:pPr>
+            <w:r>
+              <w:t xml:space="preserve">Version 4.5 said that every CONFIRMED booking nobody started became NO_SHOW on its own one hour after its end.</w:t>
+            </w:r>
+          </w:p>
+        </w:tc>
+        <w:tc>
+          <w:tcPr/>
+          <w:p>
+            <w:pPr>
+              <w:pStyle w:val="Compact"/>
+            </w:pPr>
+            <w:r>
+              <w:t xml:space="preserve">Code of the night of 2026-10-21: only a CONFIRMED booking without an operator changes on its own; one with an operator stays "to close" for the administrator (</w:t>
+            </w:r>
+            <w:r>
+              <w:rPr>
+                <w:i/>
+                <w:iCs/>
+              </w:rPr>
+              <w:t xml:space="preserve">FollowUpPolicy</w:t>
+            </w:r>
+            <w:r>
+              <w:t xml:space="preserve">). Resolved.</w:t>
+            </w:r>
+          </w:p>
+        </w:tc>
+      </w:tr>
+      <w:tr>
+        <w:tc>
+          <w:tcPr/>
+          <w:p>
+            <w:pPr>
+              <w:pStyle w:val="Compact"/>
+            </w:pPr>
+            <w:r>
+              <w:t xml:space="preserve">Token revocation</w:t>
+            </w:r>
+          </w:p>
+        </w:tc>
+        <w:tc>
+          <w:tcPr/>
+          <w:p>
+            <w:pPr>
+              <w:pStyle w:val="Compact"/>
+            </w:pPr>
+            <w:r>
+              <w:t xml:space="preserve">Up to version 4.4 a token kept working until its expiration after logout.</w:t>
+            </w:r>
+          </w:p>
+        </w:tc>
+        <w:tc>
+          <w:tcPr/>
+          <w:p>
+            <w:pPr>
+              <w:pStyle w:val="Compact"/>
+            </w:pPr>
+            <w:r>
+              <w:t xml:space="preserve">Code of 2026-10-21: the token of a closed session stops working in security-service and in the gateway (TD-024). Resolved.</w:t>
+            </w:r>
+          </w:p>
+        </w:tc>
+      </w:tr>
+      <w:tr>
+        <w:tc>
+          <w:tcPr/>
+          <w:p>
+            <w:pPr>
+              <w:pStyle w:val="Compact"/>
+            </w:pPr>
+            <w:r>
               <w:t xml:space="preserve">Audit trail</w:t>
             </w:r>
           </w:p>
@@ -30215,6 +32495,51 @@
             </w:pPr>
             <w:r>
               <w:t xml:space="preserve">Code: complete module under /admin.</w:t>
+            </w:r>
+          </w:p>
+        </w:tc>
+      </w:tr>
+      <w:tr>
+        <w:tc>
+          <w:tcPr/>
+          <w:p>
+            <w:pPr>
+              <w:pStyle w:val="Compact"/>
+            </w:pPr>
+            <w:r>
+              <w:t xml:space="preserve">README of lavarapido-api-gateway</w:t>
+            </w:r>
+          </w:p>
+        </w:tc>
+        <w:tc>
+          <w:tcPr/>
+          <w:p>
+            <w:pPr>
+              <w:pStyle w:val="Compact"/>
+            </w:pPr>
+            <w:r>
+              <w:t xml:space="preserve">It said that the gateway did not answer CORS and did not list the routes of operations-service and payment-service.</w:t>
+            </w:r>
+          </w:p>
+        </w:tc>
+        <w:tc>
+          <w:tcPr/>
+          <w:p>
+            <w:pPr>
+              <w:pStyle w:val="Compact"/>
+            </w:pPr>
+            <w:r>
+              <w:t xml:space="preserve">Fixed on 2026-10-21: it answers CORS (</w:t>
+            </w:r>
+            <w:r>
+              <w:rPr>
+                <w:i/>
+                <w:iCs/>
+              </w:rPr>
+              <w:t xml:space="preserve">CorsConfig</w:t>
+            </w:r>
+            <w:r>
+              <w:t xml:space="preserve">), cuts the tokens of closed sessions, and lists every route. Resolved.</w:t>
             </w:r>
           </w:p>
         </w:tc>

</xml_diff>

<commit_message>
docs(manuals): regenerate the PDF and Word so tall figures fit on one page
</commit_message>
<xml_diff>
--- a/09_MANUALES/EN/WORD/09_Technical_Manual.docx
+++ b/09_MANUALES/EN/WORD/09_Technical_Manual.docx
@@ -3318,7 +3318,7 @@
               <a:graphicData uri="http://schemas.openxmlformats.org/drawingml/2006/picture">
                 <pic:pic>
                   <pic:nvPicPr>
-                    <pic:cNvPr descr="C:/Users/MERARI~1/AppData/Local/Temp/claude/C--Users-MERARI-URBANO-Lavado-Vehicular/fbac9d65-987c-4365-8841-0c86e8c3ca54/scratchpad/mermaid/EN-1.png" id="22" name="Picture"/>
+                    <pic:cNvPr descr="C:/Users/MERARI~1/AppData/Local/Temp/claude/C--Users-MERARI-URBANO-Lavado-Vehicular/fbac9d65-987c-4365-8841-0c86e8c3ca54/scratchpad/mermaid/technical_manual_md-1.png" id="22" name="Picture"/>
                     <pic:cNvPicPr>
                       <a:picLocks noChangeArrowheads="1" noChangeAspect="1"/>
                     </pic:cNvPicPr>
@@ -23553,7 +23553,7 @@
               <a:graphicData uri="http://schemas.openxmlformats.org/drawingml/2006/picture">
                 <pic:pic>
                   <pic:nvPicPr>
-                    <pic:cNvPr descr="C:/Users/MERARI~1/AppData/Local/Temp/claude/C--Users-MERARI-URBANO-Lavado-Vehicular/fbac9d65-987c-4365-8841-0c86e8c3ca54/scratchpad/mermaid/EN-2.png" id="67" name="Picture"/>
+                    <pic:cNvPr descr="C:/Users/MERARI~1/AppData/Local/Temp/claude/C--Users-MERARI-URBANO-Lavado-Vehicular/fbac9d65-987c-4365-8841-0c86e8c3ca54/scratchpad/mermaid/technical_manual_md-2.png" id="67" name="Picture"/>
                     <pic:cNvPicPr>
                       <a:picLocks noChangeArrowheads="1" noChangeAspect="1"/>
                     </pic:cNvPicPr>

</xml_diff>

<commit_message>
docs(technical-manual): regenerate the PDF and Word
</commit_message>
<xml_diff>
--- a/09_MANUALES/EN/WORD/09_Technical_Manual.docx
+++ b/09_MANUALES/EN/WORD/09_Technical_Manual.docx
@@ -2,7 +2,7 @@
 <file path=word/document.xml><?xml version="1.0" encoding="utf-8"?>
 <w:document xmlns:w="http://schemas.openxmlformats.org/wordprocessingml/2006/main" xmlns:m="http://schemas.openxmlformats.org/officeDocument/2006/math" xmlns:r="http://schemas.openxmlformats.org/officeDocument/2006/relationships" xmlns:o="urn:schemas-microsoft-com:office:office" xmlns:v="urn:schemas-microsoft-com:vml" xmlns:w10="urn:schemas-microsoft-com:office:word" xmlns:a="http://schemas.openxmlformats.org/drawingml/2006/main" xmlns:pic="http://schemas.openxmlformats.org/drawingml/2006/picture" xmlns:wp="http://schemas.openxmlformats.org/drawingml/2006/wordprocessingDrawing">
   <w:body>
-    <w:bookmarkStart w:id="117" w:name="technical-manual"/>
+    <w:bookmarkStart w:id="111" w:name="technical-manual"/>
     <w:p>
       <w:pPr>
         <w:pStyle w:val="Heading1"/>
@@ -64,7 +64,7 @@
         <w:pStyle w:val="BodyText"/>
       </w:pPr>
       <w:r>
-        <w:t xml:space="preserve">October 26, 2026</w:t>
+        <w:t xml:space="preserve">October 27, 2026</w:t>
       </w:r>
     </w:p>
     <w:p>
@@ -72,7 +72,7 @@
         <w:pStyle w:val="BodyText"/>
       </w:pPr>
       <w:r>
-        <w:t xml:space="preserve">Manual Type: Technical Manual (Developers and Software Architects) · Version 4.12</w:t>
+        <w:t xml:space="preserve">Manual Type: Technical Manual (Developers and Software Architects) · Version 4.13</w:t>
       </w:r>
     </w:p>
     <w:bookmarkStart w:id="9" w:name="version-control"/>
@@ -1561,6 +1561,161 @@
           </w:p>
         </w:tc>
       </w:tr>
+      <w:tr>
+        <w:tc>
+          <w:tcPr/>
+          <w:p>
+            <w:pPr>
+              <w:pStyle w:val="Compact"/>
+            </w:pPr>
+            <w:r>
+              <w:t xml:space="preserve">4.13</w:t>
+            </w:r>
+          </w:p>
+        </w:tc>
+        <w:tc>
+          <w:tcPr/>
+          <w:p>
+            <w:pPr>
+              <w:pStyle w:val="Compact"/>
+            </w:pPr>
+            <w:r>
+              <w:t xml:space="preserve">2026-10-27</w:t>
+            </w:r>
+          </w:p>
+        </w:tc>
+        <w:tc>
+          <w:tcPr/>
+          <w:p>
+            <w:pPr>
+              <w:pStyle w:val="Compact"/>
+            </w:pPr>
+            <w:r>
+              <w:t xml:space="preserve">Review against</w:t>
+            </w:r>
+            <w:r>
+              <w:t xml:space="preserve"> </w:t>
+            </w:r>
+            <w:r>
+              <w:rPr>
+                <w:i/>
+                <w:iCs/>
+              </w:rPr>
+              <w:t xml:space="preserve">main</w:t>
+            </w:r>
+            <w:r>
+              <w:t xml:space="preserve"> </w:t>
+            </w:r>
+            <w:r>
+              <w:t xml:space="preserve">of October 27, 2026: versions</w:t>
+            </w:r>
+            <w:r>
+              <w:t xml:space="preserve"> </w:t>
+            </w:r>
+            <w:r>
+              <w:rPr>
+                <w:i/>
+                <w:iCs/>
+              </w:rPr>
+              <w:t xml:space="preserve">v1.1.1</w:t>
+            </w:r>
+            <w:r>
+              <w:t xml:space="preserve"> </w:t>
+            </w:r>
+            <w:r>
+              <w:t xml:space="preserve">and</w:t>
+            </w:r>
+            <w:r>
+              <w:t xml:space="preserve"> </w:t>
+            </w:r>
+            <w:r>
+              <w:rPr>
+                <w:i/>
+                <w:iCs/>
+              </w:rPr>
+              <w:t xml:space="preserve">v1.1.2</w:t>
+            </w:r>
+            <w:r>
+              <w:t xml:space="preserve"> </w:t>
+            </w:r>
+            <w:r>
+              <w:t xml:space="preserve">and</w:t>
+            </w:r>
+            <w:r>
+              <w:t xml:space="preserve"> </w:t>
+            </w:r>
+            <w:r>
+              <w:rPr>
+                <w:i/>
+                <w:iCs/>
+              </w:rPr>
+              <w:t xml:space="preserve">main</w:t>
+            </w:r>
+            <w:r>
+              <w:t xml:space="preserve"> </w:t>
+            </w:r>
+            <w:r>
+              <w:t xml:space="preserve">protected in the 10 repositories (technology table and 15.1); continuous deployment active and the runs of October 27 (15.4); 58 tables and</w:t>
+            </w:r>
+            <w:r>
+              <w:t xml:space="preserve"> </w:t>
+            </w:r>
+            <w:r>
+              <w:rPr>
+                <w:i/>
+                <w:iCs/>
+              </w:rPr>
+              <w:t xml:space="preserve">notification</w:t>
+            </w:r>
+            <w:r>
+              <w:t xml:space="preserve"> </w:t>
+            </w:r>
+            <w:r>
+              <w:t xml:space="preserve">with 7 (components, data model, and Annex); tests of the</w:t>
+            </w:r>
+            <w:r>
+              <w:t xml:space="preserve"> </w:t>
+            </w:r>
+            <w:r>
+              <w:rPr>
+                <w:i/>
+                <w:iCs/>
+              </w:rPr>
+              <w:t xml:space="preserve">main</w:t>
+            </w:r>
+            <w:r>
+              <w:t xml:space="preserve"> </w:t>
+            </w:r>
+            <w:r>
+              <w:t xml:space="preserve">CI, 1,337 with payment's 17 integration tests, and 19 of 19 end-to-end (16.5); the booking life cycle (12.x) and the diagnosis of bookings closed by themselves (16.6) no longer cite</w:t>
+            </w:r>
+            <w:r>
+              <w:t xml:space="preserve"> </w:t>
+            </w:r>
+            <w:r>
+              <w:rPr>
+                <w:i/>
+                <w:iCs/>
+              </w:rPr>
+              <w:t xml:space="preserve">ExpiredBookingsJob</w:t>
+            </w:r>
+            <w:r>
+              <w:t xml:space="preserve">.</w:t>
+            </w:r>
+          </w:p>
+        </w:tc>
+        <w:tc>
+          <w:tcPr/>
+          <w:p>
+            <w:pPr>
+              <w:pStyle w:val="Compact"/>
+            </w:pPr>
+            <w:r>
+              <w:t xml:space="preserve">Development team</w:t>
+            </w:r>
+          </w:p>
+        </w:tc>
+      </w:tr>
     </w:tbl>
     <w:p>
       <w:pPr>
@@ -3236,7 +3391,7 @@
     </w:p>
     <w:bookmarkEnd w:id="17"/>
     <w:bookmarkEnd w:id="18"/>
-    <w:bookmarkStart w:id="25" w:name="X127d91a012b61252ea4449a5f8c9849e5fd60bc"/>
+    <w:bookmarkStart w:id="22" w:name="X127d91a012b61252ea4449a5f8c9849e5fd60bc"/>
     <w:p>
       <w:pPr>
         <w:pStyle w:val="Heading2"/>
@@ -3263,7 +3418,7 @@
       </w:r>
     </w:p>
     <w:bookmarkEnd w:id="19"/>
-    <w:bookmarkStart w:id="23" w:name="X1da46e050695e862cc305c87835f8f2f877c998"/>
+    <w:bookmarkStart w:id="20" w:name="X1da46e050695e862cc305c87835f8f2f877c998"/>
     <w:p>
       <w:pPr>
         <w:pStyle w:val="Heading3"/>
@@ -3309,46 +3464,7 @@
         <w:pStyle w:val="BodyText"/>
       </w:pPr>
       <w:r>
-        <w:drawing>
-          <wp:inline>
-            <wp:extent cx="5334000" cy="7046148"/>
-            <wp:effectExtent b="0" l="0" r="0" t="0"/>
-            <wp:docPr descr="Diagrama" title="" id="21" name="Picture"/>
-            <a:graphic>
-              <a:graphicData uri="http://schemas.openxmlformats.org/drawingml/2006/picture">
-                <pic:pic>
-                  <pic:nvPicPr>
-                    <pic:cNvPr descr="C:/Users/MERARI~1/AppData/Local/Temp/claude/C--Users-MERARI-URBANO-Lavado-Vehicular/fbac9d65-987c-4365-8841-0c86e8c3ca54/scratchpad/mermaid/technical_manual_md-1.png" id="22" name="Picture"/>
-                    <pic:cNvPicPr>
-                      <a:picLocks noChangeArrowheads="1" noChangeAspect="1"/>
-                    </pic:cNvPicPr>
-                  </pic:nvPicPr>
-                  <pic:blipFill>
-                    <a:blip r:embed="rId20"/>
-                    <a:stretch>
-                      <a:fillRect/>
-                    </a:stretch>
-                  </pic:blipFill>
-                  <pic:spPr bwMode="auto">
-                    <a:xfrm>
-                      <a:off x="0" y="0"/>
-                      <a:ext cx="5334000" cy="7046148"/>
-                    </a:xfrm>
-                    <a:prstGeom prst="rect">
-                      <a:avLst/>
-                    </a:prstGeom>
-                    <a:noFill/>
-                    <a:ln w="9525">
-                      <a:noFill/>
-                      <a:headEnd/>
-                      <a:tailEnd/>
-                    </a:ln>
-                  </pic:spPr>
-                </pic:pic>
-              </a:graphicData>
-            </a:graphic>
-          </wp:inline>
-        </w:drawing>
+        <w:t xml:space="preserve">![Diagrama](C:/Users/JUAN CAMILO/Documents/PROYECTO FINAL_LAVADO VEICULAR/lavarapido-docs/_generador/work/mermaid/technical_manual_md-1.png)</w:t>
       </w:r>
     </w:p>
     <w:p>
@@ -3986,7 +4102,7 @@
               <w:t xml:space="preserve">LavaRapido</w:t>
             </w:r>
             <w:r>
-              <w:t xml:space="preserve">, nine schemas, 57 tables.</w:t>
+              <w:t xml:space="preserve">, nine schemas, 58 tables.</w:t>
             </w:r>
           </w:p>
         </w:tc>
@@ -4128,8 +4244,8 @@
         <w:t xml:space="preserve">. The gateway is infrastructure and is not counted as a domain service.</w:t>
       </w:r>
     </w:p>
-    <w:bookmarkEnd w:id="23"/>
-    <w:bookmarkStart w:id="24" w:name="X54ead927aaa3a53e6ac6063f5b6165b53eb6831"/>
+    <w:bookmarkEnd w:id="20"/>
+    <w:bookmarkStart w:id="21" w:name="X54ead927aaa3a53e6ac6063f5b6165b53eb6831"/>
     <w:p>
       <w:pPr>
         <w:pStyle w:val="Heading3"/>
@@ -4211,9 +4327,9 @@
         <w:t xml:space="preserve">The runtime environment is local with Docker.</w:t>
       </w:r>
     </w:p>
-    <w:bookmarkEnd w:id="24"/>
-    <w:bookmarkEnd w:id="25"/>
-    <w:bookmarkStart w:id="26" w:name="X63ef78e4d11d3eac8e2b023fd6af287e808ecaf"/>
+    <w:bookmarkEnd w:id="21"/>
+    <w:bookmarkEnd w:id="22"/>
+    <w:bookmarkStart w:id="23" w:name="X63ef78e4d11d3eac8e2b023fd6af287e808ecaf"/>
     <w:p>
       <w:pPr>
         <w:pStyle w:val="Heading2"/>
@@ -4941,7 +5057,7 @@
               <w:t xml:space="preserve"> </w:t>
             </w:r>
             <w:r>
-              <w:t xml:space="preserve">in the 10 repositories on October 26, and</w:t>
+              <w:t xml:space="preserve">in the 10 repositories on October 26,</w:t>
             </w:r>
             <w:r>
               <w:t xml:space="preserve"> </w:t>
@@ -4957,7 +5073,55 @@
               <w:t xml:space="preserve"> </w:t>
             </w:r>
             <w:r>
-              <w:t xml:space="preserve">in the web, the mobile app, payment-service, and infra that same day),</w:t>
+              <w:t xml:space="preserve">in the web, the mobile app, payment-service, and infra that same day, and on October 27</w:t>
+            </w:r>
+            <w:r>
+              <w:t xml:space="preserve"> </w:t>
+            </w:r>
+            <w:r>
+              <w:rPr>
+                <w:i/>
+                <w:iCs/>
+              </w:rPr>
+              <w:t xml:space="preserve">v1.1.1</w:t>
+            </w:r>
+            <w:r>
+              <w:t xml:space="preserve"> </w:t>
+            </w:r>
+            <w:r>
+              <w:t xml:space="preserve">in customer and booking and</w:t>
+            </w:r>
+            <w:r>
+              <w:t xml:space="preserve"> </w:t>
+            </w:r>
+            <w:r>
+              <w:rPr>
+                <w:i/>
+                <w:iCs/>
+              </w:rPr>
+              <w:t xml:space="preserve">v1.1.2</w:t>
+            </w:r>
+            <w:r>
+              <w:t xml:space="preserve"> </w:t>
+            </w:r>
+            <w:r>
+              <w:t xml:space="preserve">in the web, the mobile app, payment-service, and infra;</w:t>
+            </w:r>
+            <w:r>
+              <w:t xml:space="preserve"> </w:t>
+            </w:r>
+            <w:r>
+              <w:rPr>
+                <w:i/>
+                <w:iCs/>
+              </w:rPr>
+              <w:t xml:space="preserve">main</w:t>
+            </w:r>
+            <w:r>
+              <w:t xml:space="preserve"> </w:t>
+            </w:r>
+            <w:r>
+              <w:t xml:space="preserve">protected in all 10),</w:t>
             </w:r>
             <w:r>
               <w:t xml:space="preserve"> </w:t>
@@ -5081,7 +5245,23 @@
               <w:t xml:space="preserve"> </w:t>
             </w:r>
             <w:r>
-              <w:t xml:space="preserve">also has the manual "Desplegar en Azure" workflow (not run yet) and the continuous deployment prepared in an unmerged branch (section 15.4)</w:t>
+              <w:t xml:space="preserve">also has the "Desplegar en Azure" workflow, which since October 26, 2026 runs on its own on every approved merge into</w:t>
+            </w:r>
+            <w:r>
+              <w:t xml:space="preserve"> </w:t>
+            </w:r>
+            <w:r>
+              <w:rPr>
+                <w:i/>
+                <w:iCs/>
+              </w:rPr>
+              <w:t xml:space="preserve">main</w:t>
+            </w:r>
+            <w:r>
+              <w:t xml:space="preserve"> </w:t>
+            </w:r>
+            <w:r>
+              <w:t xml:space="preserve">(continuous deployment active, section 15.4)</w:t>
             </w:r>
           </w:p>
         </w:tc>
@@ -5198,8 +5378,8 @@
         <w:t xml:space="preserve">of each repository.</w:t>
       </w:r>
     </w:p>
-    <w:bookmarkEnd w:id="26"/>
-    <w:bookmarkStart w:id="39" w:name="X50d37b585c6338653c7f2b86f9da20dc6f7a5ef"/>
+    <w:bookmarkEnd w:id="23"/>
+    <w:bookmarkStart w:id="36" w:name="X50d37b585c6338653c7f2b86f9da20dc6f7a5ef"/>
     <w:p>
       <w:pPr>
         <w:pStyle w:val="Heading2"/>
@@ -5208,7 +5388,7 @@
         <w:t xml:space="preserve">9. System Architecture</w:t>
       </w:r>
     </w:p>
-    <w:bookmarkStart w:id="27" w:name="Xc25612d8175378c89bfa922d6720aa82c342f65"/>
+    <w:bookmarkStart w:id="24" w:name="Xc25612d8175378c89bfa922d6720aa82c342f65"/>
     <w:p>
       <w:pPr>
         <w:pStyle w:val="Heading3"/>
@@ -5570,18 +5750,28 @@
               <w:pStyle w:val="Compact"/>
             </w:pPr>
             <w:r>
-              <w:t xml:space="preserve">6</w:t>
-            </w:r>
-          </w:p>
-        </w:tc>
-        <w:tc>
-          <w:tcPr/>
-          <w:p>
-            <w:pPr>
-              <w:pStyle w:val="Compact"/>
-            </w:pPr>
-            <w:r>
-              <w:t xml:space="preserve">Medium: inbox, idempotent consumption, push, email, reminders, and booking tracking for staff notices.</w:t>
+              <w:t xml:space="preserve">7</w:t>
+            </w:r>
+          </w:p>
+        </w:tc>
+        <w:tc>
+          <w:tcPr/>
+          <w:p>
+            <w:pPr>
+              <w:pStyle w:val="Compact"/>
+            </w:pPr>
+            <w:r>
+              <w:t xml:space="preserve">Medium: inbox, idempotent consumption, push, email with pending deliveries and retries (</w:t>
+            </w:r>
+            <w:r>
+              <w:rPr>
+                <w:i/>
+                <w:iCs/>
+              </w:rPr>
+              <w:t xml:space="preserve">pending_delivery</w:t>
+            </w:r>
+            <w:r>
+              <w:t xml:space="preserve">), reminders, and booking tracking for staff notices.</w:t>
             </w:r>
           </w:p>
         </w:tc>
@@ -5602,27 +5792,24 @@
         <w:t xml:space="preserve"> </w:t>
       </w:r>
       <w:r>
-        <w:t xml:space="preserve">Total: 57 tables, checked with a query to</w:t>
-      </w:r>
-      <w:r>
-        <w:t xml:space="preserve"> </w:t>
-      </w:r>
-      <w:r>
-        <w:rPr>
-          <w:i/>
-          <w:iCs/>
-        </w:rPr>
-        <w:t xml:space="preserve">sys.tables</w:t>
-      </w:r>
-      <w:r>
-        <w:t xml:space="preserve"> </w:t>
-      </w:r>
-      <w:r>
-        <w:t xml:space="preserve">on October 16, 2026. Source: changelogs of each service.</w:t>
-      </w:r>
-    </w:p>
-    <w:bookmarkEnd w:id="27"/>
-    <w:bookmarkStart w:id="28" w:name="X09d0d99804d0147631cebacb06b53f6095f17a0"/>
+        <w:t xml:space="preserve">Total: 58 tables, counted in the real database on October 27, 2026 (on October 16 there were 57; the one added is</w:t>
+      </w:r>
+      <w:r>
+        <w:t xml:space="preserve"> </w:t>
+      </w:r>
+      <w:r>
+        <w:rPr>
+          <w:i/>
+          <w:iCs/>
+        </w:rPr>
+        <w:t xml:space="preserve">notification.pending_delivery</w:t>
+      </w:r>
+      <w:r>
+        <w:t xml:space="preserve">, from migration 047). Source: changelogs of each service.</w:t>
+      </w:r>
+    </w:p>
+    <w:bookmarkEnd w:id="24"/>
+    <w:bookmarkStart w:id="25" w:name="X09d0d99804d0147631cebacb06b53f6095f17a0"/>
     <w:p>
       <w:pPr>
         <w:pStyle w:val="Heading3"/>
@@ -6177,8 +6364,8 @@
         <w:t xml:space="preserve">The addresses are configured with ROUTE_SECURITY_URL, ROUTE_CUSTOMER_URL, ROUTE_BOOKING_URL, ROUTE_OPERATIONS_URL, ROUTE_PAYMENT_URL, and ROUTE_NOTIFICATION_URL; the compose file defines all of them with the container names.</w:t>
       </w:r>
     </w:p>
-    <w:bookmarkEnd w:id="28"/>
-    <w:bookmarkStart w:id="29" w:name="X68ad04aa975a76b3d21757019388c0cf736e1d6"/>
+    <w:bookmarkEnd w:id="25"/>
+    <w:bookmarkStart w:id="26" w:name="X68ad04aa975a76b3d21757019388c0cf736e1d6"/>
     <w:p>
       <w:pPr>
         <w:pStyle w:val="Heading3"/>
@@ -7814,8 +8001,8 @@
         <w:t xml:space="preserve">.</w:t>
       </w:r>
     </w:p>
-    <w:bookmarkEnd w:id="29"/>
-    <w:bookmarkStart w:id="32" w:name="X3f7f3f0ccdce581cdef289cf0895a1506722c84"/>
+    <w:bookmarkEnd w:id="26"/>
+    <w:bookmarkStart w:id="29" w:name="X3f7f3f0ccdce581cdef289cf0895a1506722c84"/>
     <w:p>
       <w:pPr>
         <w:pStyle w:val="Heading3"/>
@@ -7824,7 +8011,7 @@
         <w:t xml:space="preserve">9.4 Communication Between Components</w:t>
       </w:r>
     </w:p>
-    <w:bookmarkStart w:id="30" w:name="X6d5895b526edb7d93da9c75d0020b0522ba9dcc"/>
+    <w:bookmarkStart w:id="27" w:name="X6d5895b526edb7d93da9c75d0020b0522ba9dcc"/>
     <w:p>
       <w:pPr>
         <w:pStyle w:val="Heading4"/>
@@ -8294,8 +8481,8 @@
         <w:t xml:space="preserve">If the target does not answer, the caller responds 503 with a stable code (CUSTOMER_SERVICE_UNAVAILABLE or BOOKING_SERVICE_UNAVAILABLE). Default timeouts: 3 s (5 s in payment-service).</w:t>
       </w:r>
     </w:p>
-    <w:bookmarkEnd w:id="30"/>
-    <w:bookmarkStart w:id="31" w:name="X62e0f9f52f08ec909a7dc029c8f00192d34cf14"/>
+    <w:bookmarkEnd w:id="27"/>
+    <w:bookmarkStart w:id="28" w:name="X62e0f9f52f08ec909a7dc029c8f00192d34cf14"/>
     <w:p>
       <w:pPr>
         <w:pStyle w:val="Heading4"/>
@@ -8325,9 +8512,9 @@
         <w:t xml:space="preserve">; otherwise they are written in the log. The catalog of events is in section 13.4.</w:t>
       </w:r>
     </w:p>
-    <w:bookmarkEnd w:id="31"/>
-    <w:bookmarkEnd w:id="32"/>
-    <w:bookmarkStart w:id="38" w:name="X4479ba26460b7aeffc05dab8f25968a8e0498fc"/>
+    <w:bookmarkEnd w:id="28"/>
+    <w:bookmarkEnd w:id="29"/>
+    <w:bookmarkStart w:id="35" w:name="X4479ba26460b7aeffc05dab8f25968a8e0498fc"/>
     <w:p>
       <w:pPr>
         <w:pStyle w:val="Heading3"/>
@@ -8336,7 +8523,7 @@
         <w:t xml:space="preserve">9.5 Cross-Cutting Concerns</w:t>
       </w:r>
     </w:p>
-    <w:bookmarkStart w:id="33" w:name="Xcf02f442a8c3f4b3c2de60bd54175ba6df1be0f"/>
+    <w:bookmarkStart w:id="30" w:name="Xcf02f442a8c3f4b3c2de60bd54175ba6df1be0f"/>
     <w:p>
       <w:pPr>
         <w:pStyle w:val="Heading4"/>
@@ -8548,8 +8735,8 @@
         <w:t xml:space="preserve">: the changelogs reviewed do not create audit triggers and the services do not set the session context. It is recorded as a discrepancy (Annex B) and as action ACO-04 of the corrective, preventive, and improvement actions document.</w:t>
       </w:r>
     </w:p>
-    <w:bookmarkEnd w:id="33"/>
-    <w:bookmarkStart w:id="34" w:name="Xbbd0eee338115bb13574ffbd16be4e8c7e4e916"/>
+    <w:bookmarkEnd w:id="30"/>
+    <w:bookmarkStart w:id="31" w:name="Xbbd0eee338115bb13574ffbd16be4e8c7e4e916"/>
     <w:p>
       <w:pPr>
         <w:pStyle w:val="Heading4"/>
@@ -8685,8 +8872,8 @@
         <w:t xml:space="preserve">in manual and automatic assignment (since October 21, 2026), waiting at most 10 seconds. Each use case opens a local transaction that only writes the schemas of its own service; there are no distributed transactions.</w:t>
       </w:r>
     </w:p>
-    <w:bookmarkEnd w:id="34"/>
-    <w:bookmarkStart w:id="35" w:name="X4f847c82c4a22b6c448c8d01f719977d2be7caa"/>
+    <w:bookmarkEnd w:id="31"/>
+    <w:bookmarkStart w:id="32" w:name="X4f847c82c4a22b6c448c8d01f719977d2be7caa"/>
     <w:p>
       <w:pPr>
         <w:pStyle w:val="Heading4"/>
@@ -9138,111 +9325,111 @@
         <w:t xml:space="preserve">Codes taken from the exception handlers of the services and the translation file of the web application.</w:t>
       </w:r>
     </w:p>
+    <w:bookmarkEnd w:id="32"/>
+    <w:bookmarkStart w:id="33" w:name="X49a01f3f8bd327901e97fb12071cfefd72cc6a1"/>
+    <w:p>
+      <w:pPr>
+        <w:pStyle w:val="Heading4"/>
+      </w:pPr>
+      <w:r>
+        <w:t xml:space="preserve">9.5.4 Time and Language</w:t>
+      </w:r>
+    </w:p>
+    <w:p>
+      <w:pPr>
+        <w:pStyle w:val="FirstParagraph"/>
+      </w:pPr>
+      <w:r>
+        <w:t xml:space="preserve">All timestamps are stored in UTC (</w:t>
+      </w:r>
+      <w:r>
+        <w:rPr>
+          <w:i/>
+          <w:iCs/>
+        </w:rPr>
+        <w:t xml:space="preserve">DATETIME2(3)</w:t>
+      </w:r>
+      <w:r>
+        <w:t xml:space="preserve">,</w:t>
+      </w:r>
+      <w:r>
+        <w:t xml:space="preserve"> </w:t>
+      </w:r>
+      <w:r>
+        <w:rPr>
+          <w:i/>
+          <w:iCs/>
+        </w:rPr>
+        <w:t xml:space="preserve">SYSUTCDATETIME()</w:t>
+      </w:r>
+      <w:r>
+        <w:t xml:space="preserve">). Booking dates and times are exchanged as local dates of the business (</w:t>
+      </w:r>
+      <w:r>
+        <w:rPr>
+          <w:i/>
+          <w:iCs/>
+        </w:rPr>
+        <w:t xml:space="preserve">yyyy-MM-dd</w:t>
+      </w:r>
+      <w:r>
+        <w:t xml:space="preserve"> </w:t>
+      </w:r>
+      <w:r>
+        <w:t xml:space="preserve">and</w:t>
+      </w:r>
+      <w:r>
+        <w:t xml:space="preserve"> </w:t>
+      </w:r>
+      <w:r>
+        <w:rPr>
+          <w:i/>
+          <w:iCs/>
+        </w:rPr>
+        <w:t xml:space="preserve">HH:mm</w:t>
+      </w:r>
+      <w:r>
+        <w:t xml:space="preserve">) in the zone</w:t>
+      </w:r>
+      <w:r>
+        <w:t xml:space="preserve"> </w:t>
+      </w:r>
+      <w:r>
+        <w:rPr>
+          <w:i/>
+          <w:iCs/>
+        </w:rPr>
+        <w:t xml:space="preserve">BOOKING_ZONE</w:t>
+      </w:r>
+      <w:r>
+        <w:t xml:space="preserve"> </w:t>
+      </w:r>
+      <w:r>
+        <w:t xml:space="preserve">(America/Bogota), and the responses also carry the UTC instants. The backend returns stable codes, and the clients translate them into Spanish, English, French, or Portuguese.</w:t>
+      </w:r>
+    </w:p>
+    <w:bookmarkEnd w:id="33"/>
+    <w:bookmarkStart w:id="34" w:name="X2c3bf44dffa06b43998feaa4560b60992f89f6c"/>
+    <w:p>
+      <w:pPr>
+        <w:pStyle w:val="Heading4"/>
+      </w:pPr>
+      <w:r>
+        <w:t xml:space="preserve">9.5.5 Patterns Not Adopted</w:t>
+      </w:r>
+    </w:p>
+    <w:p>
+      <w:pPr>
+        <w:pStyle w:val="FirstParagraph"/>
+      </w:pPr>
+      <w:r>
+        <w:t xml:space="preserve">The project decided not to adopt in this version Outbox, Saga, CQRS, Event Sourcing, BFF, service mesh, Redis, database per service, formal circuit breaker, or payment gateway. The most important consequence is the absence of Outbox: an event can be lost if the service stops between the commit and the publication (TD-011).</w:t>
+      </w:r>
+    </w:p>
+    <w:bookmarkEnd w:id="34"/>
     <w:bookmarkEnd w:id="35"/>
-    <w:bookmarkStart w:id="36" w:name="X49a01f3f8bd327901e97fb12071cfefd72cc6a1"/>
-    <w:p>
-      <w:pPr>
-        <w:pStyle w:val="Heading4"/>
-      </w:pPr>
-      <w:r>
-        <w:t xml:space="preserve">9.5.4 Time and Language</w:t>
-      </w:r>
-    </w:p>
-    <w:p>
-      <w:pPr>
-        <w:pStyle w:val="FirstParagraph"/>
-      </w:pPr>
-      <w:r>
-        <w:t xml:space="preserve">All timestamps are stored in UTC (</w:t>
-      </w:r>
-      <w:r>
-        <w:rPr>
-          <w:i/>
-          <w:iCs/>
-        </w:rPr>
-        <w:t xml:space="preserve">DATETIME2(3)</w:t>
-      </w:r>
-      <w:r>
-        <w:t xml:space="preserve">,</w:t>
-      </w:r>
-      <w:r>
-        <w:t xml:space="preserve"> </w:t>
-      </w:r>
-      <w:r>
-        <w:rPr>
-          <w:i/>
-          <w:iCs/>
-        </w:rPr>
-        <w:t xml:space="preserve">SYSUTCDATETIME()</w:t>
-      </w:r>
-      <w:r>
-        <w:t xml:space="preserve">). Booking dates and times are exchanged as local dates of the business (</w:t>
-      </w:r>
-      <w:r>
-        <w:rPr>
-          <w:i/>
-          <w:iCs/>
-        </w:rPr>
-        <w:t xml:space="preserve">yyyy-MM-dd</w:t>
-      </w:r>
-      <w:r>
-        <w:t xml:space="preserve"> </w:t>
-      </w:r>
-      <w:r>
-        <w:t xml:space="preserve">and</w:t>
-      </w:r>
-      <w:r>
-        <w:t xml:space="preserve"> </w:t>
-      </w:r>
-      <w:r>
-        <w:rPr>
-          <w:i/>
-          <w:iCs/>
-        </w:rPr>
-        <w:t xml:space="preserve">HH:mm</w:t>
-      </w:r>
-      <w:r>
-        <w:t xml:space="preserve">) in the zone</w:t>
-      </w:r>
-      <w:r>
-        <w:t xml:space="preserve"> </w:t>
-      </w:r>
-      <w:r>
-        <w:rPr>
-          <w:i/>
-          <w:iCs/>
-        </w:rPr>
-        <w:t xml:space="preserve">BOOKING_ZONE</w:t>
-      </w:r>
-      <w:r>
-        <w:t xml:space="preserve"> </w:t>
-      </w:r>
-      <w:r>
-        <w:t xml:space="preserve">(America/Bogota), and the responses also carry the UTC instants. The backend returns stable codes, and the clients translate them into Spanish, English, French, or Portuguese.</w:t>
-      </w:r>
-    </w:p>
     <w:bookmarkEnd w:id="36"/>
-    <w:bookmarkStart w:id="37" w:name="X2c3bf44dffa06b43998feaa4560b60992f89f6c"/>
-    <w:p>
-      <w:pPr>
-        <w:pStyle w:val="Heading4"/>
-      </w:pPr>
-      <w:r>
-        <w:t xml:space="preserve">9.5.5 Patterns Not Adopted</w:t>
-      </w:r>
-    </w:p>
-    <w:p>
-      <w:pPr>
-        <w:pStyle w:val="FirstParagraph"/>
-      </w:pPr>
-      <w:r>
-        <w:t xml:space="preserve">The project decided not to adopt in this version Outbox, Saga, CQRS, Event Sourcing, BFF, service mesh, Redis, database per service, formal circuit breaker, or payment gateway. The most important consequence is the absence of Outbox: an event can be lost if the service stops between the commit and the publication (TD-011).</w:t>
-      </w:r>
-    </w:p>
-    <w:bookmarkEnd w:id="37"/>
-    <w:bookmarkEnd w:id="38"/>
-    <w:bookmarkEnd w:id="39"/>
-    <w:bookmarkStart w:id="45" w:name="Xf117f3c14160e8561f2aa9d1e4daf75a65112f3"/>
+    <w:bookmarkStart w:id="42" w:name="Xf117f3c14160e8561f2aa9d1e4daf75a65112f3"/>
     <w:p>
       <w:pPr>
         <w:pStyle w:val="Heading2"/>
@@ -9251,7 +9438,7 @@
         <w:t xml:space="preserve">10. Project Structure</w:t>
       </w:r>
     </w:p>
-    <w:bookmarkStart w:id="40" w:name="X38be475d02f4d903002dfefeeefac5f5f611ecf"/>
+    <w:bookmarkStart w:id="37" w:name="X38be475d02f4d903002dfefeeefac5f5f611ecf"/>
     <w:p>
       <w:pPr>
         <w:pStyle w:val="Heading3"/>
@@ -9568,8 +9755,8 @@
         <w:t xml:space="preserve">The repository addresses are listed in the Installation Manual, section 8.</w:t>
       </w:r>
     </w:p>
-    <w:bookmarkEnd w:id="40"/>
-    <w:bookmarkStart w:id="41" w:name="X83c92c3828edd62e873f95930516efe2961f0c8"/>
+    <w:bookmarkEnd w:id="37"/>
+    <w:bookmarkStart w:id="38" w:name="X83c92c3828edd62e873f95930516efe2961f0c8"/>
     <w:p>
       <w:pPr>
         <w:pStyle w:val="Heading3"/>
@@ -9840,8 +10027,8 @@
         <w:t xml:space="preserve">    `-- test/java/...      domain, use case, security, and web tests</w:t>
       </w:r>
     </w:p>
-    <w:bookmarkEnd w:id="41"/>
-    <w:bookmarkStart w:id="42" w:name="X657ae863dc4b953454432d035be28ff4919a2d6"/>
+    <w:bookmarkEnd w:id="38"/>
+    <w:bookmarkStart w:id="39" w:name="X657ae863dc4b953454432d035be28ff4919a2d6"/>
     <w:p>
       <w:pPr>
         <w:pStyle w:val="Heading3"/>
@@ -9978,8 +10165,8 @@
         <w:t xml:space="preserve">            PaymentService.Infrastructure.IntegrationTests</w:t>
       </w:r>
     </w:p>
-    <w:bookmarkEnd w:id="42"/>
-    <w:bookmarkStart w:id="43" w:name="X5467d091d183aa019703258a271a519d67c5a2a"/>
+    <w:bookmarkEnd w:id="39"/>
+    <w:bookmarkStart w:id="40" w:name="X5467d091d183aa019703258a271a519d67c5a2a"/>
     <w:p>
       <w:pPr>
         <w:pStyle w:val="Heading3"/>
@@ -10430,8 +10617,8 @@
         <w:t xml:space="preserve">). A new rule for a screen goes in its ViewModel, not in the template or the component.</w:t>
       </w:r>
     </w:p>
-    <w:bookmarkEnd w:id="43"/>
-    <w:bookmarkStart w:id="44" w:name="Xecdc608ce1eb031125fd30840448db02933cc07"/>
+    <w:bookmarkEnd w:id="40"/>
+    <w:bookmarkStart w:id="41" w:name="Xecdc608ce1eb031125fd30840448db02933cc07"/>
     <w:p>
       <w:pPr>
         <w:pStyle w:val="Heading3"/>
@@ -11248,9 +11435,9 @@
         <w:t xml:space="preserve">5).</w:t>
       </w:r>
     </w:p>
-    <w:bookmarkEnd w:id="44"/>
-    <w:bookmarkEnd w:id="45"/>
-    <w:bookmarkStart w:id="57" w:name="Xbc0dbb99817e3f2eb6e1bcbff30371be7d99b36"/>
+    <w:bookmarkEnd w:id="41"/>
+    <w:bookmarkEnd w:id="42"/>
+    <w:bookmarkStart w:id="54" w:name="Xbc0dbb99817e3f2eb6e1bcbff30371be7d99b36"/>
     <w:p>
       <w:pPr>
         <w:pStyle w:val="Heading2"/>
@@ -11277,10 +11464,10 @@
         <w:t xml:space="preserve">LavaRapido</w:t>
       </w:r>
       <w:r>
-        <w:t xml:space="preserve">, divided into nine schemas owned by six services, with 57 tables.</w:t>
-      </w:r>
-    </w:p>
-    <w:bookmarkStart w:id="49" w:name="X511910f95b0d21d8829e9fe82cf6e0427baa331"/>
+        <w:t xml:space="preserve">, divided into nine schemas owned by six services, with 58 tables.</w:t>
+      </w:r>
+    </w:p>
+    <w:bookmarkStart w:id="46" w:name="X511910f95b0d21d8829e9fe82cf6e0427baa331"/>
     <w:p>
       <w:pPr>
         <w:pStyle w:val="Heading3"/>
@@ -11414,18 +11601,18 @@
           <wp:inline>
             <wp:extent cx="5334000" cy="3273742"/>
             <wp:effectExtent b="0" l="0" r="0" t="0"/>
-            <wp:docPr descr="Entity-relationship diagram of the system" title="" id="47" name="Picture"/>
+            <wp:docPr descr="Entity-relationship diagram of the system" title="" id="44" name="Picture"/>
             <a:graphic>
               <a:graphicData uri="http://schemas.openxmlformats.org/drawingml/2006/picture">
                 <pic:pic>
                   <pic:nvPicPr>
-                    <pic:cNvPr descr="capturas/data-model.png" id="48" name="Picture"/>
+                    <pic:cNvPr descr="capturas/data-model.png" id="45" name="Picture"/>
                     <pic:cNvPicPr>
                       <a:picLocks noChangeArrowheads="1" noChangeAspect="1"/>
                     </pic:cNvPicPr>
                   </pic:nvPicPr>
                   <pic:blipFill>
-                    <a:blip r:embed="rId46"/>
+                    <a:blip r:embed="rId43"/>
                     <a:stretch>
                       <a:fillRect/>
                     </a:stretch>
@@ -11452,8 +11639,8 @@
         </w:drawing>
       </w:r>
     </w:p>
-    <w:bookmarkEnd w:id="49"/>
-    <w:bookmarkStart w:id="53" w:name="Xf73ab5413e7306da91dfde66a5d56a3af081505"/>
+    <w:bookmarkEnd w:id="46"/>
+    <w:bookmarkStart w:id="50" w:name="Xf73ab5413e7306da91dfde66a5d56a3af081505"/>
     <w:p>
       <w:pPr>
         <w:pStyle w:val="Heading3"/>
@@ -11462,7 +11649,7 @@
         <w:t xml:space="preserve">11.2 Main Tables</w:t>
       </w:r>
     </w:p>
-    <w:bookmarkStart w:id="50" w:name="X4b84269225e32ccd56a2ef08dbd6239cb175271"/>
+    <w:bookmarkStart w:id="47" w:name="X4b84269225e32ccd56a2ef08dbd6239cb175271"/>
     <w:p>
       <w:pPr>
         <w:pStyle w:val="Heading4"/>
@@ -12039,8 +12226,8 @@
         <w:t xml:space="preserve">Prepared by the authors from the changelogs and the data models of the services.</w:t>
       </w:r>
     </w:p>
-    <w:bookmarkEnd w:id="50"/>
-    <w:bookmarkStart w:id="51" w:name="X45611acd91dc44a0df6272eed56a389844f6875"/>
+    <w:bookmarkEnd w:id="47"/>
+    <w:bookmarkStart w:id="48" w:name="X45611acd91dc44a0df6272eed56a389844f6875"/>
     <w:p>
       <w:pPr>
         <w:pStyle w:val="Heading4"/>
@@ -12432,8 +12619,8 @@
         <w:t xml:space="preserve">in English in the database (SCHEDULED, CONFIRMED, IN_PROGRESS, COMPLETED, CANCELLED, NO_SHOW; PENDING, IN_REVIEW, APPROVED, REJECTED, REFUNDED; PENDING, IN_PROGRESS, PAUSED, COMPLETED, WITH_ISSUE). The payment method codes remain in Spanish (EFECTIVO, NEQUI, DAVIPLATA, TRANSFERENCIA).</w:t>
       </w:r>
     </w:p>
-    <w:bookmarkEnd w:id="51"/>
-    <w:bookmarkStart w:id="52" w:name="X2bc9596c6add3da9b94d079aac3e8e5e5fc74b9"/>
+    <w:bookmarkEnd w:id="48"/>
+    <w:bookmarkStart w:id="49" w:name="X2bc9596c6add3da9b94d079aac3e8e5e5fc74b9"/>
     <w:p>
       <w:pPr>
         <w:pStyle w:val="Heading4"/>
@@ -12738,9 +12925,9 @@
         <w:t xml:space="preserve">Prepared by the authors from the migration strategy and the data models of the services.</w:t>
       </w:r>
     </w:p>
-    <w:bookmarkEnd w:id="52"/>
-    <w:bookmarkEnd w:id="53"/>
-    <w:bookmarkStart w:id="54" w:name="X81ecdde81a942658dba50ff74cc64564cba0dd9"/>
+    <w:bookmarkEnd w:id="49"/>
+    <w:bookmarkEnd w:id="50"/>
+    <w:bookmarkStart w:id="51" w:name="X81ecdde81a942658dba50ff74cc64564cba0dd9"/>
     <w:p>
       <w:pPr>
         <w:pStyle w:val="Heading3"/>
@@ -19762,8 +19949,8 @@
         <w:t xml:space="preserve">Source: data model of notification-service. The columns of the last three tables must be completed from their changelogs (Annex B).</w:t>
       </w:r>
     </w:p>
-    <w:bookmarkEnd w:id="54"/>
-    <w:bookmarkStart w:id="55" w:name="Xd0237d78f85344f0d97750c8752b997256de0e1"/>
+    <w:bookmarkEnd w:id="51"/>
+    <w:bookmarkStart w:id="52" w:name="Xd0237d78f85344f0d97750c8752b997256de0e1"/>
     <w:p>
       <w:pPr>
         <w:pStyle w:val="Heading3"/>
@@ -20309,8 +20496,8 @@
         <w:t xml:space="preserve">Prepared by the authors from the code and the data models of the services.</w:t>
       </w:r>
     </w:p>
-    <w:bookmarkEnd w:id="55"/>
-    <w:bookmarkStart w:id="56" w:name="Xb1b4bc028bff389b6165ece84ec9b5284832a0c"/>
+    <w:bookmarkEnd w:id="52"/>
+    <w:bookmarkStart w:id="53" w:name="Xb1b4bc028bff389b6165ece84ec9b5284832a0c"/>
     <w:p>
       <w:pPr>
         <w:pStyle w:val="Heading3"/>
@@ -20509,9 +20696,9 @@
         <w:t xml:space="preserve">cancellation reason); the next one is 118. The list of changelogs of each service is in the Installation Manual, section 11.2.</w:t>
       </w:r>
     </w:p>
-    <w:bookmarkEnd w:id="56"/>
-    <w:bookmarkEnd w:id="57"/>
-    <w:bookmarkStart w:id="69" w:name="X5c32ff9b3a1187d904e9a9528f7a864f9c0fb1e"/>
+    <w:bookmarkEnd w:id="53"/>
+    <w:bookmarkEnd w:id="54"/>
+    <w:bookmarkStart w:id="63" w:name="X5c32ff9b3a1187d904e9a9528f7a864f9c0fb1e"/>
     <w:p>
       <w:pPr>
         <w:pStyle w:val="Heading2"/>
@@ -20520,7 +20707,7 @@
         <w:t xml:space="preserve">12. Technical Modules</w:t>
       </w:r>
     </w:p>
-    <w:bookmarkStart w:id="58" w:name="X8832eaed2e07a8f28a446d1f3ebd89941bad654"/>
+    <w:bookmarkStart w:id="55" w:name="X8832eaed2e07a8f28a446d1f3ebd89941bad654"/>
     <w:p>
       <w:pPr>
         <w:pStyle w:val="Heading3"/>
@@ -20764,8 +20951,8 @@
         <w:t xml:space="preserve">contact of a user with its switches, and list of active administrators.</w:t>
       </w:r>
     </w:p>
-    <w:bookmarkEnd w:id="58"/>
-    <w:bookmarkStart w:id="59" w:name="Xb36e5d7efc09fa5ffb47026d005252ad986c588"/>
+    <w:bookmarkEnd w:id="55"/>
+    <w:bookmarkStart w:id="56" w:name="Xb36e5d7efc09fa5ffb47026d005252ad986c588"/>
     <w:p>
       <w:pPr>
         <w:pStyle w:val="Heading3"/>
@@ -20907,8 +21094,8 @@
         <w:t xml:space="preserve">); its domain events are only logged.</w:t>
       </w:r>
     </w:p>
-    <w:bookmarkEnd w:id="59"/>
-    <w:bookmarkStart w:id="60" w:name="X0dc1db07244742b09aaf75d2a7ce7a3ff5a0b3e"/>
+    <w:bookmarkEnd w:id="56"/>
+    <w:bookmarkStart w:id="57" w:name="X0dc1db07244742b09aaf75d2a7ce7a3ff5a0b3e"/>
     <w:p>
       <w:pPr>
         <w:pStyle w:val="Heading3"/>
@@ -21707,8 +21894,8 @@
         <w:t xml:space="preserve">NULL and none of these rules.</w:t>
       </w:r>
     </w:p>
-    <w:bookmarkEnd w:id="60"/>
-    <w:bookmarkStart w:id="61" w:name="Xcb0980fa106e16c90cce61876c9b9b1c66c4b08"/>
+    <w:bookmarkEnd w:id="57"/>
+    <w:bookmarkStart w:id="58" w:name="Xcb0980fa106e16c90cce61876c9b9b1c66c4b08"/>
     <w:p>
       <w:pPr>
         <w:pStyle w:val="Heading3"/>
@@ -22179,8 +22366,8 @@
         <w:t xml:space="preserve">and publishes OperatorAssigned, ServiceStarted, ServiceCompleted, InspectionShared, ServiceNotStarted, and ServiceNotFinished.</w:t>
       </w:r>
     </w:p>
-    <w:bookmarkEnd w:id="61"/>
-    <w:bookmarkStart w:id="62" w:name="X30f2bc1aa1d68dc99d9df21019caaa55e516fe8"/>
+    <w:bookmarkEnd w:id="58"/>
+    <w:bookmarkStart w:id="59" w:name="X30f2bc1aa1d68dc99d9df21019caaa55e516fe8"/>
     <w:p>
       <w:pPr>
         <w:pStyle w:val="Heading3"/>
@@ -22712,8 +22899,8 @@
         <w:t xml:space="preserve">).</w:t>
       </w:r>
     </w:p>
-    <w:bookmarkEnd w:id="62"/>
-    <w:bookmarkStart w:id="63" w:name="X01593e6397c2185ce5cb4bb6e1786f136dba97f"/>
+    <w:bookmarkEnd w:id="59"/>
+    <w:bookmarkStart w:id="60" w:name="X01593e6397c2185ce5cb4bb6e1786f136dba97f"/>
     <w:p>
       <w:pPr>
         <w:pStyle w:val="Heading3"/>
@@ -22971,8 +23158,8 @@
         <w:t xml:space="preserve">MESSAGING_ENABLED, PUSH_ENABLED, MAIL_ENABLED, INTERNAL_API_KEY, REMINDERS_ENABLED, REMINDER_LEADS, and REMINDER_CHECK_INTERVAL.</w:t>
       </w:r>
     </w:p>
-    <w:bookmarkEnd w:id="63"/>
-    <w:bookmarkStart w:id="64" w:name="Xe2544696e8193dfa9104e9fff0b30cc050e3d6c"/>
+    <w:bookmarkEnd w:id="60"/>
+    <w:bookmarkStart w:id="61" w:name="Xe2544696e8193dfa9104e9fff0b30cc050e3d6c"/>
     <w:p>
       <w:pPr>
         <w:pStyle w:val="Heading3"/>
@@ -23273,8 +23460,8 @@
         <w:t xml:space="preserve">for the count of bookings without an operator (if operations-service does not answer, they apply the same rule with the data they have). In the app, also, the administrator's booking form saves the chosen operator and status, the customer's points bar is full when nothing is left to unlock and does not show "0% OFF", the operator sees "—" as the rating when there are no ratings and the operator's home no longer repeats the "In progress" counter, the roles tab says that the three roles are fixed and the permissions are for reference, and the new notices open the operator's services screen or the administrator's home.</w:t>
       </w:r>
     </w:p>
-    <w:bookmarkEnd w:id="64"/>
-    <w:bookmarkStart w:id="68" w:name="X7e4bcd842b914e1e6ba2420828a35cba1099b7a"/>
+    <w:bookmarkEnd w:id="61"/>
+    <w:bookmarkStart w:id="62" w:name="X7e4bcd842b914e1e6ba2420828a35cba1099b7a"/>
     <w:p>
       <w:pPr>
         <w:pStyle w:val="Heading3"/>
@@ -23386,7 +23573,7 @@
               <w:pStyle w:val="Compact"/>
             </w:pPr>
             <w:r>
-              <w:t xml:space="preserve">Creation → CONFIRMED; SCHEDULED → CONFIRMED; CONFIRMED → IN_PROGRESS → COMPLETED; SCHEDULED or CONFIRMED → CANCELLED or NO_SHOW. The system only closes a booking when it is sure, one hour after its end: SCHEDULED → CANCELLED with the EXPIRED reason and CONFIRMED without an operator → NO_SHOW. A CONFIRMED booking with an operator that nobody recorded does not change on its own: the administrator resolves it (Attended → IN_PROGRESS → COMPLETED, or No-show).</w:t>
+              <w:t xml:space="preserve">Creation → CONFIRMED; SCHEDULED → CONFIRMED; CONFIRMED → IN_PROGRESS → COMPLETED; SCHEDULED or CONFIRMED → CANCELLED or NO_SHOW. The system only closes a booking when it is sure: one hour after its end, CONFIRMED without an operator → NO_SHOW, and a CONFIRMED booking with digital payment that reaches its deadline without a receipt → CANCELLED with the PAYMENT_TIMEOUT reason. The automatic cancellation of an expired SCHEDULED booking (EXPIRED) was removed on October 24, 2026 (B-07). A CONFIRMED booking with an operator that nobody recorded does not change on its own: the administrator resolves it (Attended → IN_PROGRESS → COMPLETED, or No-show).</w:t>
             </w:r>
           </w:p>
         </w:tc>
@@ -23544,46 +23731,7 @@
         <w:pStyle w:val="BodyText"/>
       </w:pPr>
       <w:r>
-        <w:drawing>
-          <wp:inline>
-            <wp:extent cx="5334000" cy="1300574"/>
-            <wp:effectExtent b="0" l="0" r="0" t="0"/>
-            <wp:docPr descr="Diagrama" title="" id="66" name="Picture"/>
-            <a:graphic>
-              <a:graphicData uri="http://schemas.openxmlformats.org/drawingml/2006/picture">
-                <pic:pic>
-                  <pic:nvPicPr>
-                    <pic:cNvPr descr="C:/Users/MERARI~1/AppData/Local/Temp/claude/C--Users-MERARI-URBANO-Lavado-Vehicular/fbac9d65-987c-4365-8841-0c86e8c3ca54/scratchpad/mermaid/technical_manual_md-2.png" id="67" name="Picture"/>
-                    <pic:cNvPicPr>
-                      <a:picLocks noChangeArrowheads="1" noChangeAspect="1"/>
-                    </pic:cNvPicPr>
-                  </pic:nvPicPr>
-                  <pic:blipFill>
-                    <a:blip r:embed="rId65"/>
-                    <a:stretch>
-                      <a:fillRect/>
-                    </a:stretch>
-                  </pic:blipFill>
-                  <pic:spPr bwMode="auto">
-                    <a:xfrm>
-                      <a:off x="0" y="0"/>
-                      <a:ext cx="5334000" cy="1300574"/>
-                    </a:xfrm>
-                    <a:prstGeom prst="rect">
-                      <a:avLst/>
-                    </a:prstGeom>
-                    <a:noFill/>
-                    <a:ln w="9525">
-                      <a:noFill/>
-                      <a:headEnd/>
-                      <a:tailEnd/>
-                    </a:ln>
-                  </pic:spPr>
-                </pic:pic>
-              </a:graphicData>
-            </a:graphic>
-          </wp:inline>
-        </w:drawing>
+        <w:t xml:space="preserve">![Diagrama](C:/Users/JUAN CAMILO/Documents/PROYECTO FINAL_LAVADO VEICULAR/lavarapido-docs/_generador/work/mermaid/technical_manual_md-2.png)</w:t>
       </w:r>
     </w:p>
     <w:p>
@@ -23621,13 +23769,61 @@
           <w:i/>
           <w:iCs/>
         </w:rPr>
-        <w:t xml:space="preserve">Expired</w:t>
-      </w:r>
-      <w:r>
-        <w:t xml:space="preserve"> </w:t>
-      </w:r>
-      <w:r>
-        <w:t xml:space="preserve">is the automatic close of</w:t>
+        <w:t xml:space="preserve">PAYMENT_TIMEOUT</w:t>
+      </w:r>
+      <w:r>
+        <w:t xml:space="preserve"> </w:t>
+      </w:r>
+      <w:r>
+        <w:t xml:space="preserve">is the cancellation done by</w:t>
+      </w:r>
+      <w:r>
+        <w:t xml:space="preserve"> </w:t>
+      </w:r>
+      <w:r>
+        <w:rPr>
+          <w:i/>
+          <w:iCs/>
+        </w:rPr>
+        <w:t xml:space="preserve">PaymentDeadlineJob</w:t>
+      </w:r>
+      <w:r>
+        <w:t xml:space="preserve"> </w:t>
+      </w:r>
+      <w:r>
+        <w:t xml:space="preserve">(section 12.3) and</w:t>
+      </w:r>
+      <w:r>
+        <w:t xml:space="preserve"> </w:t>
+      </w:r>
+      <w:r>
+        <w:rPr>
+          <w:i/>
+          <w:iCs/>
+        </w:rPr>
+        <w:t xml:space="preserve">ended without operator</w:t>
+      </w:r>
+      <w:r>
+        <w:t xml:space="preserve"> </w:t>
+      </w:r>
+      <w:r>
+        <w:t xml:space="preserve">is requested by</w:t>
+      </w:r>
+      <w:r>
+        <w:t xml:space="preserve"> </w:t>
+      </w:r>
+      <w:r>
+        <w:rPr>
+          <w:i/>
+          <w:iCs/>
+        </w:rPr>
+        <w:t xml:space="preserve">FollowUpJob</w:t>
+      </w:r>
+      <w:r>
+        <w:t xml:space="preserve"> </w:t>
+      </w:r>
+      <w:r>
+        <w:t xml:space="preserve">of operations-service (section 12.4);</w:t>
       </w:r>
       <w:r>
         <w:t xml:space="preserve"> </w:t>
@@ -23640,47 +23836,12 @@
         <w:t xml:space="preserve">ExpiredBookingsJob</w:t>
       </w:r>
       <w:r>
-        <w:t xml:space="preserve"> </w:t>
-      </w:r>
-      <w:r>
-        <w:t xml:space="preserve">(section 12.3) and</w:t>
-      </w:r>
-      <w:r>
-        <w:t xml:space="preserve"> </w:t>
-      </w:r>
-      <w:r>
-        <w:rPr>
-          <w:i/>
-          <w:iCs/>
-        </w:rPr>
-        <w:t xml:space="preserve">ended without operator</w:t>
-      </w:r>
-      <w:r>
-        <w:t xml:space="preserve"> </w:t>
-      </w:r>
-      <w:r>
-        <w:t xml:space="preserve">is requested by</w:t>
-      </w:r>
-      <w:r>
-        <w:t xml:space="preserve"> </w:t>
-      </w:r>
-      <w:r>
-        <w:rPr>
-          <w:i/>
-          <w:iCs/>
-        </w:rPr>
-        <w:t xml:space="preserve">FollowUpJob</w:t>
-      </w:r>
-      <w:r>
-        <w:t xml:space="preserve"> </w:t>
-      </w:r>
-      <w:r>
-        <w:t xml:space="preserve">of operations-service (section 12.4). A confirmed booking with an operator that nobody recorded does not change status on its own: the administrator resolves it from "To close" (Attended → IN_PROGRESS → COMPLETED, or No-show).</w:t>
-      </w:r>
-    </w:p>
-    <w:bookmarkEnd w:id="68"/>
-    <w:bookmarkEnd w:id="69"/>
-    <w:bookmarkStart w:id="76" w:name="X9d46fb7d20f612d352e76a19a29613bfc6099b0"/>
+        <w:t xml:space="preserve">, which cancelled expired scheduled bookings, no longer exists (B-07). A confirmed booking with an operator that nobody recorded does not change status on its own: the administrator resolves it from "To close" (Attended → IN_PROGRESS → COMPLETED, or No-show).</w:t>
+      </w:r>
+    </w:p>
+    <w:bookmarkEnd w:id="62"/>
+    <w:bookmarkEnd w:id="63"/>
+    <w:bookmarkStart w:id="70" w:name="X9d46fb7d20f612d352e76a19a29613bfc6099b0"/>
     <w:p>
       <w:pPr>
         <w:pStyle w:val="Heading2"/>
@@ -23755,7 +23916,7 @@
         <w:t xml:space="preserve">in the Development environment.</w:t>
       </w:r>
     </w:p>
-    <w:bookmarkStart w:id="70" w:name="X7f88d01b6e16a50d16dda0cd3162d3de595c462"/>
+    <w:bookmarkStart w:id="64" w:name="X7f88d01b6e16a50d16dda0cd3162d3de595c462"/>
     <w:p>
       <w:pPr>
         <w:pStyle w:val="Heading3"/>
@@ -24055,8 +24216,8 @@
         <w:t xml:space="preserve">; they are not routed by the gateway.</w:t>
       </w:r>
     </w:p>
-    <w:bookmarkEnd w:id="70"/>
-    <w:bookmarkStart w:id="71" w:name="Xf2f700821f8dd0452826e6cd57f449fc19e40bf"/>
+    <w:bookmarkEnd w:id="64"/>
+    <w:bookmarkStart w:id="65" w:name="Xf2f700821f8dd0452826e6cd57f449fc19e40bf"/>
     <w:p>
       <w:pPr>
         <w:pStyle w:val="Heading3"/>
@@ -24228,8 +24389,8 @@
         <w:t xml:space="preserve">) before passing any request on to the other services, keeping the answer 30 seconds per token (section 9.2). Every service validates the signature, the issuer, and the audience with the same secret.</w:t>
       </w:r>
     </w:p>
-    <w:bookmarkEnd w:id="71"/>
-    <w:bookmarkStart w:id="73" w:name="X689eaf3c7cf75b7581ad9d6d763df8ed6d35c46"/>
+    <w:bookmarkEnd w:id="65"/>
+    <w:bookmarkStart w:id="67" w:name="X689eaf3c7cf75b7581ad9d6d763df8ed6d35c46"/>
     <w:p>
       <w:pPr>
         <w:pStyle w:val="Heading3"/>
@@ -25376,7 +25537,7 @@
               <w:pStyle w:val="Compact"/>
             </w:pPr>
             <w:r>
-              <w:t xml:space="preserve">Own bookings and catalog of reasons (without the EXPIRED system reason).</w:t>
+              <w:t xml:space="preserve">Own bookings and catalog of reasons (without the EXPIRED and PAYMENT_TIMEOUT system reasons).</w:t>
             </w:r>
           </w:p>
         </w:tc>
@@ -27762,7 +27923,7 @@
         <w:t xml:space="preserve">Prepared by the authors from the controllers of the services and the service documentation.</w:t>
       </w:r>
     </w:p>
-    <w:bookmarkStart w:id="72" w:name="X60e58d162cb206c1730821aca428d654c68d57f"/>
+    <w:bookmarkStart w:id="66" w:name="X60e58d162cb206c1730821aca428d654c68d57f"/>
     <w:p>
       <w:pPr>
         <w:pStyle w:val="Heading4"/>
@@ -28277,9 +28438,9 @@
         <w:t xml:space="preserve">Codes taken from the translation file of the web application and the documentation of booking-service.</w:t>
       </w:r>
     </w:p>
-    <w:bookmarkEnd w:id="72"/>
-    <w:bookmarkEnd w:id="73"/>
-    <w:bookmarkStart w:id="74" w:name="Xadce7ad9d8df9cc8601fb8b26b9ebf30450364e"/>
+    <w:bookmarkEnd w:id="66"/>
+    <w:bookmarkEnd w:id="67"/>
+    <w:bookmarkStart w:id="68" w:name="Xadce7ad9d8df9cc8601fb8b26b9ebf30450364e"/>
     <w:p>
       <w:pPr>
         <w:pStyle w:val="Heading3"/>
@@ -29959,8 +30120,8 @@
         <w:t xml:space="preserve">confirms with payment-service before cancelling (AC-89).</w:t>
       </w:r>
     </w:p>
-    <w:bookmarkEnd w:id="74"/>
-    <w:bookmarkStart w:id="75" w:name="X370fb66c9fb5ae82210b2b385e61bf0307ac6d2"/>
+    <w:bookmarkEnd w:id="68"/>
+    <w:bookmarkStart w:id="69" w:name="X370fb66c9fb5ae82210b2b385e61bf0307ac6d2"/>
     <w:p>
       <w:pPr>
         <w:pStyle w:val="Heading3"/>
@@ -30080,9 +30241,9 @@
         <w:t xml:space="preserve">run the complete flows against the containers; they run only locally, because the CI only checks their syntax.</w:t>
       </w:r>
     </w:p>
-    <w:bookmarkEnd w:id="75"/>
-    <w:bookmarkEnd w:id="76"/>
-    <w:bookmarkStart w:id="84" w:name="X066735aabfcc2fa37a5fe4460ae82ffdd0ed62c"/>
+    <w:bookmarkEnd w:id="69"/>
+    <w:bookmarkEnd w:id="70"/>
+    <w:bookmarkStart w:id="78" w:name="X066735aabfcc2fa37a5fe4460ae82ffdd0ed62c"/>
     <w:p>
       <w:pPr>
         <w:pStyle w:val="Heading2"/>
@@ -30099,7 +30260,7 @@
         <w:t xml:space="preserve">The security policy of the project is based on defense in depth, least privilege, secure defaults, security by design, and zero trust, and its checklist follows the OWASP Top 10 (OWASP Foundation, 2021).</w:t>
       </w:r>
     </w:p>
-    <w:bookmarkStart w:id="77" w:name="Xf83a249cfe4746667e266684f97b46a4102cf07"/>
+    <w:bookmarkStart w:id="71" w:name="Xf83a249cfe4746667e266684f97b46a4102cf07"/>
     <w:p>
       <w:pPr>
         <w:pStyle w:val="Heading3"/>
@@ -30478,8 +30639,8 @@
         <w:t xml:space="preserve">Source: configuration and code of security-service and ADR-006.</w:t>
       </w:r>
     </w:p>
-    <w:bookmarkEnd w:id="77"/>
-    <w:bookmarkStart w:id="78" w:name="Xd94897c01313a8278cc456ed13ab8ce4b4d44a3"/>
+    <w:bookmarkEnd w:id="71"/>
+    <w:bookmarkStart w:id="72" w:name="Xd94897c01313a8278cc456ed13ab8ce4b4d44a3"/>
     <w:p>
       <w:pPr>
         <w:pStyle w:val="Heading3"/>
@@ -30596,8 +30757,8 @@
         <w:t xml:space="preserve">; if the key is empty, the routes stay closed.</w:t>
       </w:r>
     </w:p>
-    <w:bookmarkEnd w:id="78"/>
-    <w:bookmarkStart w:id="79" w:name="Xd61fdf1ba191c93309a4796f97b4559d2d4ef21"/>
+    <w:bookmarkEnd w:id="72"/>
+    <w:bookmarkStart w:id="73" w:name="Xd61fdf1ba191c93309a4796f97b4559d2d4ef21"/>
     <w:p>
       <w:pPr>
         <w:pStyle w:val="Heading3"/>
@@ -30686,8 +30847,8 @@
         <w:t xml:space="preserve">Prices, totals, and end times never come from the client.</w:t>
       </w:r>
     </w:p>
-    <w:bookmarkEnd w:id="79"/>
-    <w:bookmarkStart w:id="80" w:name="Xf2d529b798b6fedb4482cd6d9d9d0c0927de1e4"/>
+    <w:bookmarkEnd w:id="73"/>
+    <w:bookmarkStart w:id="74" w:name="Xf2d529b798b6fedb4482cd6d9d9d0c0927de1e4"/>
     <w:p>
       <w:pPr>
         <w:pStyle w:val="Heading3"/>
@@ -30886,8 +31047,8 @@
         <w:t xml:space="preserve">profile.</w:t>
       </w:r>
     </w:p>
-    <w:bookmarkEnd w:id="80"/>
-    <w:bookmarkStart w:id="81" w:name="Xe019b1f2d13f032ec649e0782aba1622cbb8f9c"/>
+    <w:bookmarkEnd w:id="74"/>
+    <w:bookmarkStart w:id="75" w:name="Xe019b1f2d13f032ec649e0782aba1622cbb8f9c"/>
     <w:p>
       <w:pPr>
         <w:pStyle w:val="Heading3"/>
@@ -31354,8 +31515,8 @@
         <w:t xml:space="preserve">Prepared by the authors from the security policy and the code.</w:t>
       </w:r>
     </w:p>
-    <w:bookmarkEnd w:id="81"/>
-    <w:bookmarkStart w:id="82" w:name="Xde20daac4a263531ffca20692fb82c768b1547e"/>
+    <w:bookmarkEnd w:id="75"/>
+    <w:bookmarkStart w:id="76" w:name="Xde20daac4a263531ffca20692fb82c768b1547e"/>
     <w:p>
       <w:pPr>
         <w:pStyle w:val="Heading3"/>
@@ -31478,8 +31639,8 @@
         <w:t xml:space="preserve">omits them so that they do not reach the logs.</w:t>
       </w:r>
     </w:p>
-    <w:bookmarkEnd w:id="82"/>
-    <w:bookmarkStart w:id="83" w:name="X8982c98621bb30649b1c9a48a98f28f4fff572f"/>
+    <w:bookmarkEnd w:id="76"/>
+    <w:bookmarkStart w:id="77" w:name="X8982c98621bb30649b1c9a48a98f28f4fff572f"/>
     <w:p>
       <w:pPr>
         <w:pStyle w:val="Heading3"/>
@@ -31601,9 +31762,9 @@
         <w:t xml:space="preserve">Display fields and discount fields of a promotion not kept consistent by any constraint (ADR-015).</w:t>
       </w:r>
     </w:p>
-    <w:bookmarkEnd w:id="83"/>
-    <w:bookmarkEnd w:id="84"/>
-    <w:bookmarkStart w:id="89" w:name="X54afc8e0cb879c45eaf2360ca9a29f5123d9888"/>
+    <w:bookmarkEnd w:id="77"/>
+    <w:bookmarkEnd w:id="78"/>
+    <w:bookmarkStart w:id="83" w:name="X54afc8e0cb879c45eaf2360ca9a29f5123d9888"/>
     <w:p>
       <w:pPr>
         <w:pStyle w:val="Heading2"/>
@@ -31612,7 +31773,7 @@
         <w:t xml:space="preserve">15. Version Control</w:t>
       </w:r>
     </w:p>
-    <w:bookmarkStart w:id="85" w:name="Xd2d90200e0eaedde270df734aa3385e8d820a4e"/>
+    <w:bookmarkStart w:id="79" w:name="Xd2d90200e0eaedde270df734aa3385e8d820a4e"/>
     <w:p>
       <w:pPr>
         <w:pStyle w:val="Heading3"/>
@@ -31806,7 +31967,71 @@
         <w:t xml:space="preserve">main</w:t>
       </w:r>
       <w:r>
-        <w:t xml:space="preserve">, like the others). Commits follow the format</w:t>
+        <w:t xml:space="preserve">, like the others). On October 27, 2026</w:t>
+      </w:r>
+      <w:r>
+        <w:t xml:space="preserve"> </w:t>
+      </w:r>
+      <w:r>
+        <w:rPr>
+          <w:i/>
+          <w:iCs/>
+        </w:rPr>
+        <w:t xml:space="preserve">v1.1.1</w:t>
+      </w:r>
+      <w:r>
+        <w:t xml:space="preserve"> </w:t>
+      </w:r>
+      <w:r>
+        <w:t xml:space="preserve">shipped in customer-service and booking-service (the validations and alternatives of October 27,</w:t>
+      </w:r>
+      <w:r>
+        <w:t xml:space="preserve"> </w:t>
+      </w:r>
+      <w:r>
+        <w:rPr>
+          <w:i/>
+          <w:iCs/>
+        </w:rPr>
+        <w:t xml:space="preserve">bookedBy</w:t>
+      </w:r>
+      <w:r>
+        <w:t xml:space="preserve"> </w:t>
+      </w:r>
+      <w:r>
+        <w:t xml:space="preserve">only for the staff, and the single owners query) and</w:t>
+      </w:r>
+      <w:r>
+        <w:t xml:space="preserve"> </w:t>
+      </w:r>
+      <w:r>
+        <w:rPr>
+          <w:i/>
+          <w:iCs/>
+        </w:rPr>
+        <w:t xml:space="preserve">v1.1.2</w:t>
+      </w:r>
+      <w:r>
+        <w:t xml:space="preserve"> </w:t>
+      </w:r>
+      <w:r>
+        <w:t xml:space="preserve">in the web (WebP backgrounds), payment-service (integration tests in the CI), infra (the payment method in the end-to-end tests), and the mobile app (a corrected text, published over the internet).</w:t>
+      </w:r>
+      <w:r>
+        <w:t xml:space="preserve"> </w:t>
+      </w:r>
+      <w:r>
+        <w:rPr>
+          <w:i/>
+          <w:iCs/>
+        </w:rPr>
+        <w:t xml:space="preserve">main</w:t>
+      </w:r>
+      <w:r>
+        <w:t xml:space="preserve"> </w:t>
+      </w:r>
+      <w:r>
+        <w:t xml:space="preserve">is protected in the 10 repositories: it only takes changes through a pull request approved by another member with a green CI. Commits follow the format</w:t>
       </w:r>
       <w:r>
         <w:t xml:space="preserve"> </w:t>
@@ -31851,8 +32076,8 @@
         <w:t xml:space="preserve">.</w:t>
       </w:r>
     </w:p>
-    <w:bookmarkEnd w:id="85"/>
-    <w:bookmarkStart w:id="86" w:name="X8ddacbfaf67170b3027d4fe2cab55d5baad0322"/>
+    <w:bookmarkEnd w:id="79"/>
+    <w:bookmarkStart w:id="80" w:name="X8ddacbfaf67170b3027d4fe2cab55d5baad0322"/>
     <w:p>
       <w:pPr>
         <w:pStyle w:val="Heading3"/>
@@ -31869,8 +32094,8 @@
         <w:t xml:space="preserve">The schema is versioned with Liquibase: each change is a changeset with an identifier and an author, and Liquibase stores a checksum. Changesets are immutable and forward-only; a later change is recorded in a new changeset.</w:t>
       </w:r>
     </w:p>
-    <w:bookmarkEnd w:id="86"/>
-    <w:bookmarkStart w:id="87" w:name="X0914a9793b999be03de94468650be7b2f8e3ddb"/>
+    <w:bookmarkEnd w:id="80"/>
+    <w:bookmarkStart w:id="81" w:name="X0914a9793b999be03de94468650be7b2f8e3ddb"/>
     <w:p>
       <w:pPr>
         <w:pStyle w:val="Heading3"/>
@@ -32512,8 +32737,8 @@
         <w:t xml:space="preserve">of the documentation.</w:t>
       </w:r>
     </w:p>
-    <w:bookmarkEnd w:id="87"/>
-    <w:bookmarkStart w:id="88" w:name="X96395793fad0422e7e7c99f018fc9f5d23869a4"/>
+    <w:bookmarkEnd w:id="81"/>
+    <w:bookmarkStart w:id="82" w:name="X96395793fad0422e7e7c99f018fc9f5d23869a4"/>
     <w:p>
       <w:pPr>
         <w:pStyle w:val="Heading3"/>
@@ -33031,17 +33256,7 @@
         <w:t xml:space="preserve"> </w:t>
       </w:r>
       <w:r>
-        <w:t xml:space="preserve">(</w:t>
-      </w:r>
-      <w:r>
-        <w:rPr>
-          <w:i/>
-          <w:iCs/>
-        </w:rPr>
-        <w:t xml:space="preserve">v1.0.0</w:t>
-      </w:r>
-      <w:r>
-        <w:t xml:space="preserve">) also has the manual "Desplegar en Azure" workflow (</w:t>
+        <w:t xml:space="preserve">also has the "Desplegar en Azure" workflow (</w:t>
       </w:r>
       <w:r>
         <w:rPr>
@@ -33064,7 +33279,23 @@
         <w:t xml:space="preserve">deploy/ci-deploy.sh</w:t>
       </w:r>
       <w:r>
-        <w:t xml:space="preserve">; as of October 24, 2026 it has never run and the repository does not have its secrets.</w:t>
+        <w:t xml:space="preserve">; since October 26, 2026 it has its secrets and runs on its own on every merge into</w:t>
+      </w:r>
+      <w:r>
+        <w:t xml:space="preserve"> </w:t>
+      </w:r>
+      <w:r>
+        <w:rPr>
+          <w:i/>
+          <w:iCs/>
+        </w:rPr>
+        <w:t xml:space="preserve">main</w:t>
+      </w:r>
+      <w:r>
+        <w:t xml:space="preserve"> </w:t>
+      </w:r>
+      <w:r>
+        <w:t xml:space="preserve">(continuous deployment, below).</w:t>
       </w:r>
     </w:p>
     <w:p>
@@ -33076,29 +33307,626 @@
           <w:b/>
           <w:bCs/>
         </w:rPr>
-        <w:t xml:space="preserve">Continuous deployment (merged into</w:t>
+        <w:t xml:space="preserve">Continuous deployment (active since October 26, 2026).</w:t>
+      </w:r>
+      <w:r>
+        <w:t xml:space="preserve"> </w:t>
+      </w:r>
+      <w:r>
+        <w:rPr>
+          <w:i/>
+          <w:iCs/>
+        </w:rPr>
+        <w:t xml:space="preserve">lavarapido-infra</w:t>
+      </w:r>
+      <w:r>
+        <w:t xml:space="preserve"> </w:t>
+      </w:r>
+      <w:r>
+        <w:t xml:space="preserve">(</w:t>
+      </w:r>
+      <w:r>
+        <w:rPr>
+          <w:i/>
+          <w:iCs/>
+        </w:rPr>
+        <w:t xml:space="preserve">006b5b0</w:t>
+      </w:r>
+      <w:r>
+        <w:t xml:space="preserve">) and the "Pedir despliegue" job of the 8 repositories deployed to Azure (web, api-gateway, security, customer, booking, operations, notification, and payment) make every approved merge into</w:t>
+      </w:r>
+      <w:r>
+        <w:t xml:space="preserve"> </w:t>
+      </w:r>
+      <w:r>
+        <w:rPr>
+          <w:i/>
+          <w:iCs/>
+        </w:rPr>
+        <w:t xml:space="preserve">main</w:t>
+      </w:r>
+      <w:r>
+        <w:t xml:space="preserve"> </w:t>
+      </w:r>
+      <w:r>
+        <w:t xml:space="preserve">deploy on its own: the repository's CI, if it passes, launches</w:t>
+      </w:r>
+      <w:r>
+        <w:t xml:space="preserve"> </w:t>
+      </w:r>
+      <w:r>
+        <w:rPr>
+          <w:i/>
+          <w:iCs/>
+        </w:rPr>
+        <w:t xml:space="preserve">deploy.yml</w:t>
+      </w:r>
+      <w:r>
+        <w:t xml:space="preserve"> </w:t>
+      </w:r>
+      <w:r>
+        <w:t xml:space="preserve">with</w:t>
+      </w:r>
+      <w:r>
+        <w:t xml:space="preserve"> </w:t>
+      </w:r>
+      <w:r>
+        <w:rPr>
+          <w:i/>
+          <w:iCs/>
+        </w:rPr>
+        <w:t xml:space="preserve">automatic=true</w:t>
+      </w:r>
+      <w:r>
+        <w:t xml:space="preserve"> </w:t>
+      </w:r>
+      <w:r>
+        <w:t xml:space="preserve">(secret</w:t>
+      </w:r>
+      <w:r>
+        <w:t xml:space="preserve"> </w:t>
+      </w:r>
+      <w:r>
+        <w:rPr>
+          <w:i/>
+          <w:iCs/>
+        </w:rPr>
+        <w:t xml:space="preserve">DEPLOY_DISPATCH_TOKEN</w:t>
+      </w:r>
+      <w:r>
+        <w:t xml:space="preserve">); the workflow backs up, pulls</w:t>
+      </w:r>
+      <w:r>
+        <w:t xml:space="preserve"> </w:t>
+      </w:r>
+      <w:r>
+        <w:rPr>
+          <w:i/>
+          <w:iCs/>
+        </w:rPr>
+        <w:t xml:space="preserve">main</w:t>
+      </w:r>
+      <w:r>
+        <w:t xml:space="preserve"> </w:t>
+      </w:r>
+      <w:r>
+        <w:t xml:space="preserve">of every repository (until</w:t>
+      </w:r>
+      <w:r>
+        <w:t xml:space="preserve"> </w:t>
+      </w:r>
+      <w:r>
+        <w:rPr>
+          <w:i/>
+          <w:iCs/>
+        </w:rPr>
+        <w:t xml:space="preserve">v1.1.0</w:t>
+      </w:r>
+      <w:r>
+        <w:t xml:space="preserve">, payment-service stayed on</w:t>
+      </w:r>
+      <w:r>
+        <w:t xml:space="preserve"> </w:t>
+      </w:r>
+      <w:r>
+        <w:rPr>
+          <w:i/>
+          <w:iCs/>
+        </w:rPr>
+        <w:t xml:space="preserve">develop</w:t>
+      </w:r>
+      <w:r>
+        <w:t xml:space="preserve"> </w:t>
+      </w:r>
+      <w:r>
+        <w:t xml:space="preserve">through</w:t>
+      </w:r>
+      <w:r>
+        <w:t xml:space="preserve"> </w:t>
+      </w:r>
+      <w:r>
+        <w:rPr>
+          <w:i/>
+          <w:iCs/>
+        </w:rPr>
+        <w:t xml:space="preserve">DEVELOP_ONLY</w:t>
+      </w:r>
+      <w:r>
+        <w:t xml:space="preserve">; since infra</w:t>
+      </w:r>
+      <w:r>
+        <w:t xml:space="preserve"> </w:t>
+      </w:r>
+      <w:r>
+        <w:rPr>
+          <w:i/>
+          <w:iCs/>
+        </w:rPr>
+        <w:t xml:space="preserve">v1.1.1</w:t>
+      </w:r>
+      <w:r>
+        <w:t xml:space="preserve"> </w:t>
+      </w:r>
+      <w:r>
+        <w:t xml:space="preserve">it also pulls</w:t>
+      </w:r>
+      <w:r>
+        <w:t xml:space="preserve"> </w:t>
+      </w:r>
+      <w:r>
+        <w:rPr>
+          <w:i/>
+          <w:iCs/>
+        </w:rPr>
+        <w:t xml:space="preserve">main</w:t>
+      </w:r>
+      <w:r>
+        <w:t xml:space="preserve">), waits up to 20 minutes for another update in progress, requires all containers to become healthy within 8 minutes, restarts Caddy if its</w:t>
+      </w:r>
+      <w:r>
+        <w:t xml:space="preserve"> </w:t>
+      </w:r>
+      <w:r>
+        <w:rPr>
+          <w:i/>
+          <w:iCs/>
+        </w:rPr>
+        <w:t xml:space="preserve">Caddyfile</w:t>
+      </w:r>
+      <w:r>
+        <w:t xml:space="preserve"> </w:t>
+      </w:r>
+      <w:r>
+        <w:t xml:space="preserve">changed, and checks the web and the API. With the machine off it leaves a notice and does not fail; when it is turned on,</w:t>
+      </w:r>
+      <w:r>
+        <w:t xml:space="preserve"> </w:t>
+      </w:r>
+      <w:r>
+        <w:rPr>
+          <w:i/>
+          <w:iCs/>
+        </w:rPr>
+        <w:t xml:space="preserve">deploy/boot-update.sh</w:t>
+      </w:r>
+      <w:r>
+        <w:t xml:space="preserve"> </w:t>
+      </w:r>
+      <w:r>
+        <w:t xml:space="preserve">(an</w:t>
+      </w:r>
+      <w:r>
+        <w:t xml:space="preserve"> </w:t>
+      </w:r>
+      <w:r>
+        <w:rPr>
+          <w:i/>
+          <w:iCs/>
+        </w:rPr>
+        <w:t xml:space="preserve">@reboot</w:t>
+      </w:r>
+      <w:r>
+        <w:t xml:space="preserve"> </w:t>
+      </w:r>
+      <w:r>
+        <w:t xml:space="preserve">task) deploys what is pending by comparing with</w:t>
+      </w:r>
+      <w:r>
+        <w:t xml:space="preserve"> </w:t>
+      </w:r>
+      <w:r>
+        <w:rPr>
+          <w:i/>
+          <w:iCs/>
+        </w:rPr>
+        <w:t xml:space="preserve">~/lavarapido/backups/deployed-heads</w:t>
+      </w:r>
+      <w:r>
+        <w:t xml:space="preserve">. The mobile app has</w:t>
+      </w:r>
+      <w:r>
+        <w:t xml:space="preserve"> </w:t>
+      </w:r>
+      <w:r>
+        <w:rPr>
+          <w:i/>
+          <w:iCs/>
+        </w:rPr>
+        <w:t xml:space="preserve">cd.yml</w:t>
+      </w:r>
+      <w:r>
+        <w:t xml:space="preserve">: on each push to</w:t>
+      </w:r>
+      <w:r>
+        <w:t xml:space="preserve"> </w:t>
+      </w:r>
+      <w:r>
+        <w:rPr>
+          <w:i/>
+          <w:iCs/>
+        </w:rPr>
+        <w:t xml:space="preserve">main</w:t>
+      </w:r>
+      <w:r>
+        <w:t xml:space="preserve"> </w:t>
+      </w:r>
+      <w:r>
+        <w:t xml:space="preserve">it repeats the CI, compares the code's native fingerprint with that of the published APK and, if it matches, publishes the over-the-air update (</w:t>
+      </w:r>
+      <w:r>
+        <w:rPr>
+          <w:i/>
+          <w:iCs/>
+        </w:rPr>
+        <w:t xml:space="preserve">eas update</w:t>
+      </w:r>
+      <w:r>
+        <w:t xml:space="preserve">, secret</w:t>
+      </w:r>
+      <w:r>
+        <w:t xml:space="preserve"> </w:t>
+      </w:r>
+      <w:r>
+        <w:rPr>
+          <w:i/>
+          <w:iCs/>
+        </w:rPr>
+        <w:t xml:space="preserve">EXPO_TOKEN</w:t>
+      </w:r>
+      <w:r>
+        <w:t xml:space="preserve">); if it changed, it asks for a new APK. To activate it,</w:t>
+      </w:r>
+      <w:r>
+        <w:t xml:space="preserve"> </w:t>
+      </w:r>
+      <w:r>
+        <w:rPr>
+          <w:i/>
+          <w:iCs/>
+        </w:rPr>
+        <w:t xml:space="preserve">AZURE_SSH_KEY</w:t>
+      </w:r>
+      <w:r>
+        <w:t xml:space="preserve">,</w:t>
+      </w:r>
+      <w:r>
+        <w:t xml:space="preserve"> </w:t>
+      </w:r>
+      <w:r>
+        <w:rPr>
+          <w:i/>
+          <w:iCs/>
+        </w:rPr>
+        <w:t xml:space="preserve">DEPLOY_DISPATCH_TOKEN</w:t>
+      </w:r>
+      <w:r>
+        <w:t xml:space="preserve"> </w:t>
+      </w:r>
+      <w:r>
+        <w:t xml:space="preserve">(in customer, booking, and payment their owner or an administrator creates them), and</w:t>
+      </w:r>
+      <w:r>
+        <w:t xml:space="preserve"> </w:t>
+      </w:r>
+      <w:r>
+        <w:rPr>
+          <w:i/>
+          <w:iCs/>
+        </w:rPr>
+        <w:t xml:space="preserve">EXPO_TOKEN</w:t>
+      </w:r>
+      <w:r>
+        <w:t xml:space="preserve"> </w:t>
+      </w:r>
+      <w:r>
+        <w:t xml:space="preserve">were created, and</w:t>
+      </w:r>
+      <w:r>
+        <w:t xml:space="preserve"> </w:t>
+      </w:r>
+      <w:r>
+        <w:rPr>
+          <w:i/>
+          <w:iCs/>
+        </w:rPr>
+        <w:t xml:space="preserve">v1.1.0</w:t>
+      </w:r>
+      <w:r>
+        <w:t xml:space="preserve"> </w:t>
+      </w:r>
+      <w:r>
+        <w:t xml:space="preserve">was released on October 26, 2026, with</w:t>
+      </w:r>
+      <w:r>
+        <w:t xml:space="preserve"> </w:t>
+      </w:r>
+      <w:r>
+        <w:rPr>
+          <w:i/>
+          <w:iCs/>
+        </w:rPr>
+        <w:t xml:space="preserve">lavarapido-infra</w:t>
+      </w:r>
+      <w:r>
+        <w:t xml:space="preserve"> </w:t>
+      </w:r>
+      <w:r>
+        <w:t xml:space="preserve">last (Deployment Document, section 4.3.4). It was closed as AC-90 in the corrective actions document.</w:t>
+      </w:r>
+      <w:r>
+        <w:t xml:space="preserve"> </w:t>
       </w:r>
       <w:r>
         <w:rPr>
           <w:b/>
           <w:bCs/>
         </w:rPr>
+        <w:t xml:space="preserve">First automatic run (October 26, 2026, night, Colombia time).</w:t>
+      </w:r>
+      <w:r>
+        <w:t xml:space="preserve"> </w:t>
+      </w:r>
+      <w:r>
+        <w:t xml:space="preserve">With the secrets created, merging the "Release v1.1.1" PR into</w:t>
+      </w:r>
+      <w:r>
+        <w:t xml:space="preserve"> </w:t>
+      </w:r>
+      <w:r>
+        <w:rPr>
+          <w:i/>
+          <w:iCs/>
+        </w:rPr>
+        <w:t xml:space="preserve">main</w:t>
+      </w:r>
+      <w:r>
+        <w:t xml:space="preserve"> </w:t>
+      </w:r>
+      <w:r>
+        <w:t xml:space="preserve">of</w:t>
+      </w:r>
+      <w:r>
+        <w:t xml:space="preserve"> </w:t>
+      </w:r>
+      <w:r>
+        <w:rPr>
+          <w:i/>
+          <w:iCs/>
+        </w:rPr>
+        <w:t xml:space="preserve">lavarapido-infra</w:t>
+      </w:r>
+      <w:r>
+        <w:t xml:space="preserve"> </w:t>
+      </w:r>
+      <w:r>
+        <w:t xml:space="preserve">launched the</w:t>
+      </w:r>
+      <w:r>
         <w:t xml:space="preserve"> </w:t>
       </w:r>
       <w:r>
         <w:rPr>
           <w:b/>
           <w:bCs/>
-          <w:i/>
-          <w:iCs/>
-        </w:rPr>
-        <w:t xml:space="preserve">develop</w:t>
+        </w:rPr>
+        <w:t xml:space="preserve">Desplegar en Azure</w:t>
+      </w:r>
+      <w:r>
+        <w:t xml:space="preserve"> </w:t>
+      </w:r>
+      <w:r>
+        <w:t xml:space="preserve">workflow with</w:t>
+      </w:r>
+      <w:r>
+        <w:t xml:space="preserve"> </w:t>
+      </w:r>
+      <w:r>
+        <w:rPr>
+          <w:i/>
+          <w:iCs/>
+        </w:rPr>
+        <w:t xml:space="preserve">automatic=true</w:t>
+      </w:r>
+      <w:r>
+        <w:t xml:space="preserve"> </w:t>
+      </w:r>
+      <w:r>
+        <w:t xml:space="preserve">at 22:19, and the following requests from the other repositories deployed on their own until 22:48 (those that arrived while another one was running were cancelled and served by the next one): all of them ended green, with "Listo: todos los servicios están sanos" and "Web y API responden 200". Since the 22:46 run, payment-service also pulls</w:t>
+      </w:r>
+      <w:r>
+        <w:t xml:space="preserve"> </w:t>
+      </w:r>
+      <w:r>
+        <w:rPr>
+          <w:i/>
+          <w:iCs/>
+        </w:rPr>
+        <w:t xml:space="preserve">main</w:t>
+      </w:r>
+      <w:r>
+        <w:t xml:space="preserve">. In the mobile app, publishing</w:t>
+      </w:r>
+      <w:r>
+        <w:t xml:space="preserve"> </w:t>
+      </w:r>
+      <w:r>
+        <w:rPr>
+          <w:i/>
+          <w:iCs/>
+        </w:rPr>
+        <w:t xml:space="preserve">v1.1.0</w:t>
+      </w:r>
+      <w:r>
+        <w:t xml:space="preserve"> </w:t>
+      </w:r>
+      <w:r>
+        <w:t xml:space="preserve">failed because</w:t>
+      </w:r>
+      <w:r>
+        <w:t xml:space="preserve"> </w:t>
+      </w:r>
+      <w:r>
+        <w:rPr>
+          <w:i/>
+          <w:iCs/>
+        </w:rPr>
+        <w:t xml:space="preserve">EXPO_TOKEN</w:t>
+      </w:r>
+      <w:r>
+        <w:t xml:space="preserve"> </w:t>
+      </w:r>
+      <w:r>
+        <w:t xml:space="preserve">was missing (nothing was published); with the secret created, APK</w:t>
+      </w:r>
+      <w:r>
+        <w:t xml:space="preserve"> </w:t>
+      </w:r>
+      <w:r>
+        <w:rPr>
+          <w:i/>
+          <w:iCs/>
+        </w:rPr>
+        <w:t xml:space="preserve">versionCode</w:t>
+      </w:r>
+      <w:r>
+        <w:t xml:space="preserve"> </w:t>
+      </w:r>
+      <w:r>
+        <w:t xml:space="preserve">6 was published at 22:39 and the</w:t>
+      </w:r>
+      <w:r>
+        <w:t xml:space="preserve"> </w:t>
+      </w:r>
+      <w:r>
+        <w:rPr>
+          <w:i/>
+          <w:iCs/>
+        </w:rPr>
+        <w:t xml:space="preserve">v1.1.1</w:t>
+      </w:r>
+      <w:r>
+        <w:t xml:space="preserve"> </w:t>
+      </w:r>
+      <w:r>
+        <w:t xml:space="preserve">run compared the native fingerprint of the commit with that APK's, saw that it matched, and published the over-the-air update (Deployment Document, section 1.3.12).</w:t>
+      </w:r>
+      <w:r>
+        <w:t xml:space="preserve"> </w:t>
       </w:r>
       <w:r>
         <w:rPr>
           <w:b/>
           <w:bCs/>
         </w:rPr>
+        <w:t xml:space="preserve">Runs of October 27, 2026.</w:t>
+      </w:r>
+      <w:r>
+        <w:t xml:space="preserve"> </w:t>
+      </w:r>
+      <w:r>
+        <w:t xml:space="preserve">The merges of the web</w:t>
+      </w:r>
+      <w:r>
+        <w:t xml:space="preserve"> </w:t>
+      </w:r>
+      <w:r>
+        <w:rPr>
+          <w:i/>
+          <w:iCs/>
+        </w:rPr>
+        <w:t xml:space="preserve">v1.1.2</w:t>
+      </w:r>
+      <w:r>
+        <w:t xml:space="preserve"> </w:t>
+      </w:r>
+      <w:r>
+        <w:t xml:space="preserve">(01:03, Colombia time) and of customer and booking</w:t>
+      </w:r>
+      <w:r>
+        <w:t xml:space="preserve"> </w:t>
+      </w:r>
+      <w:r>
+        <w:rPr>
+          <w:i/>
+          <w:iCs/>
+        </w:rPr>
+        <w:t xml:space="preserve">v1.1.1</w:t>
+      </w:r>
+      <w:r>
+        <w:t xml:space="preserve"> </w:t>
+      </w:r>
+      <w:r>
+        <w:t xml:space="preserve">and payment and infra</w:t>
+      </w:r>
+      <w:r>
+        <w:t xml:space="preserve"> </w:t>
+      </w:r>
+      <w:r>
+        <w:rPr>
+          <w:i/>
+          <w:iCs/>
+        </w:rPr>
+        <w:t xml:space="preserve">v1.1.2</w:t>
+      </w:r>
+      <w:r>
+        <w:t xml:space="preserve"> </w:t>
+      </w:r>
+      <w:r>
+        <w:t xml:space="preserve">(01:35 and 01:36) deployed on their own and ended green, with «Web y API responden 200»; at 14:30, the mobile app</w:t>
+      </w:r>
+      <w:r>
+        <w:t xml:space="preserve"> </w:t>
+      </w:r>
+      <w:r>
+        <w:rPr>
+          <w:i/>
+          <w:iCs/>
+        </w:rPr>
+        <w:t xml:space="preserve">v1.1.2</w:t>
+      </w:r>
+      <w:r>
+        <w:t xml:space="preserve"> </w:t>
+      </w:r>
+      <w:r>
+        <w:t xml:space="preserve">was published over the internet after checking that the native fingerprint matched that of APK</w:t>
+      </w:r>
+      <w:r>
+        <w:t xml:space="preserve"> </w:t>
+      </w:r>
+      <w:r>
+        <w:rPr>
+          <w:i/>
+          <w:iCs/>
+        </w:rPr>
+        <w:t xml:space="preserve">versionCode</w:t>
+      </w:r>
+      <w:r>
+        <w:t xml:space="preserve"> </w:t>
+      </w:r>
+      <w:r>
+        <w:t xml:space="preserve">6 (Deployment Document, section 1.3.13).</w:t>
+      </w:r>
+      <w:r>
         <w:t xml:space="preserve"> </w:t>
       </w:r>
       <w:r>
@@ -33106,304 +33934,269 @@
           <w:b/>
           <w:bCs/>
         </w:rPr>
-        <w:t xml:space="preserve">on October 24, 2026, without secrets).</w:t>
-      </w:r>
-      <w:r>
-        <w:t xml:space="preserve"> </w:t>
-      </w:r>
-      <w:r>
-        <w:rPr>
-          <w:i/>
-          <w:iCs/>
-        </w:rPr>
-        <w:t xml:space="preserve">lavarapido-infra</w:t>
-      </w:r>
-      <w:r>
-        <w:t xml:space="preserve"> </w:t>
-      </w:r>
-      <w:r>
-        <w:t xml:space="preserve">(</w:t>
-      </w:r>
-      <w:r>
-        <w:rPr>
-          <w:i/>
-          <w:iCs/>
-        </w:rPr>
-        <w:t xml:space="preserve">006b5b0</w:t>
-      </w:r>
-      <w:r>
-        <w:t xml:space="preserve">) and the "Pedir despliegue" job of the 8 repositories deployed to Azure (web, api-gateway, security, customer, booking, operations, notification, and payment) make every approved merge into</w:t>
-      </w:r>
-      <w:r>
-        <w:t xml:space="preserve"> </w:t>
-      </w:r>
-      <w:r>
-        <w:rPr>
-          <w:i/>
-          <w:iCs/>
-        </w:rPr>
-        <w:t xml:space="preserve">main</w:t>
-      </w:r>
-      <w:r>
-        <w:t xml:space="preserve"> </w:t>
-      </w:r>
-      <w:r>
-        <w:t xml:space="preserve">deploy on its own: the repository's CI, if it passes, launches</w:t>
-      </w:r>
-      <w:r>
-        <w:t xml:space="preserve"> </w:t>
-      </w:r>
-      <w:r>
-        <w:rPr>
-          <w:i/>
-          <w:iCs/>
-        </w:rPr>
-        <w:t xml:space="preserve">deploy.yml</w:t>
-      </w:r>
-      <w:r>
-        <w:t xml:space="preserve"> </w:t>
-      </w:r>
-      <w:r>
-        <w:t xml:space="preserve">with</w:t>
-      </w:r>
-      <w:r>
-        <w:t xml:space="preserve"> </w:t>
-      </w:r>
-      <w:r>
-        <w:rPr>
-          <w:i/>
-          <w:iCs/>
-        </w:rPr>
-        <w:t xml:space="preserve">automatic=true</w:t>
-      </w:r>
-      <w:r>
-        <w:t xml:space="preserve"> </w:t>
-      </w:r>
-      <w:r>
-        <w:t xml:space="preserve">(secret</w:t>
-      </w:r>
-      <w:r>
-        <w:t xml:space="preserve"> </w:t>
-      </w:r>
-      <w:r>
-        <w:rPr>
-          <w:i/>
-          <w:iCs/>
-        </w:rPr>
-        <w:t xml:space="preserve">DEPLOY_DISPATCH_TOKEN</w:t>
-      </w:r>
-      <w:r>
-        <w:t xml:space="preserve">); the workflow backs up, pulls</w:t>
-      </w:r>
-      <w:r>
-        <w:t xml:space="preserve"> </w:t>
-      </w:r>
-      <w:r>
-        <w:rPr>
-          <w:i/>
-          <w:iCs/>
-        </w:rPr>
-        <w:t xml:space="preserve">main</w:t>
-      </w:r>
-      <w:r>
-        <w:t xml:space="preserve"> </w:t>
-      </w:r>
-      <w:r>
-        <w:t xml:space="preserve">of every repository (until</w:t>
-      </w:r>
-      <w:r>
-        <w:t xml:space="preserve"> </w:t>
-      </w:r>
-      <w:r>
-        <w:rPr>
-          <w:i/>
-          <w:iCs/>
-        </w:rPr>
-        <w:t xml:space="preserve">v1.1.0</w:t>
-      </w:r>
-      <w:r>
-        <w:t xml:space="preserve">, payment-service stayed on</w:t>
-      </w:r>
-      <w:r>
-        <w:t xml:space="preserve"> </w:t>
-      </w:r>
-      <w:r>
-        <w:rPr>
-          <w:i/>
-          <w:iCs/>
-        </w:rPr>
-        <w:t xml:space="preserve">develop</w:t>
-      </w:r>
-      <w:r>
-        <w:t xml:space="preserve"> </w:t>
-      </w:r>
-      <w:r>
-        <w:t xml:space="preserve">through</w:t>
-      </w:r>
-      <w:r>
-        <w:t xml:space="preserve"> </w:t>
-      </w:r>
-      <w:r>
-        <w:rPr>
-          <w:i/>
-          <w:iCs/>
-        </w:rPr>
-        <w:t xml:space="preserve">DEVELOP_ONLY</w:t>
-      </w:r>
-      <w:r>
-        <w:t xml:space="preserve">; since infra</w:t>
-      </w:r>
-      <w:r>
-        <w:t xml:space="preserve"> </w:t>
-      </w:r>
-      <w:r>
-        <w:rPr>
-          <w:i/>
-          <w:iCs/>
-        </w:rPr>
-        <w:t xml:space="preserve">v1.1.1</w:t>
-      </w:r>
-      <w:r>
-        <w:t xml:space="preserve"> </w:t>
-      </w:r>
-      <w:r>
-        <w:t xml:space="preserve">it also pulls</w:t>
-      </w:r>
-      <w:r>
-        <w:t xml:space="preserve"> </w:t>
-      </w:r>
-      <w:r>
-        <w:rPr>
-          <w:i/>
-          <w:iCs/>
-        </w:rPr>
-        <w:t xml:space="preserve">main</w:t>
-      </w:r>
-      <w:r>
-        <w:t xml:space="preserve">), waits up to 20 minutes for another update in progress, requires all containers to become healthy within 8 minutes, restarts Caddy if its</w:t>
-      </w:r>
-      <w:r>
-        <w:t xml:space="preserve"> </w:t>
-      </w:r>
-      <w:r>
-        <w:rPr>
-          <w:i/>
-          <w:iCs/>
-        </w:rPr>
-        <w:t xml:space="preserve">Caddyfile</w:t>
-      </w:r>
-      <w:r>
-        <w:t xml:space="preserve"> </w:t>
-      </w:r>
-      <w:r>
-        <w:t xml:space="preserve">changed, and checks the web and the API. With the machine off it leaves a notice and does not fail; when it is turned on,</w:t>
-      </w:r>
-      <w:r>
-        <w:t xml:space="preserve"> </w:t>
-      </w:r>
-      <w:r>
-        <w:rPr>
-          <w:i/>
-          <w:iCs/>
-        </w:rPr>
-        <w:t xml:space="preserve">deploy/boot-update.sh</w:t>
-      </w:r>
-      <w:r>
-        <w:t xml:space="preserve"> </w:t>
-      </w:r>
-      <w:r>
-        <w:t xml:space="preserve">(an</w:t>
-      </w:r>
-      <w:r>
-        <w:t xml:space="preserve"> </w:t>
-      </w:r>
-      <w:r>
-        <w:rPr>
-          <w:i/>
-          <w:iCs/>
-        </w:rPr>
-        <w:t xml:space="preserve">@reboot</w:t>
-      </w:r>
-      <w:r>
-        <w:t xml:space="preserve"> </w:t>
-      </w:r>
-      <w:r>
-        <w:t xml:space="preserve">task) deploys what is pending by comparing with</w:t>
-      </w:r>
-      <w:r>
-        <w:t xml:space="preserve"> </w:t>
-      </w:r>
-      <w:r>
-        <w:rPr>
-          <w:i/>
-          <w:iCs/>
-        </w:rPr>
-        <w:t xml:space="preserve">~/lavarapido/backups/deployed-heads</w:t>
-      </w:r>
-      <w:r>
-        <w:t xml:space="preserve">. The mobile app has</w:t>
-      </w:r>
-      <w:r>
-        <w:t xml:space="preserve"> </w:t>
-      </w:r>
-      <w:r>
-        <w:rPr>
-          <w:i/>
-          <w:iCs/>
-        </w:rPr>
-        <w:t xml:space="preserve">cd.yml</w:t>
-      </w:r>
-      <w:r>
-        <w:t xml:space="preserve">: on each push to</w:t>
-      </w:r>
-      <w:r>
-        <w:t xml:space="preserve"> </w:t>
-      </w:r>
-      <w:r>
-        <w:rPr>
-          <w:i/>
-          <w:iCs/>
-        </w:rPr>
-        <w:t xml:space="preserve">main</w:t>
-      </w:r>
-      <w:r>
-        <w:t xml:space="preserve"> </w:t>
-      </w:r>
-      <w:r>
-        <w:t xml:space="preserve">it repeats the CI, compares the code's native fingerprint with that of the published APK and, if it matches, publishes the over-the-air update (</w:t>
-      </w:r>
-      <w:r>
-        <w:rPr>
-          <w:i/>
-          <w:iCs/>
-        </w:rPr>
-        <w:t xml:space="preserve">eas update</w:t>
-      </w:r>
-      <w:r>
-        <w:t xml:space="preserve">, secret</w:t>
-      </w:r>
-      <w:r>
-        <w:t xml:space="preserve"> </w:t>
-      </w:r>
-      <w:r>
-        <w:rPr>
-          <w:i/>
-          <w:iCs/>
-        </w:rPr>
-        <w:t xml:space="preserve">EXPO_TOKEN</w:t>
-      </w:r>
-      <w:r>
-        <w:t xml:space="preserve">); if it changed, it asks for a new APK. Activating it requires creating</w:t>
-      </w:r>
-      <w:r>
-        <w:t xml:space="preserve"> </w:t>
-      </w:r>
-      <w:r>
-        <w:rPr>
-          <w:i/>
-          <w:iCs/>
-        </w:rPr>
-        <w:t xml:space="preserve">AZURE_SSH_KEY</w:t>
+        <w:t xml:space="preserve">SonarCloud (October 26, 2026).</w:t>
+      </w:r>
+      <w:r>
+        <w:t xml:space="preserve"> </w:t>
+      </w:r>
+      <w:r>
+        <w:t xml:space="preserve">The findings of the analysis were fixed: in api-gateway, a real null access in the authentication path and comparing CIDR networks by content; in security, operations, and notification, the RabbitMQ publishers and the SMTP and Expo senders marked as</w:t>
+      </w:r>
+      <w:r>
+        <w:t xml:space="preserve"> </w:t>
+      </w:r>
+      <w:r>
+        <w:rPr>
+          <w:i/>
+          <w:iCs/>
+        </w:rPr>
+        <w:t xml:space="preserve">@Primary</w:t>
+      </w:r>
+      <w:r>
+        <w:t xml:space="preserve"> </w:t>
+      </w:r>
+      <w:r>
+        <w:t xml:space="preserve">(rule</w:t>
+      </w:r>
+      <w:r>
+        <w:t xml:space="preserve"> </w:t>
+      </w:r>
+      <w:r>
+        <w:rPr>
+          <w:i/>
+          <w:iCs/>
+        </w:rPr>
+        <w:t xml:space="preserve">java:S9352</w:t>
+      </w:r>
+      <w:r>
+        <w:t xml:space="preserve">); in the web, a stricter CI, the Angular CLI pinned, and sorting with</w:t>
+      </w:r>
+      <w:r>
+        <w:t xml:space="preserve"> </w:t>
+      </w:r>
+      <w:r>
+        <w:rPr>
+          <w:i/>
+          <w:iCs/>
+        </w:rPr>
+        <w:t xml:space="preserve">localeCompare</w:t>
+      </w:r>
+      <w:r>
+        <w:t xml:space="preserve">; and in the mobile app, promises marked with</w:t>
+      </w:r>
+      <w:r>
+        <w:t xml:space="preserve"> </w:t>
+      </w:r>
+      <w:r>
+        <w:rPr>
+          <w:i/>
+          <w:iCs/>
+        </w:rPr>
+        <w:t xml:space="preserve">void</w:t>
+      </w:r>
+      <w:r>
+        <w:t xml:space="preserve">, callbacks wrapped in arrow functions, the shared</w:t>
+      </w:r>
+      <w:r>
+        <w:t xml:space="preserve"> </w:t>
+      </w:r>
+      <w:r>
+        <w:rPr>
+          <w:i/>
+          <w:iCs/>
+        </w:rPr>
+        <w:t xml:space="preserve">Pill</w:t>
+      </w:r>
+      <w:r>
+        <w:t xml:space="preserve"> </w:t>
+      </w:r>
+      <w:r>
+        <w:t xml:space="preserve">component, the password translation key renamed, and the CI scripts and workflows hardened.</w:t>
+      </w:r>
+    </w:p>
+    <w:bookmarkEnd w:id="82"/>
+    <w:bookmarkEnd w:id="83"/>
+    <w:bookmarkStart w:id="92" w:name="X4c1df4a4a625ad942e59c57f37348aaf381b36d"/>
+    <w:p>
+      <w:pPr>
+        <w:pStyle w:val="Heading2"/>
+      </w:pPr>
+      <w:r>
+        <w:t xml:space="preserve">16. Maintenance Recommendations</w:t>
+      </w:r>
+    </w:p>
+    <w:bookmarkStart w:id="84" w:name="X0a57c856ea5c814766d8f893a45c7a6192183e4"/>
+    <w:p>
+      <w:pPr>
+        <w:pStyle w:val="Heading3"/>
+      </w:pPr>
+      <w:r>
+        <w:t xml:space="preserve">16.1 Local Environment</w:t>
+      </w:r>
+    </w:p>
+    <w:p>
+      <w:pPr>
+        <w:pStyle w:val="FirstParagraph"/>
+      </w:pPr>
+      <w:r>
+        <w:t xml:space="preserve">The local environment and its startup order are described in the Installation Manual. SQL Server and RabbitMQ must be healthy before the services; each service must tolerate that a dependency is not ready and answer 503 with a stable code.</w:t>
+      </w:r>
+    </w:p>
+    <w:bookmarkEnd w:id="84"/>
+    <w:bookmarkStart w:id="85" w:name="Xc791ff9bc63bf4d4c3765bdff58dea9fe933a34"/>
+    <w:p>
+      <w:pPr>
+        <w:pStyle w:val="Heading3"/>
+      </w:pPr>
+      <w:r>
+        <w:t xml:space="preserve">16.2 Configuration</w:t>
+      </w:r>
+    </w:p>
+    <w:p>
+      <w:pPr>
+        <w:pStyle w:val="FirstParagraph"/>
+      </w:pPr>
+      <w:r>
+        <w:t xml:space="preserve">The configuration variables are described in the Installation Manual, section 10. Any new variable must be added to</w:t>
+      </w:r>
+      <w:r>
+        <w:t xml:space="preserve"> </w:t>
+      </w:r>
+      <w:r>
+        <w:rPr>
+          <w:i/>
+          <w:iCs/>
+        </w:rPr>
+        <w:t xml:space="preserve">.env.example</w:t>
+      </w:r>
+      <w:r>
+        <w:t xml:space="preserve"> </w:t>
+      </w:r>
+      <w:r>
+        <w:t xml:space="preserve">with a comment and, if the service runs in Docker, to its</w:t>
+      </w:r>
+      <w:r>
+        <w:t xml:space="preserve"> </w:t>
+      </w:r>
+      <w:r>
+        <w:rPr>
+          <w:i/>
+          <w:iCs/>
+        </w:rPr>
+        <w:t xml:space="preserve">environment</w:t>
+      </w:r>
+      <w:r>
+        <w:t xml:space="preserve"> </w:t>
+      </w:r>
+      <w:r>
+        <w:t xml:space="preserve">block of</w:t>
+      </w:r>
+      <w:r>
+        <w:t xml:space="preserve"> </w:t>
+      </w:r>
+      <w:r>
+        <w:rPr>
+          <w:i/>
+          <w:iCs/>
+        </w:rPr>
+        <w:t xml:space="preserve">docker-compose.yml</w:t>
+      </w:r>
+      <w:r>
+        <w:t xml:space="preserve">. Those of October 21, 2026 (</w:t>
+      </w:r>
+      <w:r>
+        <w:rPr>
+          <w:i/>
+          <w:iCs/>
+        </w:rPr>
+        <w:t xml:space="preserve">SESSION_CHECK_*</w:t>
+      </w:r>
+      <w:r>
+        <w:t xml:space="preserve"> </w:t>
+      </w:r>
+      <w:r>
+        <w:t xml:space="preserve">in the gateway,</w:t>
+      </w:r>
+      <w:r>
+        <w:t xml:space="preserve"> </w:t>
+      </w:r>
+      <w:r>
+        <w:rPr>
+          <w:i/>
+          <w:iCs/>
+        </w:rPr>
+        <w:t xml:space="preserve">BOOKING_EXPIRY_*</w:t>
+      </w:r>
+      <w:r>
+        <w:t xml:space="preserve"> </w:t>
+      </w:r>
+      <w:r>
+        <w:t xml:space="preserve">in booking-service, with</w:t>
+      </w:r>
+      <w:r>
+        <w:t xml:space="preserve"> </w:t>
+      </w:r>
+      <w:r>
+        <w:rPr>
+          <w:i/>
+          <w:iCs/>
+        </w:rPr>
+        <w:t xml:space="preserve">BOOKING_EXPIRY_GRACE_MINUTES</w:t>
+      </w:r>
+      <w:r>
+        <w:t xml:space="preserve"> </w:t>
+      </w:r>
+      <w:r>
+        <w:t xml:space="preserve">shared with operations-service, and</w:t>
+      </w:r>
+      <w:r>
+        <w:t xml:space="preserve"> </w:t>
+      </w:r>
+      <w:r>
+        <w:rPr>
+          <w:i/>
+          <w:iCs/>
+        </w:rPr>
+        <w:t xml:space="preserve">FOLLOW_UP_ENABLED</w:t>
+      </w:r>
+      <w:r>
+        <w:t xml:space="preserve">,</w:t>
+      </w:r>
+      <w:r>
+        <w:t xml:space="preserve"> </w:t>
+      </w:r>
+      <w:r>
+        <w:rPr>
+          <w:i/>
+          <w:iCs/>
+        </w:rPr>
+        <w:t xml:space="preserve">FOLLOW_UP_INTERVAL</w:t>
+      </w:r>
+      <w:r>
+        <w:t xml:space="preserve">, and</w:t>
+      </w:r>
+      <w:r>
+        <w:t xml:space="preserve"> </w:t>
+      </w:r>
+      <w:r>
+        <w:rPr>
+          <w:i/>
+          <w:iCs/>
+        </w:rPr>
+        <w:t xml:space="preserve">FOLLOW_UP_LOOK_BACK_DAYS</w:t>
+      </w:r>
+      <w:r>
+        <w:t xml:space="preserve"> </w:t>
+      </w:r>
+      <w:r>
+        <w:t xml:space="preserve">in operations-service; nine in total) are already in those files (action ACO-14, closed). Those of October 23, 2026 (</w:t>
+      </w:r>
+      <w:r>
+        <w:rPr>
+          <w:i/>
+          <w:iCs/>
+        </w:rPr>
+        <w:t xml:space="preserve">ALLOWED_EMAIL_DOMAINS</w:t>
       </w:r>
       <w:r>
         <w:t xml:space="preserve"> </w:t>
@@ -33419,345 +34212,139 @@
           <w:i/>
           <w:iCs/>
         </w:rPr>
-        <w:t xml:space="preserve">DEPLOY_DISPATCH_TOKEN</w:t>
-      </w:r>
-      <w:r>
-        <w:t xml:space="preserve"> </w:t>
-      </w:r>
-      <w:r>
-        <w:t xml:space="preserve">(in customer, booking, and payment their owner or an administrator creates them) and</w:t>
-      </w:r>
-      <w:r>
-        <w:t xml:space="preserve"> </w:t>
-      </w:r>
-      <w:r>
-        <w:rPr>
-          <w:i/>
-          <w:iCs/>
-        </w:rPr>
-        <w:t xml:space="preserve">EXPO_TOKEN</w:t>
-      </w:r>
-      <w:r>
-        <w:t xml:space="preserve">, (</w:t>
-      </w:r>
-      <w:r>
-        <w:rPr>
-          <w:i/>
-          <w:iCs/>
-        </w:rPr>
-        <w:t xml:space="preserve">v1.1.0</w:t>
-      </w:r>
-      <w:r>
-        <w:t xml:space="preserve"> </w:t>
-      </w:r>
-      <w:r>
-        <w:t xml:space="preserve">was already released on October 26, 2026, with</w:t>
-      </w:r>
-      <w:r>
-        <w:t xml:space="preserve"> </w:t>
-      </w:r>
-      <w:r>
-        <w:rPr>
-          <w:i/>
-          <w:iCs/>
-        </w:rPr>
-        <w:t xml:space="preserve">lavarapido-infra</w:t>
-      </w:r>
-      <w:r>
-        <w:t xml:space="preserve"> </w:t>
-      </w:r>
-      <w:r>
-        <w:t xml:space="preserve">last; Deployment Document, section 4.3.4). It was closed as AC-90 in the corrective actions document.</w:t>
-      </w:r>
-      <w:r>
-        <w:t xml:space="preserve"> </w:t>
-      </w:r>
-      <w:r>
-        <w:rPr>
-          <w:b/>
-          <w:bCs/>
-        </w:rPr>
-        <w:t xml:space="preserve">First automatic run (October 26, 2026, night, Colombia time).</w:t>
-      </w:r>
-      <w:r>
-        <w:t xml:space="preserve"> </w:t>
-      </w:r>
-      <w:r>
-        <w:t xml:space="preserve">With the secrets created, merging the "Release v1.1.1" PR into</w:t>
-      </w:r>
-      <w:r>
-        <w:t xml:space="preserve"> </w:t>
-      </w:r>
-      <w:r>
-        <w:rPr>
-          <w:i/>
-          <w:iCs/>
-        </w:rPr>
-        <w:t xml:space="preserve">main</w:t>
-      </w:r>
-      <w:r>
-        <w:t xml:space="preserve"> </w:t>
-      </w:r>
-      <w:r>
-        <w:t xml:space="preserve">of</w:t>
-      </w:r>
-      <w:r>
-        <w:t xml:space="preserve"> </w:t>
-      </w:r>
-      <w:r>
-        <w:rPr>
-          <w:i/>
-          <w:iCs/>
-        </w:rPr>
-        <w:t xml:space="preserve">lavarapido-infra</w:t>
-      </w:r>
-      <w:r>
-        <w:t xml:space="preserve"> </w:t>
-      </w:r>
-      <w:r>
-        <w:t xml:space="preserve">launched the</w:t>
-      </w:r>
-      <w:r>
-        <w:t xml:space="preserve"> </w:t>
-      </w:r>
-      <w:r>
-        <w:rPr>
-          <w:b/>
-          <w:bCs/>
-        </w:rPr>
-        <w:t xml:space="preserve">Desplegar en Azure</w:t>
-      </w:r>
-      <w:r>
-        <w:t xml:space="preserve"> </w:t>
-      </w:r>
-      <w:r>
-        <w:t xml:space="preserve">workflow with</w:t>
-      </w:r>
-      <w:r>
-        <w:t xml:space="preserve"> </w:t>
-      </w:r>
-      <w:r>
-        <w:rPr>
-          <w:i/>
-          <w:iCs/>
-        </w:rPr>
-        <w:t xml:space="preserve">automatic=true</w:t>
-      </w:r>
-      <w:r>
-        <w:t xml:space="preserve"> </w:t>
-      </w:r>
-      <w:r>
-        <w:t xml:space="preserve">at 22:19, and the following requests from the other repositories deployed on their own until 22:48 (those that arrived while another one was running were cancelled and served by the next one): all of them ended green, with "Listo: todos los servicios están sanos" and "Web y API responden 200". Since the 22:46 run, payment-service also pulls</w:t>
-      </w:r>
-      <w:r>
-        <w:t xml:space="preserve"> </w:t>
-      </w:r>
-      <w:r>
-        <w:rPr>
-          <w:i/>
-          <w:iCs/>
-        </w:rPr>
-        <w:t xml:space="preserve">main</w:t>
-      </w:r>
-      <w:r>
-        <w:t xml:space="preserve">. In the mobile app, publishing</w:t>
-      </w:r>
-      <w:r>
-        <w:t xml:space="preserve"> </w:t>
-      </w:r>
-      <w:r>
-        <w:rPr>
-          <w:i/>
-          <w:iCs/>
-        </w:rPr>
-        <w:t xml:space="preserve">v1.1.0</w:t>
-      </w:r>
-      <w:r>
-        <w:t xml:space="preserve"> </w:t>
-      </w:r>
-      <w:r>
-        <w:t xml:space="preserve">failed because</w:t>
-      </w:r>
-      <w:r>
-        <w:t xml:space="preserve"> </w:t>
-      </w:r>
-      <w:r>
-        <w:rPr>
-          <w:i/>
-          <w:iCs/>
-        </w:rPr>
-        <w:t xml:space="preserve">EXPO_TOKEN</w:t>
-      </w:r>
-      <w:r>
-        <w:t xml:space="preserve"> </w:t>
-      </w:r>
-      <w:r>
-        <w:t xml:space="preserve">was missing (nothing was published); with the secret created, APK</w:t>
-      </w:r>
-      <w:r>
-        <w:t xml:space="preserve"> </w:t>
-      </w:r>
-      <w:r>
-        <w:rPr>
-          <w:i/>
-          <w:iCs/>
-        </w:rPr>
-        <w:t xml:space="preserve">versionCode</w:t>
-      </w:r>
-      <w:r>
-        <w:t xml:space="preserve"> </w:t>
-      </w:r>
-      <w:r>
-        <w:t xml:space="preserve">6 was published at 22:39 and the</w:t>
-      </w:r>
-      <w:r>
-        <w:t xml:space="preserve"> </w:t>
-      </w:r>
-      <w:r>
-        <w:rPr>
-          <w:i/>
-          <w:iCs/>
-        </w:rPr>
-        <w:t xml:space="preserve">v1.1.1</w:t>
-      </w:r>
-      <w:r>
-        <w:t xml:space="preserve"> </w:t>
-      </w:r>
-      <w:r>
-        <w:t xml:space="preserve">run compared the native fingerprint of the commit with that APK's, saw that it matched, and published the over-the-air update (Deployment Document, section 1.3.12).</w:t>
-      </w:r>
-      <w:r>
-        <w:t xml:space="preserve"> </w:t>
-      </w:r>
-      <w:r>
-        <w:rPr>
-          <w:b/>
-          <w:bCs/>
-        </w:rPr>
-        <w:t xml:space="preserve">SonarCloud (October 26, 2026).</w:t>
-      </w:r>
-      <w:r>
-        <w:t xml:space="preserve"> </w:t>
-      </w:r>
-      <w:r>
-        <w:t xml:space="preserve">The findings of the analysis were fixed: in api-gateway, a real null access in the authentication path and comparing CIDR networks by content; in security, operations, and notification, the RabbitMQ publishers and the SMTP and Expo senders marked as</w:t>
-      </w:r>
-      <w:r>
-        <w:t xml:space="preserve"> </w:t>
-      </w:r>
-      <w:r>
-        <w:rPr>
-          <w:i/>
-          <w:iCs/>
-        </w:rPr>
-        <w:t xml:space="preserve">@Primary</w:t>
-      </w:r>
-      <w:r>
-        <w:t xml:space="preserve"> </w:t>
-      </w:r>
-      <w:r>
-        <w:t xml:space="preserve">(rule</w:t>
-      </w:r>
-      <w:r>
-        <w:t xml:space="preserve"> </w:t>
-      </w:r>
-      <w:r>
-        <w:rPr>
-          <w:i/>
-          <w:iCs/>
-        </w:rPr>
-        <w:t xml:space="preserve">java:S9352</w:t>
-      </w:r>
-      <w:r>
-        <w:t xml:space="preserve">); in the web, a stricter CI, the Angular CLI pinned, and sorting with</w:t>
-      </w:r>
-      <w:r>
-        <w:t xml:space="preserve"> </w:t>
-      </w:r>
-      <w:r>
-        <w:rPr>
-          <w:i/>
-          <w:iCs/>
-        </w:rPr>
-        <w:t xml:space="preserve">localeCompare</w:t>
-      </w:r>
-      <w:r>
-        <w:t xml:space="preserve">; and in the mobile app, promises marked with</w:t>
-      </w:r>
-      <w:r>
-        <w:t xml:space="preserve"> </w:t>
-      </w:r>
-      <w:r>
-        <w:rPr>
-          <w:i/>
-          <w:iCs/>
-        </w:rPr>
-        <w:t xml:space="preserve">void</w:t>
-      </w:r>
-      <w:r>
-        <w:t xml:space="preserve">, callbacks wrapped in arrow functions, the shared</w:t>
-      </w:r>
-      <w:r>
-        <w:t xml:space="preserve"> </w:t>
-      </w:r>
-      <w:r>
-        <w:rPr>
-          <w:i/>
-          <w:iCs/>
-        </w:rPr>
-        <w:t xml:space="preserve">Pill</w:t>
-      </w:r>
-      <w:r>
-        <w:t xml:space="preserve"> </w:t>
-      </w:r>
-      <w:r>
-        <w:t xml:space="preserve">component, the password translation key renamed, and the CI scripts and workflows hardened.</w:t>
-      </w:r>
-    </w:p>
-    <w:bookmarkEnd w:id="88"/>
-    <w:bookmarkEnd w:id="89"/>
-    <w:bookmarkStart w:id="98" w:name="X4c1df4a4a625ad942e59c57f37348aaf381b36d"/>
-    <w:p>
-      <w:pPr>
-        <w:pStyle w:val="Heading2"/>
-      </w:pPr>
-      <w:r>
-        <w:t xml:space="preserve">16. Maintenance Recommendations</w:t>
-      </w:r>
-    </w:p>
-    <w:bookmarkStart w:id="90" w:name="X0a57c856ea5c814766d8f893a45c7a6192183e4"/>
-    <w:p>
-      <w:pPr>
-        <w:pStyle w:val="Heading3"/>
-      </w:pPr>
-      <w:r>
-        <w:t xml:space="preserve">16.1 Local Environment</w:t>
-      </w:r>
-    </w:p>
-    <w:p>
-      <w:pPr>
-        <w:pStyle w:val="FirstParagraph"/>
-      </w:pPr>
-      <w:r>
-        <w:t xml:space="preserve">The local environment and its startup order are described in the Installation Manual. SQL Server and RabbitMQ must be healthy before the services; each service must tolerate that a dependency is not ready and answer 503 with a stable code.</w:t>
-      </w:r>
-    </w:p>
-    <w:bookmarkEnd w:id="90"/>
-    <w:bookmarkStart w:id="91" w:name="Xc791ff9bc63bf4d4c3765bdff58dea9fe933a34"/>
-    <w:p>
-      <w:pPr>
-        <w:pStyle w:val="Heading3"/>
-      </w:pPr>
-      <w:r>
-        <w:t xml:space="preserve">16.2 Configuration</w:t>
-      </w:r>
-    </w:p>
-    <w:p>
-      <w:pPr>
-        <w:pStyle w:val="FirstParagraph"/>
-      </w:pPr>
-      <w:r>
-        <w:t xml:space="preserve">The configuration variables are described in the Installation Manual, section 10. Any new variable must be added to</w:t>
+        <w:t xml:space="preserve">DEMO_*_PASSWORD</w:t>
+      </w:r>
+      <w:r>
+        <w:t xml:space="preserve"> </w:t>
+      </w:r>
+      <w:r>
+        <w:t xml:space="preserve">in security-service) are too.</w:t>
+      </w:r>
+      <w:r>
+        <w:t xml:space="preserve"> </w:t>
+      </w:r>
+      <w:r>
+        <w:rPr>
+          <w:i/>
+          <w:iCs/>
+        </w:rPr>
+        <w:t xml:space="preserve">ADMIN_DOCUMENT</w:t>
+      </w:r>
+      <w:r>
+        <w:t xml:space="preserve"> </w:t>
+      </w:r>
+      <w:r>
+        <w:t xml:space="preserve">and</w:t>
+      </w:r>
+      <w:r>
+        <w:t xml:space="preserve"> </w:t>
+      </w:r>
+      <w:r>
+        <w:rPr>
+          <w:i/>
+          <w:iCs/>
+        </w:rPr>
+        <w:t xml:space="preserve">ADMIN_PHONE</w:t>
+      </w:r>
+      <w:r>
+        <w:t xml:space="preserve"> </w:t>
+      </w:r>
+      <w:r>
+        <w:t xml:space="preserve">complete the data of the first administrator in production. Those of October 26, 2026 (booking-service's</w:t>
+      </w:r>
+      <w:r>
+        <w:t xml:space="preserve"> </w:t>
+      </w:r>
+      <w:r>
+        <w:rPr>
+          <w:i/>
+          <w:iCs/>
+        </w:rPr>
+        <w:t xml:space="preserve">BOOKING_CASH_ACTIVE_LIMIT</w:t>
+      </w:r>
+      <w:r>
+        <w:t xml:space="preserve">,</w:t>
+      </w:r>
+      <w:r>
+        <w:t xml:space="preserve"> </w:t>
+      </w:r>
+      <w:r>
+        <w:rPr>
+          <w:i/>
+          <w:iCs/>
+        </w:rPr>
+        <w:t xml:space="preserve">BOOKING_PAYMENT_WINDOW</w:t>
+      </w:r>
+      <w:r>
+        <w:t xml:space="preserve">,</w:t>
+      </w:r>
+      <w:r>
+        <w:t xml:space="preserve"> </w:t>
+      </w:r>
+      <w:r>
+        <w:rPr>
+          <w:i/>
+          <w:iCs/>
+        </w:rPr>
+        <w:t xml:space="preserve">BOOKING_PAYMENT_EXPIRY_ENABLED</w:t>
+      </w:r>
+      <w:r>
+        <w:t xml:space="preserve">,</w:t>
+      </w:r>
+      <w:r>
+        <w:t xml:space="preserve"> </w:t>
+      </w:r>
+      <w:r>
+        <w:rPr>
+          <w:i/>
+          <w:iCs/>
+        </w:rPr>
+        <w:t xml:space="preserve">BOOKING_PAYMENT_EXPIRY_INTERVAL</w:t>
+      </w:r>
+      <w:r>
+        <w:t xml:space="preserve">, and</w:t>
+      </w:r>
+      <w:r>
+        <w:t xml:space="preserve"> </w:t>
+      </w:r>
+      <w:r>
+        <w:rPr>
+          <w:i/>
+          <w:iCs/>
+        </w:rPr>
+        <w:t xml:space="preserve">PAYMENT_SERVICE_URL</w:t>
+      </w:r>
+      <w:r>
+        <w:t xml:space="preserve">, and</w:t>
+      </w:r>
+      <w:r>
+        <w:t xml:space="preserve"> </w:t>
+      </w:r>
+      <w:r>
+        <w:rPr>
+          <w:i/>
+          <w:iCs/>
+        </w:rPr>
+        <w:t xml:space="preserve">INTERNAL_API_KEY</w:t>
+      </w:r>
+      <w:r>
+        <w:t xml:space="preserve">, which payment-service now also needs and</w:t>
+      </w:r>
+      <w:r>
+        <w:t xml:space="preserve"> </w:t>
+      </w:r>
+      <w:r>
+        <w:rPr>
+          <w:i/>
+          <w:iCs/>
+        </w:rPr>
+        <w:t xml:space="preserve">docker-compose.prod.yml</w:t>
+      </w:r>
+      <w:r>
+        <w:t xml:space="preserve"> </w:t>
+      </w:r>
+      <w:r>
+        <w:t xml:space="preserve">requires) are in</w:t>
       </w:r>
       <w:r>
         <w:t xml:space="preserve"> </w:t>
@@ -33773,298 +34360,11 @@
         <w:t xml:space="preserve"> </w:t>
       </w:r>
       <w:r>
-        <w:t xml:space="preserve">with a comment and, if the service runs in Docker, to its</w:t>
-      </w:r>
-      <w:r>
-        <w:t xml:space="preserve"> </w:t>
-      </w:r>
-      <w:r>
-        <w:rPr>
-          <w:i/>
-          <w:iCs/>
-        </w:rPr>
-        <w:t xml:space="preserve">environment</w:t>
-      </w:r>
-      <w:r>
-        <w:t xml:space="preserve"> </w:t>
-      </w:r>
-      <w:r>
-        <w:t xml:space="preserve">block of</w:t>
-      </w:r>
-      <w:r>
-        <w:t xml:space="preserve"> </w:t>
-      </w:r>
-      <w:r>
-        <w:rPr>
-          <w:i/>
-          <w:iCs/>
-        </w:rPr>
-        <w:t xml:space="preserve">docker-compose.yml</w:t>
-      </w:r>
-      <w:r>
-        <w:t xml:space="preserve">. Those of October 21, 2026 (</w:t>
-      </w:r>
-      <w:r>
-        <w:rPr>
-          <w:i/>
-          <w:iCs/>
-        </w:rPr>
-        <w:t xml:space="preserve">SESSION_CHECK_*</w:t>
-      </w:r>
-      <w:r>
-        <w:t xml:space="preserve"> </w:t>
-      </w:r>
-      <w:r>
-        <w:t xml:space="preserve">in the gateway,</w:t>
-      </w:r>
-      <w:r>
-        <w:t xml:space="preserve"> </w:t>
-      </w:r>
-      <w:r>
-        <w:rPr>
-          <w:i/>
-          <w:iCs/>
-        </w:rPr>
-        <w:t xml:space="preserve">BOOKING_EXPIRY_*</w:t>
-      </w:r>
-      <w:r>
-        <w:t xml:space="preserve"> </w:t>
-      </w:r>
-      <w:r>
-        <w:t xml:space="preserve">in booking-service, with</w:t>
-      </w:r>
-      <w:r>
-        <w:t xml:space="preserve"> </w:t>
-      </w:r>
-      <w:r>
-        <w:rPr>
-          <w:i/>
-          <w:iCs/>
-        </w:rPr>
-        <w:t xml:space="preserve">BOOKING_EXPIRY_GRACE_MINUTES</w:t>
-      </w:r>
-      <w:r>
-        <w:t xml:space="preserve"> </w:t>
-      </w:r>
-      <w:r>
-        <w:t xml:space="preserve">shared with operations-service, and</w:t>
-      </w:r>
-      <w:r>
-        <w:t xml:space="preserve"> </w:t>
-      </w:r>
-      <w:r>
-        <w:rPr>
-          <w:i/>
-          <w:iCs/>
-        </w:rPr>
-        <w:t xml:space="preserve">FOLLOW_UP_ENABLED</w:t>
-      </w:r>
-      <w:r>
-        <w:t xml:space="preserve">,</w:t>
-      </w:r>
-      <w:r>
-        <w:t xml:space="preserve"> </w:t>
-      </w:r>
-      <w:r>
-        <w:rPr>
-          <w:i/>
-          <w:iCs/>
-        </w:rPr>
-        <w:t xml:space="preserve">FOLLOW_UP_INTERVAL</w:t>
-      </w:r>
-      <w:r>
-        <w:t xml:space="preserve">, and</w:t>
-      </w:r>
-      <w:r>
-        <w:t xml:space="preserve"> </w:t>
-      </w:r>
-      <w:r>
-        <w:rPr>
-          <w:i/>
-          <w:iCs/>
-        </w:rPr>
-        <w:t xml:space="preserve">FOLLOW_UP_LOOK_BACK_DAYS</w:t>
-      </w:r>
-      <w:r>
-        <w:t xml:space="preserve"> </w:t>
-      </w:r>
-      <w:r>
-        <w:t xml:space="preserve">in operations-service; nine in total) are already in those files (action ACO-14, closed). Those of October 23, 2026 (</w:t>
-      </w:r>
-      <w:r>
-        <w:rPr>
-          <w:i/>
-          <w:iCs/>
-        </w:rPr>
-        <w:t xml:space="preserve">ALLOWED_EMAIL_DOMAINS</w:t>
-      </w:r>
-      <w:r>
-        <w:t xml:space="preserve"> </w:t>
-      </w:r>
-      <w:r>
-        <w:t xml:space="preserve">and</w:t>
-      </w:r>
-      <w:r>
-        <w:t xml:space="preserve"> </w:t>
-      </w:r>
-      <w:r>
-        <w:rPr>
-          <w:i/>
-          <w:iCs/>
-        </w:rPr>
-        <w:t xml:space="preserve">DEMO_*_PASSWORD</w:t>
-      </w:r>
-      <w:r>
-        <w:t xml:space="preserve"> </w:t>
-      </w:r>
-      <w:r>
-        <w:t xml:space="preserve">in security-service) are too.</w:t>
-      </w:r>
-      <w:r>
-        <w:t xml:space="preserve"> </w:t>
-      </w:r>
-      <w:r>
-        <w:rPr>
-          <w:i/>
-          <w:iCs/>
-        </w:rPr>
-        <w:t xml:space="preserve">ADMIN_DOCUMENT</w:t>
-      </w:r>
-      <w:r>
-        <w:t xml:space="preserve"> </w:t>
-      </w:r>
-      <w:r>
-        <w:t xml:space="preserve">and</w:t>
-      </w:r>
-      <w:r>
-        <w:t xml:space="preserve"> </w:t>
-      </w:r>
-      <w:r>
-        <w:rPr>
-          <w:i/>
-          <w:iCs/>
-        </w:rPr>
-        <w:t xml:space="preserve">ADMIN_PHONE</w:t>
-      </w:r>
-      <w:r>
-        <w:t xml:space="preserve"> </w:t>
-      </w:r>
-      <w:r>
-        <w:t xml:space="preserve">complete the data of the first administrator in production. Those of October 26, 2026 (booking-service's</w:t>
-      </w:r>
-      <w:r>
-        <w:t xml:space="preserve"> </w:t>
-      </w:r>
-      <w:r>
-        <w:rPr>
-          <w:i/>
-          <w:iCs/>
-        </w:rPr>
-        <w:t xml:space="preserve">BOOKING_CASH_ACTIVE_LIMIT</w:t>
-      </w:r>
-      <w:r>
-        <w:t xml:space="preserve">,</w:t>
-      </w:r>
-      <w:r>
-        <w:t xml:space="preserve"> </w:t>
-      </w:r>
-      <w:r>
-        <w:rPr>
-          <w:i/>
-          <w:iCs/>
-        </w:rPr>
-        <w:t xml:space="preserve">BOOKING_PAYMENT_WINDOW</w:t>
-      </w:r>
-      <w:r>
-        <w:t xml:space="preserve">,</w:t>
-      </w:r>
-      <w:r>
-        <w:t xml:space="preserve"> </w:t>
-      </w:r>
-      <w:r>
-        <w:rPr>
-          <w:i/>
-          <w:iCs/>
-        </w:rPr>
-        <w:t xml:space="preserve">BOOKING_PAYMENT_EXPIRY_ENABLED</w:t>
-      </w:r>
-      <w:r>
-        <w:t xml:space="preserve">,</w:t>
-      </w:r>
-      <w:r>
-        <w:t xml:space="preserve"> </w:t>
-      </w:r>
-      <w:r>
-        <w:rPr>
-          <w:i/>
-          <w:iCs/>
-        </w:rPr>
-        <w:t xml:space="preserve">BOOKING_PAYMENT_EXPIRY_INTERVAL</w:t>
-      </w:r>
-      <w:r>
-        <w:t xml:space="preserve">, and</w:t>
-      </w:r>
-      <w:r>
-        <w:t xml:space="preserve"> </w:t>
-      </w:r>
-      <w:r>
-        <w:rPr>
-          <w:i/>
-          <w:iCs/>
-        </w:rPr>
-        <w:t xml:space="preserve">PAYMENT_SERVICE_URL</w:t>
-      </w:r>
-      <w:r>
-        <w:t xml:space="preserve">, and</w:t>
-      </w:r>
-      <w:r>
-        <w:t xml:space="preserve"> </w:t>
-      </w:r>
-      <w:r>
-        <w:rPr>
-          <w:i/>
-          <w:iCs/>
-        </w:rPr>
-        <w:t xml:space="preserve">INTERNAL_API_KEY</w:t>
-      </w:r>
-      <w:r>
-        <w:t xml:space="preserve">, which payment-service now also needs and</w:t>
-      </w:r>
-      <w:r>
-        <w:t xml:space="preserve"> </w:t>
-      </w:r>
-      <w:r>
-        <w:rPr>
-          <w:i/>
-          <w:iCs/>
-        </w:rPr>
-        <w:t xml:space="preserve">docker-compose.prod.yml</w:t>
-      </w:r>
-      <w:r>
-        <w:t xml:space="preserve"> </w:t>
-      </w:r>
-      <w:r>
-        <w:t xml:space="preserve">requires) are in</w:t>
-      </w:r>
-      <w:r>
-        <w:t xml:space="preserve"> </w:t>
-      </w:r>
-      <w:r>
-        <w:rPr>
-          <w:i/>
-          <w:iCs/>
-        </w:rPr>
-        <w:t xml:space="preserve">.env.example</w:t>
-      </w:r>
-      <w:r>
-        <w:t xml:space="preserve"> </w:t>
-      </w:r>
-      <w:r>
         <w:t xml:space="preserve">and in the compose file.</w:t>
       </w:r>
     </w:p>
-    <w:bookmarkEnd w:id="91"/>
-    <w:bookmarkStart w:id="92" w:name="X4d28d136be4eff39b0f95c3c5b57d790f4172ee"/>
+    <w:bookmarkEnd w:id="85"/>
+    <w:bookmarkStart w:id="86" w:name="X4d28d136be4eff39b0f95c3c5b57d790f4172ee"/>
     <w:p>
       <w:pPr>
         <w:pStyle w:val="Heading3"/>
@@ -34174,8 +34474,8 @@
         <w:t xml:space="preserve">).</w:t>
       </w:r>
     </w:p>
-    <w:bookmarkEnd w:id="92"/>
-    <w:bookmarkStart w:id="93" w:name="X35a32b435cbd4710b129fbb8640370bd1da4a87"/>
+    <w:bookmarkEnd w:id="86"/>
+    <w:bookmarkStart w:id="87" w:name="X35a32b435cbd4710b129fbb8640370bd1da4a87"/>
     <w:p>
       <w:pPr>
         <w:pStyle w:val="Heading3"/>
@@ -34289,8 +34589,8 @@
         <w:t xml:space="preserve">Back up the database before deploying a service that adds changesets.</w:t>
       </w:r>
     </w:p>
-    <w:bookmarkEnd w:id="93"/>
-    <w:bookmarkStart w:id="94" w:name="X79cb273c70e6fed913906de790a0f327ff26dce"/>
+    <w:bookmarkEnd w:id="87"/>
+    <w:bookmarkStart w:id="88" w:name="X79cb273c70e6fed913906de790a0f327ff26dce"/>
     <w:p>
       <w:pPr>
         <w:pStyle w:val="Heading3"/>
@@ -34304,7 +34604,36 @@
         <w:pStyle w:val="FirstParagraph"/>
       </w:pPr>
       <w:r>
-        <w:t xml:space="preserve">The testing strategy proposes a pyramid of unit, integration, contract, and end-to-end tests, with at least 80% line coverage and 90% in the domain. As of October 24, 2026, the latest</w:t>
+        <w:t xml:space="preserve">The testing strategy proposes a pyramid of unit, integration, contract, and end-to-end tests, with at least 80% line coverage and 90% in the domain. As of October 27, 2026, the</w:t>
+      </w:r>
+      <w:r>
+        <w:t xml:space="preserve"> </w:t>
+      </w:r>
+      <w:r>
+        <w:rPr>
+          <w:i/>
+          <w:iCs/>
+        </w:rPr>
+        <w:t xml:space="preserve">main</w:t>
+      </w:r>
+      <w:r>
+        <w:t xml:space="preserve"> </w:t>
+      </w:r>
+      <w:r>
+        <w:t xml:space="preserve">CI of each repository passed 1,337 tests: web 242 in 68 files, gateway 62, security-service 200, customer-service 83, booking-service 137, operations-service 110, notification-service 133, payment-service 264 (142 domain, 61 application, 44 API, and 17 integration tests, which the "Pruebas de integración" job runs against SQL Server 2022 with the Liquibase migrations, without skipping any; on a machine without a database 12 are skipped), and the mobile app 106 with</w:t>
+      </w:r>
+      <w:r>
+        <w:t xml:space="preserve"> </w:t>
+      </w:r>
+      <w:r>
+        <w:rPr>
+          <w:i/>
+          <w:iCs/>
+        </w:rPr>
+        <w:t xml:space="preserve">jest-expo</w:t>
+      </w:r>
+      <w:r>
+        <w:t xml:space="preserve">; the 19 end-to-end tests passed 19 of 19 locally that day. As of October 24, 2026, the latest</w:t>
       </w:r>
       <w:r>
         <w:t xml:space="preserve"> </w:t>
@@ -34320,7 +34649,7 @@
         <w:t xml:space="preserve"> </w:t>
       </w:r>
       <w:r>
-        <w:t xml:space="preserve">CI of each repository passed 1,119 tests: web 212 in 66 files, gateway 62, security-service 200, customer-service 82, booking-service 95, operations-service 110, notification-service 133, and payment-service 225 (134 domain, 52 application, 34 API, and 5 infrastructure; the 11 persistence tests used to be skipped in the CI because they need the isolated</w:t>
+        <w:t xml:space="preserve">CI of each repository had passed 1,119 tests: web 212 in 66 files, gateway 62, security-service 200, customer-service 82, booking-service 95, operations-service 110, notification-service 133, and payment-service 225 (134 domain, 52 application, 34 API, and 5 infrastructure; the 11 persistence tests used to be skipped in the CI because they need the isolated</w:t>
       </w:r>
       <w:r>
         <w:t xml:space="preserve"> </w:t>
@@ -34540,8 +34869,8 @@
         <w:t xml:space="preserve">, two simultaneous point movements of the same customer, and the duplicate delivery of the same event.</w:t>
       </w:r>
     </w:p>
-    <w:bookmarkEnd w:id="94"/>
-    <w:bookmarkStart w:id="95" w:name="X80199210402d6281ed27dacb39b2ad5160c1c5c"/>
+    <w:bookmarkEnd w:id="88"/>
+    <w:bookmarkStart w:id="89" w:name="X80199210402d6281ed27dacb39b2ad5160c1c5c"/>
     <w:p>
       <w:pPr>
         <w:pStyle w:val="Heading3"/>
@@ -34728,7 +35057,30 @@
               <w:pStyle w:val="Compact"/>
             </w:pPr>
             <w:r>
-              <w:t xml:space="preserve">One hour passed after its end and it was scheduled without confirmation (</w:t>
+              <w:t xml:space="preserve">One hour passed after its end and it was confirmed without an operator (</w:t>
+            </w:r>
+            <w:r>
+              <w:rPr>
+                <w:i/>
+                <w:iCs/>
+              </w:rPr>
+              <w:t xml:space="preserve">FollowUpJob</w:t>
+            </w:r>
+            <w:r>
+              <w:t xml:space="preserve">), or it had digital payment and reached its deadline without a receipt (</w:t>
+            </w:r>
+            <w:r>
+              <w:rPr>
+                <w:i/>
+                <w:iCs/>
+              </w:rPr>
+              <w:t xml:space="preserve">PaymentDeadlineJob</w:t>
+            </w:r>
+            <w:r>
+              <w:t xml:space="preserve">).</w:t>
+            </w:r>
+            <w:r>
+              <w:t xml:space="preserve"> </w:t>
             </w:r>
             <w:r>
               <w:rPr>
@@ -34738,35 +35090,28 @@
               <w:t xml:space="preserve">ExpiredBookingsJob</w:t>
             </w:r>
             <w:r>
-              <w:t xml:space="preserve">) or confirmed without an operator (</w:t>
+              <w:t xml:space="preserve"> </w:t>
+            </w:r>
+            <w:r>
+              <w:t xml:space="preserve">no longer exists (B-07).</w:t>
+            </w:r>
+          </w:p>
+        </w:tc>
+        <w:tc>
+          <w:tcPr/>
+          <w:p>
+            <w:pPr>
+              <w:pStyle w:val="Compact"/>
+            </w:pPr>
+            <w:r>
+              <w:t xml:space="preserve">Status and reason of the booking (PAYMENT_TIMEOUT on those cancelled for lack of payment); booking-service log (</w:t>
             </w:r>
             <w:r>
               <w:rPr>
                 <w:i/>
                 <w:iCs/>
               </w:rPr>
-              <w:t xml:space="preserve">FollowUpJob</w:t>
-            </w:r>
-            <w:r>
-              <w:t xml:space="preserve">).</w:t>
-            </w:r>
-          </w:p>
-        </w:tc>
-        <w:tc>
-          <w:tcPr/>
-          <w:p>
-            <w:pPr>
-              <w:pStyle w:val="Compact"/>
-            </w:pPr>
-            <w:r>
-              <w:t xml:space="preserve">Status and reason of the booking (EXPIRED on the cancelled ones); booking-service log (</w:t>
-            </w:r>
-            <w:r>
-              <w:rPr>
-                <w:i/>
-                <w:iCs/>
-              </w:rPr>
-              <w:t xml:space="preserve">Closed N expired bookings</w:t>
+              <w:t xml:space="preserve">Cancelled N booking(s) for payment timeout</w:t>
             </w:r>
             <w:r>
               <w:t xml:space="preserve">) and operations-service log (</w:t>
@@ -35119,8 +35464,8 @@
         <w:t xml:space="preserve">Prepared by the authors from the runbooks of the services.</w:t>
       </w:r>
     </w:p>
-    <w:bookmarkEnd w:id="95"/>
-    <w:bookmarkStart w:id="96" w:name="X02e4ed5b49c90ac920b2faf415d9c0e76b062bb"/>
+    <w:bookmarkEnd w:id="89"/>
+    <w:bookmarkStart w:id="90" w:name="X02e4ed5b49c90ac920b2faf415d9c0e76b062bb"/>
     <w:p>
       <w:pPr>
         <w:pStyle w:val="Heading3"/>
@@ -35447,8 +35792,8 @@
         <w:t xml:space="preserve">of the documentation (Vehicle Washing Development Team, 2026a), reviewed against the code on October 16, 2026. Between October 8 and 16, 2026, TD-001, TD-002, TD-003, TD-009, TD-013, TD-014, TD-015, TD-016, TD-017, TD-018, TD-020, and TD-021 were resolved; their closure is recorded in the corrective, preventive, and improvement actions document. TD-006 was also closed on October 19, 2026, with continuous integration in GitHub Actions. On October 21, 2026, TD-024 (tokens of closed sessions), TD-025 (bookings nobody closed and the count of bookings without an operator), and TD-026 (an operator assigned twice) were closed; on the night of the same day the rule of TD-025 was adjusted so that a booking with an operator does not end as No-show unless the administrator decides it; and TD-027 (tests of the administrator screens) was resolved for bookings, management, and reports.</w:t>
       </w:r>
     </w:p>
-    <w:bookmarkEnd w:id="96"/>
-    <w:bookmarkStart w:id="97" w:name="Xf4b8d5f338441786a3f26a5e6940ccb149eb8d7"/>
+    <w:bookmarkEnd w:id="90"/>
+    <w:bookmarkStart w:id="91" w:name="Xf4b8d5f338441786a3f26a5e6940ccb149eb8d7"/>
     <w:p>
       <w:pPr>
         <w:pStyle w:val="Heading3"/>
@@ -35478,9 +35823,9 @@
         <w:t xml:space="preserve">), Outbox, one database login per service (or one database per service), audit triggers, real enforcement of the permission matrix, mTLS between services, observability (metrics and tracing), image storage outside the database, and a payment gateway. Each change requires an ADR.</w:t>
       </w:r>
     </w:p>
-    <w:bookmarkEnd w:id="97"/>
-    <w:bookmarkEnd w:id="98"/>
-    <w:bookmarkStart w:id="99" w:name="Xcb2c5206267be671a73ab6047a9b2598eced39d"/>
+    <w:bookmarkEnd w:id="91"/>
+    <w:bookmarkEnd w:id="92"/>
+    <w:bookmarkStart w:id="93" w:name="Xcb2c5206267be671a73ab6047a9b2598eced39d"/>
     <w:p>
       <w:pPr>
         <w:pStyle w:val="Heading2"/>
@@ -35993,8 +36338,8 @@
         <w:t xml:space="preserve">Prepared by the authors from the glossary of the project and the references cited.</w:t>
       </w:r>
     </w:p>
-    <w:bookmarkEnd w:id="99"/>
-    <w:bookmarkStart w:id="112" w:name="references"/>
+    <w:bookmarkEnd w:id="93"/>
+    <w:bookmarkStart w:id="106" w:name="references"/>
     <w:p>
       <w:pPr>
         <w:pStyle w:val="Heading2"/>
@@ -36026,7 +36371,7 @@
       <w:r>
         <w:t xml:space="preserve"> </w:t>
       </w:r>
-      <w:hyperlink r:id="rId100">
+      <w:hyperlink r:id="rId94">
         <w:r>
           <w:rPr>
             <w:rStyle w:val="Hyperlink"/>
@@ -36061,7 +36406,7 @@
       <w:r>
         <w:t xml:space="preserve"> </w:t>
       </w:r>
-      <w:hyperlink r:id="rId101">
+      <w:hyperlink r:id="rId95">
         <w:r>
           <w:rPr>
             <w:rStyle w:val="Hyperlink"/>
@@ -36117,7 +36462,7 @@
       <w:r>
         <w:t xml:space="preserve"> </w:t>
       </w:r>
-      <w:hyperlink r:id="rId102">
+      <w:hyperlink r:id="rId96">
         <w:r>
           <w:rPr>
             <w:rStyle w:val="Hyperlink"/>
@@ -36173,7 +36518,7 @@
       <w:r>
         <w:t xml:space="preserve"> </w:t>
       </w:r>
-      <w:hyperlink r:id="rId103">
+      <w:hyperlink r:id="rId97">
         <w:r>
           <w:rPr>
             <w:rStyle w:val="Hyperlink"/>
@@ -36232,7 +36577,7 @@
       <w:r>
         <w:t xml:space="preserve"> </w:t>
       </w:r>
-      <w:hyperlink r:id="rId104">
+      <w:hyperlink r:id="rId98">
         <w:r>
           <w:rPr>
             <w:rStyle w:val="Hyperlink"/>
@@ -36264,7 +36609,7 @@
       <w:r>
         <w:t xml:space="preserve"> </w:t>
       </w:r>
-      <w:hyperlink r:id="rId105">
+      <w:hyperlink r:id="rId99">
         <w:r>
           <w:rPr>
             <w:rStyle w:val="Hyperlink"/>
@@ -36347,7 +36692,7 @@
       <w:r>
         <w:t xml:space="preserve"> </w:t>
       </w:r>
-      <w:hyperlink r:id="rId106">
+      <w:hyperlink r:id="rId100">
         <w:r>
           <w:rPr>
             <w:rStyle w:val="Hyperlink"/>
@@ -36382,7 +36727,7 @@
       <w:r>
         <w:t xml:space="preserve"> </w:t>
       </w:r>
-      <w:hyperlink r:id="rId107">
+      <w:hyperlink r:id="rId101">
         <w:r>
           <w:rPr>
             <w:rStyle w:val="Hyperlink"/>
@@ -36417,7 +36762,7 @@
       <w:r>
         <w:t xml:space="preserve"> </w:t>
       </w:r>
-      <w:hyperlink r:id="rId108">
+      <w:hyperlink r:id="rId102">
         <w:r>
           <w:rPr>
             <w:rStyle w:val="Hyperlink"/>
@@ -36452,7 +36797,7 @@
       <w:r>
         <w:t xml:space="preserve"> </w:t>
       </w:r>
-      <w:hyperlink r:id="rId109">
+      <w:hyperlink r:id="rId103">
         <w:r>
           <w:rPr>
             <w:rStyle w:val="Hyperlink"/>
@@ -36487,7 +36832,7 @@
       <w:r>
         <w:t xml:space="preserve"> </w:t>
       </w:r>
-      <w:hyperlink r:id="rId110">
+      <w:hyperlink r:id="rId104">
         <w:r>
           <w:rPr>
             <w:rStyle w:val="Hyperlink"/>
@@ -36522,7 +36867,7 @@
       <w:r>
         <w:t xml:space="preserve"> </w:t>
       </w:r>
-      <w:hyperlink r:id="rId111">
+      <w:hyperlink r:id="rId105">
         <w:r>
           <w:rPr>
             <w:rStyle w:val="Hyperlink"/>
@@ -36531,8 +36876,8 @@
         </w:r>
       </w:hyperlink>
     </w:p>
-    <w:bookmarkEnd w:id="112"/>
-    <w:bookmarkStart w:id="116" w:name="X0dfec30307d35ad53dd5c24971901dbae401842"/>
+    <w:bookmarkEnd w:id="106"/>
+    <w:bookmarkStart w:id="110" w:name="X0dfec30307d35ad53dd5c24971901dbae401842"/>
     <w:p>
       <w:pPr>
         <w:pStyle w:val="Heading2"/>
@@ -36541,7 +36886,7 @@
         <w:t xml:space="preserve">18. Annexes</w:t>
       </w:r>
     </w:p>
-    <w:bookmarkStart w:id="113" w:name="annex-a-source-of-the-figures"/>
+    <w:bookmarkStart w:id="107" w:name="annex-a-source-of-the-figures"/>
     <w:p>
       <w:pPr>
         <w:pStyle w:val="Heading3"/>
@@ -36555,11 +36900,27 @@
         <w:pStyle w:val="FirstParagraph"/>
       </w:pPr>
       <w:r>
-        <w:t xml:space="preserve">Figures 1 and 3 are diagrams prepared from the code. Figure 2 was generated on October 16, 2026, from the real database, with all the services started, so it shows the 57 tables as they exist. No figure contains secrets or personal data.</w:t>
-      </w:r>
-    </w:p>
-    <w:bookmarkEnd w:id="113"/>
-    <w:bookmarkStart w:id="114" w:name="annex-b-discrepancies-detected"/>
+        <w:t xml:space="preserve">Figures 1 and 3 are diagrams prepared from the code. Figure 2 was generated on October 16, 2026, from the real database, with all the services started, so it shows the 57 tables that existed that day; later</w:t>
+      </w:r>
+      <w:r>
+        <w:t xml:space="preserve"> </w:t>
+      </w:r>
+      <w:r>
+        <w:rPr>
+          <w:i/>
+          <w:iCs/>
+        </w:rPr>
+        <w:t xml:space="preserve">notification.pending_delivery</w:t>
+      </w:r>
+      <w:r>
+        <w:t xml:space="preserve"> </w:t>
+      </w:r>
+      <w:r>
+        <w:t xml:space="preserve">(migration 047) was added, and today there are 58. No figure contains secrets or personal data.</w:t>
+      </w:r>
+    </w:p>
+    <w:bookmarkEnd w:id="107"/>
+    <w:bookmarkStart w:id="108" w:name="annex-b-discrepancies-detected"/>
     <w:p>
       <w:pPr>
         <w:pStyle w:val="Heading3"/>
@@ -37039,7 +37400,17 @@
               <w:pStyle w:val="Compact"/>
             </w:pPr>
             <w:r>
-              <w:t xml:space="preserve">57 tables on 2026-10-16, checked in the database (the tables for account lockout, person address, operator profile and skills, and the four inspection tables were added).</w:t>
+              <w:t xml:space="preserve">57 tables on 2026-10-16, checked in the database (the tables for account lockout, person address, operator profile and skills, and the four inspection tables were added); 58 since notification migration 047 (</w:t>
+            </w:r>
+            <w:r>
+              <w:rPr>
+                <w:i/>
+                <w:iCs/>
+              </w:rPr>
+              <w:t xml:space="preserve">pending_delivery</w:t>
+            </w:r>
+            <w:r>
+              <w:t xml:space="preserve">), counted in the real database on 2026-10-27.</w:t>
             </w:r>
           </w:p>
         </w:tc>
@@ -37458,8 +37829,8 @@
         <w:t xml:space="preserve">Prepared by the authors from the cross-analysis of the code and the documentation.</w:t>
       </w:r>
     </w:p>
-    <w:bookmarkEnd w:id="114"/>
-    <w:bookmarkStart w:id="115" w:name="annex-c-delivery-checklist"/>
+    <w:bookmarkEnd w:id="108"/>
+    <w:bookmarkStart w:id="109" w:name="annex-c-delivery-checklist"/>
     <w:p>
       <w:pPr>
         <w:pStyle w:val="Heading3"/>
@@ -37788,9 +38159,9 @@
         <w:t xml:space="preserve">Adapted from the checklist of the guide for writing software manuals (SENA, 2026).</w:t>
       </w:r>
     </w:p>
-    <w:bookmarkEnd w:id="115"/>
-    <w:bookmarkEnd w:id="116"/>
-    <w:bookmarkEnd w:id="117"/>
+    <w:bookmarkEnd w:id="109"/>
+    <w:bookmarkEnd w:id="110"/>
+    <w:bookmarkEnd w:id="111"/>
     <w:sectPr>
       <w:footnotePr>
         <w:numRestart w:val="eachSect"/>

</xml_diff>